<commit_message>
update work completion doc
</commit_message>
<xml_diff>
--- a/backend/templates/MamtaEnterprises_Docs.docx
+++ b/backend/templates/MamtaEnterprises_Docs.docx
@@ -1,8 +1,8 @@
 
 <file path=word/document.xml><?xml version="1.0" encoding="utf-8"?>
-<w:document xmlns:ve="http://schemas.openxmlformats.org/markup-compatibility/2006" xmlns:o="urn:schemas-microsoft-com:office:office" xmlns:r="http://schemas.openxmlformats.org/officeDocument/2006/relationships" xmlns:m="http://schemas.openxmlformats.org/officeDocument/2006/math" xmlns:v="urn:schemas-microsoft-com:vml" xmlns:wp="http://schemas.openxmlformats.org/drawingml/2006/wordprocessingDrawing" xmlns:w10="urn:schemas-microsoft-com:office:word" xmlns:w="http://schemas.openxmlformats.org/wordprocessingml/2006/main" xmlns:wne="http://schemas.microsoft.com/office/word/2006/wordml">
+<w:document xmlns:w14="http://schemas.microsoft.com/office/word/2010/wordml" xmlns:wp14="http://schemas.microsoft.com/office/word/2010/wordprocessingDrawing" xmlns:ve="http://schemas.openxmlformats.org/markup-compatibility/2006" xmlns:o="urn:schemas-microsoft-com:office:office" xmlns:r="http://schemas.openxmlformats.org/officeDocument/2006/relationships" xmlns:m="http://schemas.openxmlformats.org/officeDocument/2006/math" xmlns:v="urn:schemas-microsoft-com:vml" xmlns:wp="http://schemas.openxmlformats.org/drawingml/2006/wordprocessingDrawing" xmlns:w10="urn:schemas-microsoft-com:office:word" xmlns:w="http://schemas.openxmlformats.org/wordprocessingml/2006/main" xmlns:wne="http://schemas.microsoft.com/office/word/2006/wordml" xmlns:mc="http://schemas.openxmlformats.org/markup-compatibility/2006" mc:Ignorable="w14 wp14">
   <w:body>
-    <w:p>
+    <w:p xmlns:wp14="http://schemas.microsoft.com/office/word/2010/wordml" wp14:textId="77777777">
       <w:pPr>
         <w:jc w:val="center"/>
         <w:rPr>
@@ -13,7 +13,7 @@
         </w:rPr>
       </w:pPr>
     </w:p>
-    <w:p>
+    <w:p xmlns:wp14="http://schemas.microsoft.com/office/word/2010/wordml" wp14:textId="77777777">
       <w:pPr>
         <w:jc w:val="center"/>
         <w:rPr>
@@ -24,7 +24,7 @@
         </w:rPr>
       </w:pPr>
     </w:p>
-    <w:p>
+    <w:p xmlns:wp14="http://schemas.microsoft.com/office/word/2010/wordml" wp14:textId="77777777">
       <w:pPr>
         <w:jc w:val="center"/>
         <w:rPr>
@@ -35,7 +35,7 @@
         </w:rPr>
       </w:pPr>
     </w:p>
-    <w:p>
+    <w:p xmlns:wp14="http://schemas.microsoft.com/office/word/2010/wordml" wp14:textId="77777777">
       <w:pPr>
         <w:jc w:val="center"/>
         <w:rPr>
@@ -46,997 +46,1015 @@
         </w:rPr>
       </w:pPr>
     </w:p>
-    <w:p>
+    <w:p xmlns:wp14="http://schemas.microsoft.com/office/word/2010/wordml" wp14:textId="2DF4750F">
       <w:pPr>
         <w:jc w:val="center"/>
+        <w:rPr>
+          <w:b w:val="1"/>
+          <w:bCs w:val="1"/>
+          <w:sz w:val="28"/>
+          <w:szCs w:val="28"/>
+          <w:u w:val="single"/>
+        </w:rPr>
+      </w:pPr>
+      <w:r>
+        <w:rPr>
+          <w:b w:val="1"/>
+          <w:bCs w:val="1"/>
+          <w:sz w:val="28"/>
+          <w:szCs w:val="28"/>
+          <w:u w:val="single"/>
+        </w:rPr>
+        <w:t>Safety</w:t>
+      </w:r>
+      <w:r>
+        <w:rPr>
+          <w:b w:val="1"/>
+          <w:bCs w:val="1"/>
+          <w:sz w:val="28"/>
+          <w:szCs w:val="28"/>
+          <w:u w:val="single"/>
+        </w:rPr>
+        <w:t xml:space="preserve"> / Work Completion</w:t>
+      </w:r>
+      <w:r>
+        <w:rPr>
+          <w:b w:val="1"/>
+          <w:bCs w:val="1"/>
+          <w:sz w:val="28"/>
+          <w:szCs w:val="28"/>
+          <w:u w:val="single"/>
+        </w:rPr>
+        <w:t xml:space="preserve"> Certificate</w:t>
+      </w:r>
+    </w:p>
+    <w:p xmlns:wp14="http://schemas.microsoft.com/office/word/2010/wordml" wp14:textId="77777777">
+      <w:pPr>
+        <w:ind w:left="1440" w:right="1440"/>
+        <w:rPr>
+          <w:rFonts w:ascii="Arial" w:hAnsi="Arial" w:cs="Arial"/>
+        </w:rPr>
+      </w:pPr>
+      <w:r>
+        <w:rPr>
+          <w:rFonts w:ascii="Arial" w:hAnsi="Arial" w:cs="Arial"/>
+        </w:rPr>
+        <w:t>It is c</w:t>
+      </w:r>
+      <w:r>
+        <w:rPr>
+          <w:rFonts w:ascii="Arial" w:hAnsi="Arial" w:cs="Arial"/>
+        </w:rPr>
+        <w:t xml:space="preserve">ertified that </w:t>
+      </w:r>
+      <w:r>
+        <w:rPr>
+          <w:rFonts w:ascii="Arial" w:hAnsi="Arial" w:cs="Arial"/>
+        </w:rPr>
+        <w:t>t</w:t>
+      </w:r>
+      <w:r>
+        <w:rPr>
+          <w:rFonts w:ascii="Arial" w:hAnsi="Arial" w:cs="Arial"/>
+        </w:rPr>
+        <w:t>he Solar Power Plant of capacity</w:t>
+      </w:r>
+      <w:r>
+        <w:rPr>
+          <w:rFonts w:ascii="Arial" w:hAnsi="Arial" w:cs="Arial"/>
+        </w:rPr>
+        <w:t xml:space="preserve"> {</w:t>
+      </w:r>
+      <w:proofErr w:type="spellStart"/>
+      <w:r>
+        <w:rPr>
+          <w:rFonts w:ascii="Arial" w:hAnsi="Arial" w:cs="Arial"/>
+        </w:rPr>
+        <w:t>net_solar_capacity</w:t>
+      </w:r>
+      <w:proofErr w:type="spellEnd"/>
+      <w:r>
+        <w:rPr>
+          <w:rFonts w:ascii="Arial" w:hAnsi="Arial" w:cs="Arial"/>
+        </w:rPr>
+        <w:t>}</w:t>
+      </w:r>
+      <w:r>
+        <w:rPr>
+          <w:rFonts w:ascii="Arial" w:hAnsi="Arial" w:cs="Arial"/>
+        </w:rPr>
+        <w:t xml:space="preserve"> </w:t>
+      </w:r>
+      <w:r>
+        <w:rPr>
+          <w:rFonts w:ascii="Arial" w:hAnsi="Arial" w:cs="Arial"/>
+        </w:rPr>
+        <w:t>K</w:t>
+      </w:r>
+      <w:r>
+        <w:rPr>
+          <w:rFonts w:ascii="Arial" w:hAnsi="Arial" w:cs="Arial"/>
+        </w:rPr>
+        <w:t>W</w:t>
+      </w:r>
+      <w:r>
+        <w:rPr>
+          <w:rFonts w:ascii="Arial" w:hAnsi="Arial" w:cs="Arial"/>
+        </w:rPr>
+        <w:t xml:space="preserve"> </w:t>
+      </w:r>
+      <w:r>
+        <w:rPr>
+          <w:rFonts w:ascii="Arial" w:hAnsi="Arial" w:cs="Arial"/>
+        </w:rPr>
+        <w:t xml:space="preserve">installed by </w:t>
+      </w:r>
+      <w:proofErr w:type="spellStart"/>
+      <w:r>
+        <w:rPr>
+          <w:rFonts w:ascii="Arial" w:hAnsi="Arial" w:cs="Arial"/>
+        </w:rPr>
+        <w:t>Mamta</w:t>
+      </w:r>
+      <w:proofErr w:type="spellEnd"/>
+      <w:r>
+        <w:rPr>
+          <w:rFonts w:ascii="Arial" w:hAnsi="Arial" w:cs="Arial"/>
+        </w:rPr>
+        <w:t xml:space="preserve"> Enterprises</w:t>
+      </w:r>
+      <w:r>
+        <w:rPr>
+          <w:rFonts w:ascii="Arial" w:hAnsi="Arial" w:cs="Arial"/>
+        </w:rPr>
+        <w:t xml:space="preserve"> at</w:t>
+      </w:r>
+      <w:r>
+        <w:rPr>
+          <w:rFonts w:ascii="Arial" w:hAnsi="Arial" w:cs="Arial"/>
+        </w:rPr>
+        <w:t xml:space="preserve"> </w:t>
+      </w:r>
+      <w:r>
+        <w:rPr>
+          <w:rFonts w:ascii="Arial" w:hAnsi="Arial" w:cs="Arial"/>
+        </w:rPr>
+        <w:t>{</w:t>
+      </w:r>
+      <w:proofErr w:type="spellStart"/>
+      <w:r>
+        <w:rPr>
+          <w:rFonts w:ascii="Arial" w:hAnsi="Arial" w:cs="Arial"/>
+        </w:rPr>
+        <w:t>consumer_name</w:t>
+      </w:r>
+      <w:proofErr w:type="spellEnd"/>
+      <w:r>
+        <w:rPr>
+          <w:rFonts w:ascii="Arial" w:hAnsi="Arial" w:cs="Arial"/>
+        </w:rPr>
+        <w:t>}</w:t>
+      </w:r>
+      <w:r>
+        <w:rPr>
+          <w:rFonts w:ascii="Arial" w:hAnsi="Arial" w:cs="Arial"/>
+        </w:rPr>
+        <w:t>,</w:t>
+      </w:r>
+      <w:r>
+        <w:rPr>
+          <w:rFonts w:ascii="Arial" w:hAnsi="Arial" w:cs="Arial"/>
+        </w:rPr>
+        <w:t xml:space="preserve"> {</w:t>
+      </w:r>
+      <w:proofErr w:type="spellStart"/>
+      <w:r>
+        <w:rPr>
+          <w:rFonts w:ascii="Arial" w:hAnsi="Arial" w:cs="Arial"/>
+        </w:rPr>
+        <w:t>consumer_address</w:t>
+      </w:r>
+      <w:proofErr w:type="spellEnd"/>
+      <w:r>
+        <w:rPr>
+          <w:rFonts w:ascii="Arial" w:hAnsi="Arial" w:cs="Arial"/>
+        </w:rPr>
+        <w:t>}</w:t>
+      </w:r>
+      <w:r>
+        <w:rPr>
+          <w:rFonts w:ascii="Arial" w:hAnsi="Arial" w:cs="Arial"/>
+        </w:rPr>
+        <w:t>,</w:t>
+      </w:r>
+      <w:r>
+        <w:rPr>
+          <w:rFonts w:ascii="Arial" w:hAnsi="Arial" w:cs="Arial"/>
+        </w:rPr>
+        <w:t xml:space="preserve"> Invoice No.</w:t>
+      </w:r>
+      <w:r>
+        <w:rPr>
+          <w:rFonts w:ascii="Arial" w:hAnsi="Arial" w:cs="Arial"/>
+        </w:rPr>
+        <w:t xml:space="preserve"> </w:t>
+      </w:r>
+      <w:r>
+        <w:rPr>
+          <w:rFonts w:ascii="Arial" w:hAnsi="Arial" w:cs="Arial"/>
+        </w:rPr>
+        <w:t>{</w:t>
+      </w:r>
+      <w:proofErr w:type="spellStart"/>
+      <w:r>
+        <w:rPr>
+          <w:rFonts w:ascii="Arial" w:hAnsi="Arial" w:cs="Arial"/>
+        </w:rPr>
+        <w:t>invoice_number</w:t>
+      </w:r>
+      <w:proofErr w:type="spellEnd"/>
+      <w:r>
+        <w:rPr>
+          <w:rFonts w:ascii="Arial" w:hAnsi="Arial" w:cs="Arial"/>
+        </w:rPr>
+        <w:t>}</w:t>
+      </w:r>
+      <w:r>
+        <w:rPr>
+          <w:rFonts w:ascii="Arial" w:hAnsi="Arial" w:cs="Arial"/>
+        </w:rPr>
+        <w:t xml:space="preserve">, Dated: </w:t>
+      </w:r>
+      <w:r>
+        <w:rPr>
+          <w:rFonts w:ascii="Arial" w:hAnsi="Arial" w:cs="Arial"/>
+        </w:rPr>
+        <w:t>{</w:t>
+      </w:r>
+      <w:proofErr w:type="spellStart"/>
+      <w:r>
+        <w:rPr>
+          <w:rFonts w:ascii="Arial" w:hAnsi="Arial" w:cs="Arial"/>
+        </w:rPr>
+        <w:t>invoice_date</w:t>
+      </w:r>
+      <w:proofErr w:type="spellEnd"/>
+      <w:r>
+        <w:rPr>
+          <w:rFonts w:ascii="Arial" w:hAnsi="Arial" w:cs="Arial"/>
+        </w:rPr>
+        <w:t>}</w:t>
+      </w:r>
+      <w:r>
+        <w:rPr>
+          <w:rFonts w:ascii="Arial" w:hAnsi="Arial" w:cs="Arial"/>
+        </w:rPr>
+        <w:t xml:space="preserve">, </w:t>
+      </w:r>
+      <w:r>
+        <w:rPr>
+          <w:rFonts w:ascii="Arial" w:hAnsi="Arial" w:cs="Arial"/>
+        </w:rPr>
+        <w:t>in this system we have inst</w:t>
+      </w:r>
+      <w:r>
+        <w:rPr>
+          <w:rFonts w:ascii="Arial" w:hAnsi="Arial" w:cs="Arial"/>
+        </w:rPr>
+        <w:t xml:space="preserve">alled one inverter of capacity </w:t>
+      </w:r>
+      <w:r>
+        <w:rPr>
+          <w:rFonts w:ascii="Arial" w:hAnsi="Arial" w:cs="Arial"/>
+        </w:rPr>
+        <w:t>{</w:t>
+      </w:r>
+      <w:proofErr w:type="spellStart"/>
+      <w:r>
+        <w:rPr>
+          <w:rFonts w:ascii="Arial" w:hAnsi="Arial" w:cs="Arial"/>
+        </w:rPr>
+        <w:t>inverter_capacity</w:t>
+      </w:r>
+      <w:proofErr w:type="spellEnd"/>
+      <w:r>
+        <w:rPr>
+          <w:rFonts w:ascii="Arial" w:hAnsi="Arial" w:cs="Arial"/>
+        </w:rPr>
+        <w:t>}</w:t>
+      </w:r>
+      <w:r>
+        <w:rPr>
+          <w:rFonts w:ascii="Arial" w:hAnsi="Arial" w:cs="Arial"/>
+        </w:rPr>
+        <w:t xml:space="preserve"> KW</w:t>
+      </w:r>
+      <w:r>
+        <w:rPr>
+          <w:rFonts w:ascii="Arial" w:hAnsi="Arial" w:cs="Arial"/>
+        </w:rPr>
+        <w:t xml:space="preserve"> and</w:t>
+      </w:r>
+      <w:r>
+        <w:rPr>
+          <w:rFonts w:ascii="Arial" w:hAnsi="Arial" w:cs="Arial"/>
+        </w:rPr>
+        <w:t xml:space="preserve"> {</w:t>
+      </w:r>
+      <w:proofErr w:type="spellStart"/>
+      <w:r>
+        <w:rPr>
+          <w:rFonts w:ascii="Arial" w:hAnsi="Arial" w:cs="Arial"/>
+        </w:rPr>
+        <w:t>no_of_panels</w:t>
+      </w:r>
+      <w:proofErr w:type="spellEnd"/>
+      <w:r>
+        <w:rPr>
+          <w:rFonts w:ascii="Arial" w:hAnsi="Arial" w:cs="Arial"/>
+        </w:rPr>
+        <w:t xml:space="preserve">} </w:t>
+      </w:r>
+      <w:r>
+        <w:rPr>
+          <w:rFonts w:ascii="Arial" w:hAnsi="Arial" w:cs="Arial"/>
+        </w:rPr>
+        <w:t>module</w:t>
+      </w:r>
+      <w:r>
+        <w:rPr>
+          <w:rFonts w:ascii="Arial" w:hAnsi="Arial" w:cs="Arial"/>
+        </w:rPr>
+        <w:t>s</w:t>
+      </w:r>
+      <w:r>
+        <w:rPr>
+          <w:rFonts w:ascii="Arial" w:hAnsi="Arial" w:cs="Arial"/>
+        </w:rPr>
+        <w:t xml:space="preserve"> of </w:t>
+      </w:r>
+      <w:r>
+        <w:rPr>
+          <w:rFonts w:ascii="Arial" w:hAnsi="Arial" w:cs="Arial"/>
+        </w:rPr>
+        <w:t>{</w:t>
+      </w:r>
+      <w:proofErr w:type="spellStart"/>
+      <w:r>
+        <w:rPr>
+          <w:rFonts w:ascii="Arial" w:hAnsi="Arial" w:cs="Arial"/>
+        </w:rPr>
+        <w:t>panel_capacity</w:t>
+      </w:r>
+      <w:proofErr w:type="spellEnd"/>
+      <w:r>
+        <w:rPr>
+          <w:rFonts w:ascii="Arial" w:hAnsi="Arial" w:cs="Arial"/>
+        </w:rPr>
+        <w:t>}</w:t>
+      </w:r>
+      <w:r>
+        <w:rPr>
+          <w:rFonts w:ascii="Arial" w:hAnsi="Arial" w:cs="Arial"/>
+        </w:rPr>
+        <w:t xml:space="preserve"> watt</w:t>
+      </w:r>
+    </w:p>
+    <w:p xmlns:wp14="http://schemas.microsoft.com/office/word/2010/wordml" wp14:textId="77777777">
+      <w:pPr>
+        <w:ind w:left="1440" w:right="1440"/>
+        <w:rPr>
+          <w:rFonts w:ascii="Arial" w:hAnsi="Arial" w:cs="Arial"/>
+        </w:rPr>
+      </w:pPr>
+      <w:r>
+        <w:rPr>
+          <w:rFonts w:ascii="Arial" w:hAnsi="Arial" w:cs="Arial"/>
+        </w:rPr>
+        <w:t xml:space="preserve">  Make of Inverter              :   </w:t>
+      </w:r>
+      <w:r>
+        <w:rPr>
+          <w:rFonts w:ascii="Arial" w:hAnsi="Arial" w:cs="Arial"/>
+        </w:rPr>
+        <w:t xml:space="preserve">  </w:t>
+      </w:r>
+      <w:r>
+        <w:rPr>
+          <w:rFonts w:ascii="Arial" w:hAnsi="Arial" w:cs="Arial"/>
+        </w:rPr>
+        <w:t xml:space="preserve"> </w:t>
+      </w:r>
+      <w:r>
+        <w:rPr>
+          <w:rFonts w:ascii="Arial" w:hAnsi="Arial" w:cs="Arial"/>
+        </w:rPr>
+        <w:t>{</w:t>
+      </w:r>
+      <w:proofErr w:type="spellStart"/>
+      <w:r>
+        <w:rPr>
+          <w:rFonts w:ascii="Arial" w:hAnsi="Arial" w:cs="Arial"/>
+        </w:rPr>
+        <w:t>inverter</w:t>
+      </w:r>
+      <w:r>
+        <w:rPr>
+          <w:rFonts w:ascii="Arial" w:hAnsi="Arial" w:cs="Arial"/>
+        </w:rPr>
+        <w:t>_brand</w:t>
+      </w:r>
+      <w:proofErr w:type="spellEnd"/>
+      <w:r>
+        <w:rPr>
+          <w:rFonts w:ascii="Arial" w:hAnsi="Arial" w:cs="Arial"/>
+        </w:rPr>
+        <w:t>}</w:t>
+      </w:r>
+    </w:p>
+    <w:p xmlns:wp14="http://schemas.microsoft.com/office/word/2010/wordml" wp14:textId="77777777">
+      <w:pPr>
+        <w:ind w:left="1440" w:right="1440"/>
+        <w:rPr>
+          <w:rFonts w:ascii="Arial" w:hAnsi="Arial" w:cs="Arial"/>
+        </w:rPr>
+      </w:pPr>
+      <w:r>
+        <w:rPr>
+          <w:rFonts w:ascii="Arial" w:hAnsi="Arial" w:cs="Arial"/>
+        </w:rPr>
+        <w:t xml:space="preserve">  Make of Module</w:t>
+      </w:r>
+      <w:r>
+        <w:rPr>
+          <w:rFonts w:ascii="Arial" w:hAnsi="Arial" w:cs="Arial"/>
+        </w:rPr>
+        <w:t xml:space="preserve">              :</w:t>
+      </w:r>
+      <w:r>
+        <w:rPr>
+          <w:rFonts w:ascii="Arial" w:hAnsi="Arial" w:cs="Arial"/>
+        </w:rPr>
+        <w:tab/>
+      </w:r>
+      <w:r>
+        <w:rPr>
+          <w:rFonts w:ascii="Arial" w:hAnsi="Arial" w:cs="Arial"/>
+        </w:rPr>
+        <w:t xml:space="preserve">  {</w:t>
+      </w:r>
+      <w:proofErr w:type="spellStart"/>
+      <w:r>
+        <w:rPr>
+          <w:rFonts w:ascii="Arial" w:hAnsi="Arial" w:cs="Arial"/>
+        </w:rPr>
+        <w:t>panel</w:t>
+      </w:r>
+      <w:r>
+        <w:rPr>
+          <w:rFonts w:ascii="Arial" w:hAnsi="Arial" w:cs="Arial"/>
+        </w:rPr>
+        <w:t>_brand</w:t>
+      </w:r>
+      <w:proofErr w:type="spellEnd"/>
+      <w:r>
+        <w:rPr>
+          <w:rFonts w:ascii="Arial" w:hAnsi="Arial" w:cs="Arial"/>
+        </w:rPr>
+        <w:t>}</w:t>
+      </w:r>
+    </w:p>
+    <w:p xmlns:wp14="http://schemas.microsoft.com/office/word/2010/wordml" wp14:textId="77777777">
+      <w:pPr>
+        <w:ind w:left="1440" w:right="1440"/>
+        <w:rPr>
+          <w:rFonts w:ascii="Arial" w:hAnsi="Arial" w:cs="Arial"/>
+        </w:rPr>
+      </w:pPr>
+      <w:r>
+        <w:rPr>
+          <w:rFonts w:ascii="Arial" w:hAnsi="Arial" w:cs="Arial"/>
+        </w:rPr>
+        <w:t xml:space="preserve">  Number of </w:t>
+      </w:r>
+      <w:proofErr w:type="spellStart"/>
+      <w:r>
+        <w:rPr>
+          <w:rFonts w:ascii="Arial" w:hAnsi="Arial" w:cs="Arial"/>
+        </w:rPr>
+        <w:t>Earthing</w:t>
+      </w:r>
+      <w:proofErr w:type="spellEnd"/>
+      <w:r>
+        <w:rPr>
+          <w:rFonts w:ascii="Arial" w:hAnsi="Arial" w:cs="Arial"/>
+        </w:rPr>
+        <w:t xml:space="preserve">         : </w:t>
+      </w:r>
+      <w:r>
+        <w:rPr>
+          <w:rFonts w:ascii="Arial" w:hAnsi="Arial" w:cs="Arial"/>
+        </w:rPr>
+        <w:t xml:space="preserve">     </w:t>
+      </w:r>
+      <w:r>
+        <w:rPr>
+          <w:rFonts w:ascii="Arial" w:hAnsi="Arial" w:cs="Arial"/>
+        </w:rPr>
+        <w:t>3</w:t>
+      </w:r>
+    </w:p>
+    <w:p xmlns:wp14="http://schemas.microsoft.com/office/word/2010/wordml" wp14:textId="77777777">
+      <w:pPr>
+        <w:ind w:left="1440" w:right="1440"/>
+        <w:rPr>
+          <w:rFonts w:ascii="Arial" w:hAnsi="Arial" w:cs="Arial"/>
+        </w:rPr>
+      </w:pPr>
+      <w:r>
+        <w:rPr>
+          <w:rFonts w:ascii="Arial" w:hAnsi="Arial" w:cs="Arial"/>
+        </w:rPr>
+        <w:t xml:space="preserve">  Surge Protection </w:t>
+      </w:r>
+      <w:proofErr w:type="gramStart"/>
+      <w:r>
+        <w:rPr>
+          <w:rFonts w:ascii="Arial" w:hAnsi="Arial" w:cs="Arial"/>
+        </w:rPr>
+        <w:t>Device :</w:t>
+      </w:r>
+      <w:proofErr w:type="gramEnd"/>
+      <w:r>
+        <w:rPr>
+          <w:rFonts w:ascii="Arial" w:hAnsi="Arial" w:cs="Arial"/>
+        </w:rPr>
+        <w:t xml:space="preserve">      </w:t>
+      </w:r>
+      <w:r>
+        <w:rPr>
+          <w:rFonts w:ascii="Arial" w:hAnsi="Arial" w:cs="Arial"/>
+        </w:rPr>
+        <w:t>Yes</w:t>
+      </w:r>
+    </w:p>
+    <w:p xmlns:wp14="http://schemas.microsoft.com/office/word/2010/wordml" wp14:textId="77777777">
+      <w:pPr>
+        <w:ind w:left="1440" w:right="1440"/>
+        <w:rPr>
+          <w:rFonts w:ascii="Arial" w:hAnsi="Arial" w:cs="Arial"/>
+        </w:rPr>
+      </w:pPr>
+      <w:r>
+        <w:rPr>
+          <w:rFonts w:ascii="Arial" w:hAnsi="Arial" w:cs="Arial"/>
+        </w:rPr>
+        <w:t xml:space="preserve">We, </w:t>
+      </w:r>
+      <w:proofErr w:type="spellStart"/>
+      <w:r>
+        <w:rPr>
+          <w:rFonts w:ascii="Arial" w:hAnsi="Arial" w:cs="Arial"/>
+        </w:rPr>
+        <w:t>Mamta</w:t>
+      </w:r>
+      <w:proofErr w:type="spellEnd"/>
+      <w:r>
+        <w:rPr>
+          <w:rFonts w:ascii="Arial" w:hAnsi="Arial" w:cs="Arial"/>
+        </w:rPr>
+        <w:t xml:space="preserve"> Enterprises, </w:t>
+      </w:r>
+      <w:r>
+        <w:rPr>
+          <w:rFonts w:ascii="Arial" w:hAnsi="Arial" w:cs="Arial"/>
+        </w:rPr>
+        <w:t xml:space="preserve">near Bank of India, </w:t>
+      </w:r>
+      <w:proofErr w:type="spellStart"/>
+      <w:r>
+        <w:rPr>
+          <w:rFonts w:ascii="Arial" w:hAnsi="Arial" w:cs="Arial"/>
+        </w:rPr>
+        <w:t>Jind</w:t>
+      </w:r>
+      <w:proofErr w:type="spellEnd"/>
+      <w:r>
+        <w:rPr>
+          <w:rFonts w:ascii="Arial" w:hAnsi="Arial" w:cs="Arial"/>
+        </w:rPr>
+        <w:t xml:space="preserve"> Road, </w:t>
+      </w:r>
+      <w:r>
+        <w:rPr>
+          <w:rFonts w:ascii="Arial" w:hAnsi="Arial" w:cs="Arial"/>
+        </w:rPr>
+        <w:t>Kaithal, HR, certify that this system is installed as pe</w:t>
+      </w:r>
+      <w:r>
+        <w:rPr>
+          <w:rFonts w:ascii="Arial" w:hAnsi="Arial" w:cs="Arial"/>
+        </w:rPr>
+        <w:t>r MNRE guidelines and is safe (</w:t>
+      </w:r>
+      <w:r>
+        <w:rPr>
+          <w:rFonts w:ascii="Arial" w:hAnsi="Arial" w:cs="Arial"/>
+        </w:rPr>
+        <w:t xml:space="preserve">all the safety measures are being taken care </w:t>
+      </w:r>
+      <w:proofErr w:type="gramStart"/>
+      <w:r>
+        <w:rPr>
+          <w:rFonts w:ascii="Arial" w:hAnsi="Arial" w:cs="Arial"/>
+        </w:rPr>
+        <w:t>of )</w:t>
+      </w:r>
+      <w:proofErr w:type="gramEnd"/>
+      <w:r>
+        <w:rPr>
+          <w:rFonts w:ascii="Arial" w:hAnsi="Arial" w:cs="Arial"/>
+        </w:rPr>
+        <w:t>.</w:t>
+      </w:r>
+    </w:p>
+    <w:p xmlns:wp14="http://schemas.microsoft.com/office/word/2010/wordml" wp14:textId="77777777">
+      <w:pPr>
+        <w:tabs>
+          <w:tab w:val="left" w:pos="4140"/>
+        </w:tabs>
+        <w:ind w:left="1440" w:right="1440"/>
+        <w:rPr>
+          <w:rFonts w:ascii="Arial" w:hAnsi="Arial" w:cs="Arial"/>
+        </w:rPr>
+      </w:pPr>
+      <w:r>
+        <w:rPr>
+          <w:rFonts w:ascii="Arial" w:hAnsi="Arial" w:cs="Arial"/>
+        </w:rPr>
+        <w:t>Thanking you</w:t>
+      </w:r>
+      <w:r>
+        <w:rPr>
+          <w:rFonts w:ascii="Arial" w:hAnsi="Arial" w:cs="Arial"/>
+        </w:rPr>
+        <w:t>.</w:t>
+      </w:r>
+    </w:p>
+    <w:p xmlns:wp14="http://schemas.microsoft.com/office/word/2010/wordml" wp14:textId="77777777">
+      <w:pPr>
+        <w:ind w:left="1440" w:right="1440"/>
+        <w:rPr>
+          <w:rFonts w:ascii="Arial" w:hAnsi="Arial" w:cs="Arial"/>
+        </w:rPr>
+      </w:pPr>
+    </w:p>
+    <w:p xmlns:wp14="http://schemas.microsoft.com/office/word/2010/wordml" wp14:textId="77777777">
+      <w:pPr>
+        <w:ind w:left="1440" w:right="1440"/>
+        <w:rPr>
+          <w:rFonts w:ascii="Arial" w:hAnsi="Arial" w:cs="Arial"/>
+        </w:rPr>
+      </w:pPr>
+      <w:r>
+        <w:rPr>
+          <w:rFonts w:ascii="Arial" w:hAnsi="Arial" w:cs="Arial"/>
+        </w:rPr>
+        <w:t>Yours truly,</w:t>
+      </w:r>
+    </w:p>
+    <w:p xmlns:wp14="http://schemas.microsoft.com/office/word/2010/wordml" wp14:textId="77777777">
+      <w:pPr>
+        <w:ind w:left="1440" w:right="1440"/>
+        <w:rPr>
+          <w:rFonts w:ascii="Arial" w:hAnsi="Arial" w:cs="Arial"/>
+        </w:rPr>
+      </w:pPr>
+      <w:r>
+        <w:rPr>
+          <w:rFonts w:ascii="Arial" w:hAnsi="Arial" w:cs="Arial"/>
+        </w:rPr>
+        <w:t xml:space="preserve">For </w:t>
+      </w:r>
+      <w:proofErr w:type="spellStart"/>
+      <w:r>
+        <w:rPr>
+          <w:rFonts w:ascii="Arial" w:hAnsi="Arial" w:cs="Arial"/>
+        </w:rPr>
+        <w:t>Mamta</w:t>
+      </w:r>
+      <w:proofErr w:type="spellEnd"/>
+      <w:r>
+        <w:rPr>
+          <w:rFonts w:ascii="Arial" w:hAnsi="Arial" w:cs="Arial"/>
+        </w:rPr>
+        <w:t xml:space="preserve"> Enterprises</w:t>
+      </w:r>
+    </w:p>
+    <w:p xmlns:wp14="http://schemas.microsoft.com/office/word/2010/wordml" wp14:textId="77777777">
+      <w:pPr>
+        <w:ind w:left="1440" w:right="1440"/>
+        <w:rPr>
+          <w:rFonts w:ascii="Arial" w:hAnsi="Arial" w:cs="Arial"/>
+        </w:rPr>
+      </w:pPr>
+    </w:p>
+    <w:p xmlns:wp14="http://schemas.microsoft.com/office/word/2010/wordml" wp14:textId="77777777">
+      <w:pPr>
+        <w:ind w:left="1440" w:right="1440"/>
+        <w:rPr>
+          <w:rFonts w:ascii="Arial" w:hAnsi="Arial" w:cs="Arial"/>
+        </w:rPr>
+      </w:pPr>
+      <w:r>
+        <w:rPr>
+          <w:rFonts w:ascii="Arial" w:hAnsi="Arial" w:cs="Arial"/>
+        </w:rPr>
+        <w:t>Auth.</w:t>
+      </w:r>
+      <w:r>
+        <w:rPr>
+          <w:rFonts w:ascii="Arial" w:hAnsi="Arial" w:cs="Arial"/>
+        </w:rPr>
+        <w:t xml:space="preserve"> </w:t>
+      </w:r>
+      <w:r>
+        <w:rPr>
+          <w:rFonts w:ascii="Arial" w:hAnsi="Arial" w:cs="Arial"/>
+        </w:rPr>
+        <w:t>S</w:t>
+      </w:r>
+      <w:r>
+        <w:rPr>
+          <w:rFonts w:ascii="Arial" w:hAnsi="Arial" w:cs="Arial"/>
+        </w:rPr>
+        <w:t>ignatory</w:t>
+      </w:r>
+    </w:p>
+    <w:p xmlns:wp14="http://schemas.microsoft.com/office/word/2010/wordml" wp14:textId="77777777">
+      <w:pPr>
+        <w:jc w:val="center"/>
+        <w:rPr>
+          <w:rFonts w:ascii="Arial" w:hAnsi="Arial" w:cs="Arial"/>
+        </w:rPr>
+      </w:pPr>
+      <w:r>
+        <w:rPr>
+          <w:rFonts w:ascii="Arial" w:hAnsi="Arial" w:cs="Arial"/>
+        </w:rPr>
+        <w:br w:type="page"/>
+      </w:r>
+    </w:p>
+    <w:p xmlns:wp14="http://schemas.microsoft.com/office/word/2010/wordml" wp14:textId="77777777">
+      <w:pPr>
+        <w:jc w:val="center"/>
+        <w:rPr>
+          <w:rFonts w:ascii="Arial" w:hAnsi="Arial" w:cs="Arial"/>
+        </w:rPr>
+      </w:pPr>
+    </w:p>
+    <w:p xmlns:wp14="http://schemas.microsoft.com/office/word/2010/wordml" wp14:textId="77777777">
+      <w:pPr>
+        <w:jc w:val="center"/>
+        <w:rPr>
+          <w:rFonts w:ascii="Arial" w:hAnsi="Arial" w:cs="Arial"/>
+        </w:rPr>
+      </w:pPr>
+    </w:p>
+    <w:p xmlns:wp14="http://schemas.microsoft.com/office/word/2010/wordml" wp14:textId="77777777">
+      <w:pPr>
+        <w:jc w:val="center"/>
+        <w:rPr>
+          <w:rFonts w:ascii="Arial" w:hAnsi="Arial" w:cs="Arial"/>
+        </w:rPr>
+      </w:pPr>
+    </w:p>
+    <w:p xmlns:wp14="http://schemas.microsoft.com/office/word/2010/wordml" wp14:textId="77777777">
+      <w:pPr>
+        <w:jc w:val="center"/>
+        <w:rPr>
+          <w:rFonts w:ascii="Arial" w:hAnsi="Arial" w:cs="Arial"/>
+        </w:rPr>
+      </w:pPr>
+    </w:p>
+    <w:p xmlns:wp14="http://schemas.microsoft.com/office/word/2010/wordml" wp14:textId="77777777">
+      <w:pPr>
+        <w:jc w:val="center"/>
+        <w:rPr>
+          <w:rFonts w:ascii="Arial" w:hAnsi="Arial" w:cs="Arial"/>
+        </w:rPr>
+      </w:pPr>
+      <w:r>
         <w:rPr>
           <w:b/>
           <w:sz w:val="28"/>
           <w:szCs w:val="28"/>
           <w:u w:val="single"/>
         </w:rPr>
-      </w:pPr>
-      <w:r>
-        <w:rPr>
+        <w:t>Warranty/Guarantee and Declaration Certificate</w:t>
+      </w:r>
+    </w:p>
+    <w:p xmlns:wp14="http://schemas.microsoft.com/office/word/2010/wordml" wp14:textId="77777777">
+      <w:pPr>
+        <w:ind w:left="1440" w:right="1440"/>
+        <w:rPr>
+          <w:rFonts w:ascii="Arial" w:hAnsi="Arial" w:cs="Arial"/>
+          <w:sz w:val="24"/>
+          <w:szCs w:val="24"/>
+        </w:rPr>
+      </w:pPr>
+      <w:r>
+        <w:rPr>
+          <w:rFonts w:ascii="Arial" w:hAnsi="Arial" w:cs="Arial"/>
+          <w:sz w:val="24"/>
+          <w:szCs w:val="24"/>
+        </w:rPr>
+        <w:t>It is Certified that the ON GRID SOLAR POWER PLANT of capacity</w:t>
+      </w:r>
+      <w:r>
+        <w:rPr>
+          <w:rFonts w:ascii="Arial" w:hAnsi="Arial" w:cs="Arial"/>
+          <w:sz w:val="24"/>
+          <w:szCs w:val="24"/>
+        </w:rPr>
+        <w:t xml:space="preserve"> </w:t>
+      </w:r>
+      <w:r>
+        <w:rPr>
+          <w:rFonts w:ascii="Arial" w:hAnsi="Arial" w:cs="Arial"/>
+        </w:rPr>
+        <w:t>{</w:t>
+      </w:r>
+      <w:proofErr w:type="spellStart"/>
+      <w:r>
+        <w:rPr>
+          <w:rFonts w:ascii="Arial" w:hAnsi="Arial" w:cs="Arial"/>
+        </w:rPr>
+        <w:t>net_solar_capacity</w:t>
+      </w:r>
+      <w:proofErr w:type="spellEnd"/>
+      <w:r>
+        <w:rPr>
+          <w:rFonts w:ascii="Arial" w:hAnsi="Arial" w:cs="Arial"/>
+        </w:rPr>
+        <w:t xml:space="preserve">} </w:t>
+      </w:r>
+      <w:r>
+        <w:rPr>
+          <w:rFonts w:ascii="Arial" w:hAnsi="Arial" w:cs="Arial"/>
+        </w:rPr>
+        <w:t>K</w:t>
+      </w:r>
+      <w:r>
+        <w:rPr>
+          <w:rFonts w:ascii="Arial" w:hAnsi="Arial" w:cs="Arial"/>
+        </w:rPr>
+        <w:t>W</w:t>
+      </w:r>
+      <w:r>
+        <w:rPr>
+          <w:rFonts w:ascii="Arial" w:hAnsi="Arial" w:cs="Arial"/>
           <w:b/>
-          <w:sz w:val="28"/>
-          <w:szCs w:val="28"/>
-          <w:u w:val="single"/>
-        </w:rPr>
-        <w:t>Safety</w:t>
-      </w:r>
-      <w:r>
-        <w:rPr>
-          <w:b/>
-          <w:sz w:val="28"/>
-          <w:szCs w:val="28"/>
-          <w:u w:val="single"/>
-        </w:rPr>
-        <w:t xml:space="preserve"> Certificate</w:t>
-      </w:r>
-    </w:p>
-    <w:p>
-      <w:pPr>
-        <w:ind w:left="1440" w:right="1440"/>
-        <w:rPr>
-          <w:rFonts w:ascii="Arial" w:hAnsi="Arial" w:cs="Arial"/>
-        </w:rPr>
-      </w:pPr>
-      <w:r>
-        <w:rPr>
-          <w:rFonts w:ascii="Arial" w:hAnsi="Arial" w:cs="Arial"/>
-        </w:rPr>
-        <w:t>It is c</w:t>
-      </w:r>
-      <w:r>
-        <w:rPr>
-          <w:rFonts w:ascii="Arial" w:hAnsi="Arial" w:cs="Arial"/>
-        </w:rPr>
-        <w:t xml:space="preserve">ertified that </w:t>
-      </w:r>
-      <w:r>
-        <w:rPr>
-          <w:rFonts w:ascii="Arial" w:hAnsi="Arial" w:cs="Arial"/>
-        </w:rPr>
-        <w:t>t</w:t>
-      </w:r>
-      <w:r>
-        <w:rPr>
-          <w:rFonts w:ascii="Arial" w:hAnsi="Arial" w:cs="Arial"/>
-        </w:rPr>
-        <w:t>he Solar Power Plant of capacity</w:t>
-      </w:r>
-      <w:r>
-        <w:rPr>
-          <w:rFonts w:ascii="Arial" w:hAnsi="Arial" w:cs="Arial"/>
-        </w:rPr>
-        <w:t xml:space="preserve"> {</w:t>
+          <w:sz w:val="24"/>
+          <w:szCs w:val="24"/>
+        </w:rPr>
+        <w:t xml:space="preserve"> </w:t>
+      </w:r>
+      <w:r>
+        <w:rPr>
+          <w:rFonts w:ascii="Arial" w:hAnsi="Arial" w:cs="Arial"/>
+          <w:sz w:val="24"/>
+          <w:szCs w:val="24"/>
+        </w:rPr>
+        <w:t xml:space="preserve">installed by </w:t>
       </w:r>
       <w:proofErr w:type="spellStart"/>
       <w:r>
         <w:rPr>
           <w:rFonts w:ascii="Arial" w:hAnsi="Arial" w:cs="Arial"/>
-        </w:rPr>
-        <w:t>net_solar_capacity</w:t>
+          <w:sz w:val="24"/>
+          <w:szCs w:val="24"/>
+        </w:rPr>
+        <w:t>Mamta</w:t>
       </w:r>
       <w:proofErr w:type="spellEnd"/>
       <w:r>
         <w:rPr>
           <w:rFonts w:ascii="Arial" w:hAnsi="Arial" w:cs="Arial"/>
+          <w:sz w:val="24"/>
+          <w:szCs w:val="24"/>
+        </w:rPr>
+        <w:t xml:space="preserve"> Enterprises to </w:t>
+      </w:r>
+      <w:r>
+        <w:rPr>
+          <w:rFonts w:ascii="Arial" w:hAnsi="Arial" w:cs="Arial"/>
+          <w:sz w:val="24"/>
+          <w:szCs w:val="24"/>
+        </w:rPr>
+        <w:t>{</w:t>
+      </w:r>
+      <w:proofErr w:type="spellStart"/>
+      <w:r>
+        <w:rPr>
+          <w:rFonts w:ascii="Arial" w:hAnsi="Arial" w:cs="Arial"/>
+          <w:sz w:val="24"/>
+          <w:szCs w:val="24"/>
+        </w:rPr>
+        <w:t>consumer_name</w:t>
+      </w:r>
+      <w:proofErr w:type="spellEnd"/>
+      <w:r>
+        <w:rPr>
+          <w:rFonts w:ascii="Arial" w:hAnsi="Arial" w:cs="Arial"/>
+          <w:sz w:val="24"/>
+          <w:szCs w:val="24"/>
+        </w:rPr>
+        <w:t>}, {</w:t>
+      </w:r>
+      <w:proofErr w:type="spellStart"/>
+      <w:r>
+        <w:rPr>
+          <w:rFonts w:ascii="Arial" w:hAnsi="Arial" w:cs="Arial"/>
+          <w:sz w:val="24"/>
+          <w:szCs w:val="24"/>
+        </w:rPr>
+        <w:t>consumer_address</w:t>
+      </w:r>
+      <w:proofErr w:type="spellEnd"/>
+      <w:r>
+        <w:rPr>
+          <w:rFonts w:ascii="Arial" w:hAnsi="Arial" w:cs="Arial"/>
+          <w:sz w:val="24"/>
+          <w:szCs w:val="24"/>
+        </w:rPr>
+        <w:t>}, Invoice No. {</w:t>
+      </w:r>
+      <w:proofErr w:type="spellStart"/>
+      <w:r>
+        <w:rPr>
+          <w:rFonts w:ascii="Arial" w:hAnsi="Arial" w:cs="Arial"/>
+          <w:sz w:val="24"/>
+          <w:szCs w:val="24"/>
+        </w:rPr>
+        <w:t>invoice_number</w:t>
+      </w:r>
+      <w:proofErr w:type="spellEnd"/>
+      <w:r>
+        <w:rPr>
+          <w:rFonts w:ascii="Arial" w:hAnsi="Arial" w:cs="Arial"/>
+          <w:sz w:val="24"/>
+          <w:szCs w:val="24"/>
+        </w:rPr>
+        <w:t>}, Dated: {</w:t>
+      </w:r>
+      <w:proofErr w:type="spellStart"/>
+      <w:r>
+        <w:rPr>
+          <w:rFonts w:ascii="Arial" w:hAnsi="Arial" w:cs="Arial"/>
+          <w:sz w:val="24"/>
+          <w:szCs w:val="24"/>
+        </w:rPr>
+        <w:t>invoice_date</w:t>
+      </w:r>
+      <w:proofErr w:type="spellEnd"/>
+      <w:r>
+        <w:rPr>
+          <w:rFonts w:ascii="Arial" w:hAnsi="Arial" w:cs="Arial"/>
+          <w:sz w:val="24"/>
+          <w:szCs w:val="24"/>
         </w:rPr>
         <w:t>}</w:t>
       </w:r>
       <w:r>
         <w:rPr>
           <w:rFonts w:ascii="Arial" w:hAnsi="Arial" w:cs="Arial"/>
+          <w:sz w:val="24"/>
+          <w:szCs w:val="24"/>
+        </w:rPr>
+        <w:t>, is warranted for 1</w:t>
+      </w:r>
+      <w:r>
+        <w:rPr>
+          <w:rFonts w:ascii="Arial" w:hAnsi="Arial" w:cs="Arial"/>
+          <w:sz w:val="24"/>
+          <w:szCs w:val="24"/>
         </w:rPr>
         <w:t xml:space="preserve"> </w:t>
       </w:r>
-      <w:r>
-        <w:rPr>
-          <w:rFonts w:ascii="Arial" w:hAnsi="Arial" w:cs="Arial"/>
-        </w:rPr>
-        <w:t>K</w:t>
-      </w:r>
-      <w:r>
-        <w:rPr>
-          <w:rFonts w:ascii="Arial" w:hAnsi="Arial" w:cs="Arial"/>
-        </w:rPr>
-        <w:t>W</w:t>
-      </w:r>
-      <w:r>
-        <w:rPr>
-          <w:rFonts w:ascii="Arial" w:hAnsi="Arial" w:cs="Arial"/>
-        </w:rPr>
-        <w:t xml:space="preserve"> </w:t>
-      </w:r>
-      <w:r>
-        <w:rPr>
-          <w:rFonts w:ascii="Arial" w:hAnsi="Arial" w:cs="Arial"/>
-        </w:rPr>
-        <w:t xml:space="preserve">installed by </w:t>
-      </w:r>
-      <w:proofErr w:type="spellStart"/>
-      <w:r>
-        <w:rPr>
-          <w:rFonts w:ascii="Arial" w:hAnsi="Arial" w:cs="Arial"/>
-        </w:rPr>
-        <w:t>Mamta</w:t>
-      </w:r>
-      <w:proofErr w:type="spellEnd"/>
-      <w:r>
-        <w:rPr>
-          <w:rFonts w:ascii="Arial" w:hAnsi="Arial" w:cs="Arial"/>
-        </w:rPr>
-        <w:t xml:space="preserve"> Enterprises</w:t>
-      </w:r>
-      <w:r>
-        <w:rPr>
-          <w:rFonts w:ascii="Arial" w:hAnsi="Arial" w:cs="Arial"/>
-        </w:rPr>
-        <w:t xml:space="preserve"> at</w:t>
-      </w:r>
-      <w:r>
-        <w:rPr>
-          <w:rFonts w:ascii="Arial" w:hAnsi="Arial" w:cs="Arial"/>
-        </w:rPr>
-        <w:t xml:space="preserve"> </w:t>
-      </w:r>
-      <w:r>
-        <w:rPr>
-          <w:rFonts w:ascii="Arial" w:hAnsi="Arial" w:cs="Arial"/>
-        </w:rPr>
-        <w:t>{</w:t>
-      </w:r>
-      <w:proofErr w:type="spellStart"/>
-      <w:r>
-        <w:rPr>
-          <w:rFonts w:ascii="Arial" w:hAnsi="Arial" w:cs="Arial"/>
-        </w:rPr>
-        <w:t>consumer_name</w:t>
-      </w:r>
-      <w:proofErr w:type="spellEnd"/>
-      <w:r>
-        <w:rPr>
-          <w:rFonts w:ascii="Arial" w:hAnsi="Arial" w:cs="Arial"/>
-        </w:rPr>
-        <w:t>}</w:t>
-      </w:r>
-      <w:r>
-        <w:rPr>
-          <w:rFonts w:ascii="Arial" w:hAnsi="Arial" w:cs="Arial"/>
-        </w:rPr>
-        <w:t>,</w:t>
-      </w:r>
-      <w:r>
-        <w:rPr>
-          <w:rFonts w:ascii="Arial" w:hAnsi="Arial" w:cs="Arial"/>
-        </w:rPr>
-        <w:t xml:space="preserve"> {</w:t>
-      </w:r>
-      <w:proofErr w:type="spellStart"/>
-      <w:r>
-        <w:rPr>
-          <w:rFonts w:ascii="Arial" w:hAnsi="Arial" w:cs="Arial"/>
-        </w:rPr>
-        <w:t>consumer_address</w:t>
-      </w:r>
-      <w:proofErr w:type="spellEnd"/>
-      <w:r>
-        <w:rPr>
-          <w:rFonts w:ascii="Arial" w:hAnsi="Arial" w:cs="Arial"/>
-        </w:rPr>
-        <w:t>}</w:t>
-      </w:r>
-      <w:r>
-        <w:rPr>
-          <w:rFonts w:ascii="Arial" w:hAnsi="Arial" w:cs="Arial"/>
-        </w:rPr>
-        <w:t>,</w:t>
-      </w:r>
-      <w:r>
-        <w:rPr>
-          <w:rFonts w:ascii="Arial" w:hAnsi="Arial" w:cs="Arial"/>
-        </w:rPr>
-        <w:t xml:space="preserve"> Invoice No.</w:t>
-      </w:r>
-      <w:r>
-        <w:rPr>
-          <w:rFonts w:ascii="Arial" w:hAnsi="Arial" w:cs="Arial"/>
-        </w:rPr>
-        <w:t xml:space="preserve"> </w:t>
-      </w:r>
-      <w:r>
-        <w:rPr>
-          <w:rFonts w:ascii="Arial" w:hAnsi="Arial" w:cs="Arial"/>
-        </w:rPr>
-        <w:t>{</w:t>
-      </w:r>
-      <w:proofErr w:type="spellStart"/>
-      <w:r>
-        <w:rPr>
-          <w:rFonts w:ascii="Arial" w:hAnsi="Arial" w:cs="Arial"/>
-        </w:rPr>
-        <w:t>invoice_number</w:t>
-      </w:r>
-      <w:proofErr w:type="spellEnd"/>
-      <w:r>
-        <w:rPr>
-          <w:rFonts w:ascii="Arial" w:hAnsi="Arial" w:cs="Arial"/>
-        </w:rPr>
-        <w:t>}</w:t>
-      </w:r>
-      <w:r>
-        <w:rPr>
-          <w:rFonts w:ascii="Arial" w:hAnsi="Arial" w:cs="Arial"/>
-        </w:rPr>
-        <w:t xml:space="preserve">, Dated: </w:t>
-      </w:r>
-      <w:r>
-        <w:rPr>
-          <w:rFonts w:ascii="Arial" w:hAnsi="Arial" w:cs="Arial"/>
-        </w:rPr>
-        <w:t>{</w:t>
-      </w:r>
-      <w:proofErr w:type="spellStart"/>
-      <w:r>
-        <w:rPr>
-          <w:rFonts w:ascii="Arial" w:hAnsi="Arial" w:cs="Arial"/>
-        </w:rPr>
-        <w:t>invoice_date</w:t>
-      </w:r>
-      <w:proofErr w:type="spellEnd"/>
-      <w:r>
-        <w:rPr>
-          <w:rFonts w:ascii="Arial" w:hAnsi="Arial" w:cs="Arial"/>
-        </w:rPr>
-        <w:t>}</w:t>
-      </w:r>
-      <w:r>
-        <w:rPr>
-          <w:rFonts w:ascii="Arial" w:hAnsi="Arial" w:cs="Arial"/>
-        </w:rPr>
-        <w:t xml:space="preserve">, </w:t>
-      </w:r>
-      <w:r>
-        <w:rPr>
-          <w:rFonts w:ascii="Arial" w:hAnsi="Arial" w:cs="Arial"/>
-        </w:rPr>
-        <w:t>in this system we have inst</w:t>
-      </w:r>
-      <w:r>
-        <w:rPr>
-          <w:rFonts w:ascii="Arial" w:hAnsi="Arial" w:cs="Arial"/>
-        </w:rPr>
-        <w:t xml:space="preserve">alled one inverter of capacity </w:t>
-      </w:r>
-      <w:r>
-        <w:rPr>
-          <w:rFonts w:ascii="Arial" w:hAnsi="Arial" w:cs="Arial"/>
-        </w:rPr>
-        <w:t>{</w:t>
-      </w:r>
-      <w:proofErr w:type="spellStart"/>
-      <w:r>
-        <w:rPr>
-          <w:rFonts w:ascii="Arial" w:hAnsi="Arial" w:cs="Arial"/>
-        </w:rPr>
-        <w:t>inverter_capacity</w:t>
-      </w:r>
-      <w:proofErr w:type="spellEnd"/>
-      <w:r>
-        <w:rPr>
-          <w:rFonts w:ascii="Arial" w:hAnsi="Arial" w:cs="Arial"/>
-        </w:rPr>
-        <w:t>}</w:t>
-      </w:r>
-      <w:r>
-        <w:rPr>
-          <w:rFonts w:ascii="Arial" w:hAnsi="Arial" w:cs="Arial"/>
-        </w:rPr>
-        <w:t xml:space="preserve"> KW</w:t>
-      </w:r>
-      <w:r>
-        <w:rPr>
-          <w:rFonts w:ascii="Arial" w:hAnsi="Arial" w:cs="Arial"/>
-        </w:rPr>
-        <w:t xml:space="preserve"> and</w:t>
-      </w:r>
-      <w:r>
-        <w:rPr>
-          <w:rFonts w:ascii="Arial" w:hAnsi="Arial" w:cs="Arial"/>
-        </w:rPr>
-        <w:t xml:space="preserve"> {</w:t>
-      </w:r>
-      <w:proofErr w:type="spellStart"/>
-      <w:r>
-        <w:rPr>
-          <w:rFonts w:ascii="Arial" w:hAnsi="Arial" w:cs="Arial"/>
-        </w:rPr>
-        <w:t>no_of_panels</w:t>
-      </w:r>
-      <w:proofErr w:type="spellEnd"/>
-      <w:r>
-        <w:rPr>
-          <w:rFonts w:ascii="Arial" w:hAnsi="Arial" w:cs="Arial"/>
-        </w:rPr>
-        <w:t xml:space="preserve">} </w:t>
-      </w:r>
-      <w:r>
-        <w:rPr>
-          <w:rFonts w:ascii="Arial" w:hAnsi="Arial" w:cs="Arial"/>
-        </w:rPr>
-        <w:t>module</w:t>
-      </w:r>
-      <w:r>
-        <w:rPr>
-          <w:rFonts w:ascii="Arial" w:hAnsi="Arial" w:cs="Arial"/>
-        </w:rPr>
-        <w:t>s</w:t>
-      </w:r>
-      <w:r>
-        <w:rPr>
-          <w:rFonts w:ascii="Arial" w:hAnsi="Arial" w:cs="Arial"/>
-        </w:rPr>
-        <w:t xml:space="preserve"> of </w:t>
-      </w:r>
-      <w:r>
-        <w:rPr>
-          <w:rFonts w:ascii="Arial" w:hAnsi="Arial" w:cs="Arial"/>
-        </w:rPr>
-        <w:t>{</w:t>
-      </w:r>
-      <w:proofErr w:type="spellStart"/>
-      <w:r>
-        <w:rPr>
-          <w:rFonts w:ascii="Arial" w:hAnsi="Arial" w:cs="Arial"/>
-        </w:rPr>
-        <w:t>panel_capacity</w:t>
-      </w:r>
-      <w:proofErr w:type="spellEnd"/>
-      <w:r>
-        <w:rPr>
-          <w:rFonts w:ascii="Arial" w:hAnsi="Arial" w:cs="Arial"/>
-        </w:rPr>
-        <w:t>}</w:t>
-      </w:r>
-      <w:r>
-        <w:rPr>
-          <w:rFonts w:ascii="Arial" w:hAnsi="Arial" w:cs="Arial"/>
-        </w:rPr>
-        <w:t xml:space="preserve"> watt</w:t>
-      </w:r>
-    </w:p>
-    <w:p>
-      <w:pPr>
-        <w:ind w:left="1440" w:right="1440"/>
-        <w:rPr>
-          <w:rFonts w:ascii="Arial" w:hAnsi="Arial" w:cs="Arial"/>
-        </w:rPr>
-      </w:pPr>
-      <w:r>
-        <w:rPr>
-          <w:rFonts w:ascii="Arial" w:hAnsi="Arial" w:cs="Arial"/>
-        </w:rPr>
-        <w:t xml:space="preserve">  Make of Inverter              :   </w:t>
-      </w:r>
-      <w:r>
-        <w:rPr>
-          <w:rFonts w:ascii="Arial" w:hAnsi="Arial" w:cs="Arial"/>
-        </w:rPr>
-        <w:t xml:space="preserve">  </w:t>
-      </w:r>
-      <w:r>
-        <w:rPr>
-          <w:rFonts w:ascii="Arial" w:hAnsi="Arial" w:cs="Arial"/>
-        </w:rPr>
-        <w:t xml:space="preserve"> </w:t>
-      </w:r>
-      <w:r>
-        <w:rPr>
-          <w:rFonts w:ascii="Arial" w:hAnsi="Arial" w:cs="Arial"/>
-        </w:rPr>
-        <w:t>{</w:t>
-      </w:r>
-      <w:proofErr w:type="spellStart"/>
-      <w:r>
-        <w:rPr>
-          <w:rFonts w:ascii="Arial" w:hAnsi="Arial" w:cs="Arial"/>
-        </w:rPr>
-        <w:t>inverter</w:t>
-      </w:r>
-      <w:r>
-        <w:rPr>
-          <w:rFonts w:ascii="Arial" w:hAnsi="Arial" w:cs="Arial"/>
-        </w:rPr>
-        <w:t>_brand</w:t>
-      </w:r>
-      <w:proofErr w:type="spellEnd"/>
-      <w:r>
-        <w:rPr>
-          <w:rFonts w:ascii="Arial" w:hAnsi="Arial" w:cs="Arial"/>
-        </w:rPr>
-        <w:t>}</w:t>
-      </w:r>
-    </w:p>
-    <w:p>
-      <w:pPr>
-        <w:ind w:left="1440" w:right="1440"/>
-        <w:rPr>
-          <w:rFonts w:ascii="Arial" w:hAnsi="Arial" w:cs="Arial"/>
-        </w:rPr>
-      </w:pPr>
-      <w:r>
-        <w:rPr>
-          <w:rFonts w:ascii="Arial" w:hAnsi="Arial" w:cs="Arial"/>
-        </w:rPr>
-        <w:t xml:space="preserve">  Make of Module</w:t>
-      </w:r>
-      <w:r>
-        <w:rPr>
-          <w:rFonts w:ascii="Arial" w:hAnsi="Arial" w:cs="Arial"/>
-        </w:rPr>
-        <w:t xml:space="preserve">              :</w:t>
-      </w:r>
-      <w:r>
-        <w:rPr>
-          <w:rFonts w:ascii="Arial" w:hAnsi="Arial" w:cs="Arial"/>
-        </w:rPr>
-        <w:tab/>
-        <w:t xml:space="preserve">  {</w:t>
-      </w:r>
-      <w:proofErr w:type="spellStart"/>
-      <w:r>
-        <w:rPr>
-          <w:rFonts w:ascii="Arial" w:hAnsi="Arial" w:cs="Arial"/>
-        </w:rPr>
-        <w:t>panel</w:t>
-      </w:r>
-      <w:r>
-        <w:rPr>
-          <w:rFonts w:ascii="Arial" w:hAnsi="Arial" w:cs="Arial"/>
-        </w:rPr>
-        <w:t>_brand</w:t>
-      </w:r>
-      <w:proofErr w:type="spellEnd"/>
-      <w:r>
-        <w:rPr>
-          <w:rFonts w:ascii="Arial" w:hAnsi="Arial" w:cs="Arial"/>
-        </w:rPr>
-        <w:t>}</w:t>
-      </w:r>
-    </w:p>
-    <w:p>
-      <w:pPr>
-        <w:ind w:left="1440" w:right="1440"/>
-        <w:rPr>
-          <w:rFonts w:ascii="Arial" w:hAnsi="Arial" w:cs="Arial"/>
-        </w:rPr>
-      </w:pPr>
-      <w:r>
-        <w:rPr>
-          <w:rFonts w:ascii="Arial" w:hAnsi="Arial" w:cs="Arial"/>
-        </w:rPr>
-        <w:t xml:space="preserve">  Number of </w:t>
-      </w:r>
-      <w:proofErr w:type="spellStart"/>
-      <w:r>
-        <w:rPr>
-          <w:rFonts w:ascii="Arial" w:hAnsi="Arial" w:cs="Arial"/>
-        </w:rPr>
-        <w:t>Earthing</w:t>
-      </w:r>
-      <w:proofErr w:type="spellEnd"/>
-      <w:r>
-        <w:rPr>
-          <w:rFonts w:ascii="Arial" w:hAnsi="Arial" w:cs="Arial"/>
-        </w:rPr>
-        <w:t xml:space="preserve">         : </w:t>
-      </w:r>
-      <w:r>
-        <w:rPr>
-          <w:rFonts w:ascii="Arial" w:hAnsi="Arial" w:cs="Arial"/>
-        </w:rPr>
-        <w:t xml:space="preserve">     </w:t>
-      </w:r>
-      <w:r>
-        <w:rPr>
-          <w:rFonts w:ascii="Arial" w:hAnsi="Arial" w:cs="Arial"/>
-        </w:rPr>
-        <w:t>3</w:t>
-      </w:r>
-    </w:p>
-    <w:p>
-      <w:pPr>
-        <w:ind w:left="1440" w:right="1440"/>
-        <w:rPr>
-          <w:rFonts w:ascii="Arial" w:hAnsi="Arial" w:cs="Arial"/>
-        </w:rPr>
-      </w:pPr>
-      <w:r>
-        <w:rPr>
-          <w:rFonts w:ascii="Arial" w:hAnsi="Arial" w:cs="Arial"/>
-        </w:rPr>
-        <w:t xml:space="preserve">  Surge Protection </w:t>
-      </w:r>
       <w:proofErr w:type="gramStart"/>
       <w:r>
         <w:rPr>
           <w:rFonts w:ascii="Arial" w:hAnsi="Arial" w:cs="Arial"/>
-        </w:rPr>
-        <w:t>Device :</w:t>
+          <w:sz w:val="24"/>
+          <w:szCs w:val="24"/>
+        </w:rPr>
+        <w:t>years</w:t>
       </w:r>
       <w:proofErr w:type="gramEnd"/>
       <w:r>
         <w:rPr>
           <w:rFonts w:ascii="Arial" w:hAnsi="Arial" w:cs="Arial"/>
-        </w:rPr>
-        <w:t xml:space="preserve">      </w:t>
-      </w:r>
-      <w:r>
-        <w:rPr>
-          <w:rFonts w:ascii="Arial" w:hAnsi="Arial" w:cs="Arial"/>
-        </w:rPr>
-        <w:t>Yes</w:t>
-      </w:r>
-    </w:p>
-    <w:p>
-      <w:pPr>
-        <w:ind w:left="1440" w:right="1440"/>
-        <w:rPr>
-          <w:rFonts w:ascii="Arial" w:hAnsi="Arial" w:cs="Arial"/>
-        </w:rPr>
-      </w:pPr>
-      <w:r>
-        <w:rPr>
-          <w:rFonts w:ascii="Arial" w:hAnsi="Arial" w:cs="Arial"/>
-        </w:rPr>
-        <w:t xml:space="preserve">We, </w:t>
-      </w:r>
-      <w:proofErr w:type="spellStart"/>
-      <w:r>
-        <w:rPr>
-          <w:rFonts w:ascii="Arial" w:hAnsi="Arial" w:cs="Arial"/>
-        </w:rPr>
-        <w:t>Mamta</w:t>
-      </w:r>
-      <w:proofErr w:type="spellEnd"/>
-      <w:r>
-        <w:rPr>
-          <w:rFonts w:ascii="Arial" w:hAnsi="Arial" w:cs="Arial"/>
-        </w:rPr>
-        <w:t xml:space="preserve"> Enterprises, </w:t>
-      </w:r>
-      <w:r>
-        <w:rPr>
-          <w:rFonts w:ascii="Arial" w:hAnsi="Arial" w:cs="Arial"/>
-        </w:rPr>
-        <w:t xml:space="preserve">near Bank of India, </w:t>
-      </w:r>
-      <w:proofErr w:type="spellStart"/>
-      <w:r>
-        <w:rPr>
-          <w:rFonts w:ascii="Arial" w:hAnsi="Arial" w:cs="Arial"/>
-        </w:rPr>
-        <w:t>Jind</w:t>
-      </w:r>
-      <w:proofErr w:type="spellEnd"/>
-      <w:r>
-        <w:rPr>
-          <w:rFonts w:ascii="Arial" w:hAnsi="Arial" w:cs="Arial"/>
-        </w:rPr>
-        <w:t xml:space="preserve"> Road, </w:t>
-      </w:r>
-      <w:r>
-        <w:rPr>
-          <w:rFonts w:ascii="Arial" w:hAnsi="Arial" w:cs="Arial"/>
-        </w:rPr>
-        <w:t>Kaithal, HR, certify that this system is installed as pe</w:t>
-      </w:r>
-      <w:r>
-        <w:rPr>
-          <w:rFonts w:ascii="Arial" w:hAnsi="Arial" w:cs="Arial"/>
-        </w:rPr>
-        <w:t>r MNRE guidelines and is safe (</w:t>
-      </w:r>
-      <w:r>
-        <w:rPr>
-          <w:rFonts w:ascii="Arial" w:hAnsi="Arial" w:cs="Arial"/>
-        </w:rPr>
-        <w:t xml:space="preserve">all the safety measures are being taken care </w:t>
-      </w:r>
-      <w:proofErr w:type="gramStart"/>
-      <w:r>
-        <w:rPr>
-          <w:rFonts w:ascii="Arial" w:hAnsi="Arial" w:cs="Arial"/>
-        </w:rPr>
-        <w:t>of )</w:t>
-      </w:r>
-      <w:proofErr w:type="gramEnd"/>
-      <w:r>
-        <w:rPr>
-          <w:rFonts w:ascii="Arial" w:hAnsi="Arial" w:cs="Arial"/>
-        </w:rPr>
-        <w:t>.</w:t>
-      </w:r>
-    </w:p>
-    <w:p>
-      <w:pPr>
-        <w:tabs>
-          <w:tab w:val="left" w:pos="4140"/>
-        </w:tabs>
-        <w:ind w:left="1440" w:right="1440"/>
-        <w:rPr>
-          <w:rFonts w:ascii="Arial" w:hAnsi="Arial" w:cs="Arial"/>
-        </w:rPr>
-      </w:pPr>
-      <w:r>
-        <w:rPr>
-          <w:rFonts w:ascii="Arial" w:hAnsi="Arial" w:cs="Arial"/>
-        </w:rPr>
-        <w:t>Thanking you</w:t>
-      </w:r>
-      <w:r>
-        <w:rPr>
-          <w:rFonts w:ascii="Arial" w:hAnsi="Arial" w:cs="Arial"/>
-        </w:rPr>
-        <w:t>.</w:t>
-      </w:r>
-    </w:p>
-    <w:p>
-      <w:pPr>
-        <w:ind w:left="1440" w:right="1440"/>
-        <w:rPr>
-          <w:rFonts w:ascii="Arial" w:hAnsi="Arial" w:cs="Arial"/>
-        </w:rPr>
-      </w:pPr>
-    </w:p>
-    <w:p>
-      <w:pPr>
-        <w:ind w:left="1440" w:right="1440"/>
-        <w:rPr>
-          <w:rFonts w:ascii="Arial" w:hAnsi="Arial" w:cs="Arial"/>
-        </w:rPr>
-      </w:pPr>
-      <w:r>
-        <w:rPr>
-          <w:rFonts w:ascii="Arial" w:hAnsi="Arial" w:cs="Arial"/>
-        </w:rPr>
-        <w:t>Yours truly,</w:t>
-      </w:r>
-    </w:p>
-    <w:p>
-      <w:pPr>
-        <w:ind w:left="1440" w:right="1440"/>
-        <w:rPr>
-          <w:rFonts w:ascii="Arial" w:hAnsi="Arial" w:cs="Arial"/>
-        </w:rPr>
-      </w:pPr>
-      <w:r>
-        <w:rPr>
-          <w:rFonts w:ascii="Arial" w:hAnsi="Arial" w:cs="Arial"/>
-        </w:rPr>
-        <w:t xml:space="preserve">For </w:t>
-      </w:r>
-      <w:proofErr w:type="spellStart"/>
-      <w:r>
-        <w:rPr>
-          <w:rFonts w:ascii="Arial" w:hAnsi="Arial" w:cs="Arial"/>
-        </w:rPr>
-        <w:t>Mamta</w:t>
-      </w:r>
-      <w:proofErr w:type="spellEnd"/>
-      <w:r>
-        <w:rPr>
-          <w:rFonts w:ascii="Arial" w:hAnsi="Arial" w:cs="Arial"/>
-        </w:rPr>
-        <w:t xml:space="preserve"> Enterprises</w:t>
-      </w:r>
-    </w:p>
-    <w:p>
-      <w:pPr>
-        <w:ind w:left="1440" w:right="1440"/>
-        <w:rPr>
-          <w:rFonts w:ascii="Arial" w:hAnsi="Arial" w:cs="Arial"/>
-        </w:rPr>
-      </w:pPr>
-    </w:p>
-    <w:p>
-      <w:pPr>
-        <w:ind w:left="1440" w:right="1440"/>
-        <w:rPr>
-          <w:rFonts w:ascii="Arial" w:hAnsi="Arial" w:cs="Arial"/>
-        </w:rPr>
-      </w:pPr>
-      <w:r>
-        <w:rPr>
-          <w:rFonts w:ascii="Arial" w:hAnsi="Arial" w:cs="Arial"/>
-        </w:rPr>
-        <w:t>Auth.</w:t>
-      </w:r>
-      <w:r>
-        <w:rPr>
-          <w:rFonts w:ascii="Arial" w:hAnsi="Arial" w:cs="Arial"/>
-        </w:rPr>
-        <w:t xml:space="preserve"> </w:t>
-      </w:r>
-      <w:r>
-        <w:rPr>
-          <w:rFonts w:ascii="Arial" w:hAnsi="Arial" w:cs="Arial"/>
-        </w:rPr>
-        <w:t>S</w:t>
-      </w:r>
-      <w:r>
-        <w:rPr>
-          <w:rFonts w:ascii="Arial" w:hAnsi="Arial" w:cs="Arial"/>
-        </w:rPr>
-        <w:t>ignatory</w:t>
-      </w:r>
-    </w:p>
-    <w:p>
-      <w:pPr>
-        <w:jc w:val="center"/>
-        <w:rPr>
-          <w:rFonts w:ascii="Arial" w:hAnsi="Arial" w:cs="Arial"/>
-        </w:rPr>
-      </w:pPr>
-      <w:r>
-        <w:rPr>
-          <w:rFonts w:ascii="Arial" w:hAnsi="Arial" w:cs="Arial"/>
-        </w:rPr>
-        <w:br w:type="page"/>
-      </w:r>
-    </w:p>
-    <w:p>
-      <w:pPr>
-        <w:jc w:val="center"/>
-        <w:rPr>
-          <w:rFonts w:ascii="Arial" w:hAnsi="Arial" w:cs="Arial"/>
-        </w:rPr>
-      </w:pPr>
-    </w:p>
-    <w:p>
-      <w:pPr>
-        <w:jc w:val="center"/>
-        <w:rPr>
-          <w:rFonts w:ascii="Arial" w:hAnsi="Arial" w:cs="Arial"/>
-        </w:rPr>
-      </w:pPr>
-    </w:p>
-    <w:p>
-      <w:pPr>
-        <w:jc w:val="center"/>
-        <w:rPr>
-          <w:rFonts w:ascii="Arial" w:hAnsi="Arial" w:cs="Arial"/>
-        </w:rPr>
-      </w:pPr>
-    </w:p>
-    <w:p>
-      <w:pPr>
-        <w:jc w:val="center"/>
-        <w:rPr>
-          <w:rFonts w:ascii="Arial" w:hAnsi="Arial" w:cs="Arial"/>
-        </w:rPr>
-      </w:pPr>
-    </w:p>
-    <w:p>
-      <w:pPr>
-        <w:jc w:val="center"/>
-        <w:rPr>
-          <w:rFonts w:ascii="Arial" w:hAnsi="Arial" w:cs="Arial"/>
-        </w:rPr>
-      </w:pPr>
-      <w:r>
-        <w:rPr>
-          <w:b/>
-          <w:sz w:val="28"/>
-          <w:szCs w:val="28"/>
-          <w:u w:val="single"/>
-        </w:rPr>
-        <w:t>Warranty/Guarantee and Declaration Certificate</w:t>
-      </w:r>
-    </w:p>
-    <w:p>
-      <w:pPr>
-        <w:ind w:left="1440" w:right="1440"/>
-        <w:rPr>
-          <w:rFonts w:ascii="Arial" w:hAnsi="Arial" w:cs="Arial"/>
-          <w:sz w:val="24"/>
-          <w:szCs w:val="24"/>
-        </w:rPr>
-      </w:pPr>
-      <w:r>
-        <w:rPr>
-          <w:rFonts w:ascii="Arial" w:hAnsi="Arial" w:cs="Arial"/>
-          <w:sz w:val="24"/>
-          <w:szCs w:val="24"/>
-        </w:rPr>
-        <w:t>It is Certified that the ON GRID SOLAR POWER PLANT of capacity</w:t>
-      </w:r>
-      <w:r>
-        <w:rPr>
-          <w:rFonts w:ascii="Arial" w:hAnsi="Arial" w:cs="Arial"/>
-          <w:sz w:val="24"/>
-          <w:szCs w:val="24"/>
-        </w:rPr>
-        <w:t xml:space="preserve"> </w:t>
-      </w:r>
-      <w:r>
-        <w:rPr>
-          <w:rFonts w:ascii="Arial" w:hAnsi="Arial" w:cs="Arial"/>
-        </w:rPr>
-        <w:t>{</w:t>
-      </w:r>
-      <w:proofErr w:type="spellStart"/>
-      <w:r>
-        <w:rPr>
-          <w:rFonts w:ascii="Arial" w:hAnsi="Arial" w:cs="Arial"/>
-        </w:rPr>
-        <w:t>net_solar_capacity</w:t>
-      </w:r>
-      <w:proofErr w:type="spellEnd"/>
-      <w:r>
-        <w:rPr>
-          <w:rFonts w:ascii="Arial" w:hAnsi="Arial" w:cs="Arial"/>
-        </w:rPr>
-        <w:t xml:space="preserve">} </w:t>
-      </w:r>
-      <w:r>
-        <w:rPr>
-          <w:rFonts w:ascii="Arial" w:hAnsi="Arial" w:cs="Arial"/>
-        </w:rPr>
-        <w:t>K</w:t>
-      </w:r>
-      <w:r>
-        <w:rPr>
-          <w:rFonts w:ascii="Arial" w:hAnsi="Arial" w:cs="Arial"/>
-        </w:rPr>
-        <w:t>W</w:t>
-      </w:r>
-      <w:r>
-        <w:rPr>
-          <w:rFonts w:ascii="Arial" w:hAnsi="Arial" w:cs="Arial"/>
-          <w:b/>
-          <w:sz w:val="24"/>
-          <w:szCs w:val="24"/>
-        </w:rPr>
-        <w:t xml:space="preserve"> </w:t>
-      </w:r>
-      <w:r>
-        <w:rPr>
-          <w:rFonts w:ascii="Arial" w:hAnsi="Arial" w:cs="Arial"/>
-          <w:sz w:val="24"/>
-          <w:szCs w:val="24"/>
-        </w:rPr>
-        <w:t xml:space="preserve">installed by </w:t>
-      </w:r>
-      <w:proofErr w:type="spellStart"/>
-      <w:r>
-        <w:rPr>
-          <w:rFonts w:ascii="Arial" w:hAnsi="Arial" w:cs="Arial"/>
-          <w:sz w:val="24"/>
-          <w:szCs w:val="24"/>
-        </w:rPr>
-        <w:t>Mamta</w:t>
-      </w:r>
-      <w:proofErr w:type="spellEnd"/>
-      <w:r>
-        <w:rPr>
-          <w:rFonts w:ascii="Arial" w:hAnsi="Arial" w:cs="Arial"/>
-          <w:sz w:val="24"/>
-          <w:szCs w:val="24"/>
-        </w:rPr>
-        <w:t xml:space="preserve"> Enterprises to </w:t>
-      </w:r>
-      <w:r>
-        <w:rPr>
-          <w:rFonts w:ascii="Arial" w:hAnsi="Arial" w:cs="Arial"/>
-          <w:sz w:val="24"/>
-          <w:szCs w:val="24"/>
-        </w:rPr>
-        <w:t>{</w:t>
-      </w:r>
-      <w:proofErr w:type="spellStart"/>
-      <w:r>
-        <w:rPr>
-          <w:rFonts w:ascii="Arial" w:hAnsi="Arial" w:cs="Arial"/>
-          <w:sz w:val="24"/>
-          <w:szCs w:val="24"/>
-        </w:rPr>
-        <w:t>consumer_name</w:t>
-      </w:r>
-      <w:proofErr w:type="spellEnd"/>
-      <w:r>
-        <w:rPr>
-          <w:rFonts w:ascii="Arial" w:hAnsi="Arial" w:cs="Arial"/>
-          <w:sz w:val="24"/>
-          <w:szCs w:val="24"/>
-        </w:rPr>
-        <w:t>}, {</w:t>
-      </w:r>
-      <w:proofErr w:type="spellStart"/>
-      <w:r>
-        <w:rPr>
-          <w:rFonts w:ascii="Arial" w:hAnsi="Arial" w:cs="Arial"/>
-          <w:sz w:val="24"/>
-          <w:szCs w:val="24"/>
-        </w:rPr>
-        <w:t>consumer_address</w:t>
-      </w:r>
-      <w:proofErr w:type="spellEnd"/>
-      <w:r>
-        <w:rPr>
-          <w:rFonts w:ascii="Arial" w:hAnsi="Arial" w:cs="Arial"/>
-          <w:sz w:val="24"/>
-          <w:szCs w:val="24"/>
-        </w:rPr>
-        <w:t>}, Invoice No. {</w:t>
-      </w:r>
-      <w:proofErr w:type="spellStart"/>
-      <w:r>
-        <w:rPr>
-          <w:rFonts w:ascii="Arial" w:hAnsi="Arial" w:cs="Arial"/>
-          <w:sz w:val="24"/>
-          <w:szCs w:val="24"/>
-        </w:rPr>
-        <w:t>invoice_number</w:t>
-      </w:r>
-      <w:proofErr w:type="spellEnd"/>
-      <w:r>
-        <w:rPr>
-          <w:rFonts w:ascii="Arial" w:hAnsi="Arial" w:cs="Arial"/>
-          <w:sz w:val="24"/>
-          <w:szCs w:val="24"/>
-        </w:rPr>
-        <w:t>}, Dated: {</w:t>
-      </w:r>
-      <w:proofErr w:type="spellStart"/>
-      <w:r>
-        <w:rPr>
-          <w:rFonts w:ascii="Arial" w:hAnsi="Arial" w:cs="Arial"/>
-          <w:sz w:val="24"/>
-          <w:szCs w:val="24"/>
-        </w:rPr>
-        <w:t>invoice_date</w:t>
-      </w:r>
-      <w:proofErr w:type="spellEnd"/>
-      <w:r>
-        <w:rPr>
-          <w:rFonts w:ascii="Arial" w:hAnsi="Arial" w:cs="Arial"/>
-          <w:sz w:val="24"/>
-          <w:szCs w:val="24"/>
-        </w:rPr>
-        <w:t>}</w:t>
-      </w:r>
-      <w:r>
-        <w:rPr>
-          <w:rFonts w:ascii="Arial" w:hAnsi="Arial" w:cs="Arial"/>
-          <w:sz w:val="24"/>
-          <w:szCs w:val="24"/>
-        </w:rPr>
-        <w:t>, is warranted for 1</w:t>
-      </w:r>
-      <w:r>
-        <w:rPr>
-          <w:rFonts w:ascii="Arial" w:hAnsi="Arial" w:cs="Arial"/>
-          <w:sz w:val="24"/>
-          <w:szCs w:val="24"/>
-        </w:rPr>
-        <w:t xml:space="preserve"> </w:t>
-      </w:r>
-      <w:proofErr w:type="gramStart"/>
-      <w:r>
-        <w:rPr>
-          <w:rFonts w:ascii="Arial" w:hAnsi="Arial" w:cs="Arial"/>
-          <w:sz w:val="24"/>
-          <w:szCs w:val="24"/>
-        </w:rPr>
-        <w:t>years</w:t>
-      </w:r>
-      <w:proofErr w:type="gramEnd"/>
-      <w:r>
-        <w:rPr>
-          <w:rFonts w:ascii="Arial" w:hAnsi="Arial" w:cs="Arial"/>
           <w:sz w:val="24"/>
           <w:szCs w:val="24"/>
         </w:rPr>
@@ -1091,7 +1109,7 @@
         <w:t xml:space="preserve"> 80% at the end of 25 years.</w:t>
       </w:r>
     </w:p>
-    <w:p>
+    <w:p xmlns:wp14="http://schemas.microsoft.com/office/word/2010/wordml" wp14:textId="77777777">
       <w:pPr>
         <w:ind w:left="1440" w:right="1440"/>
         <w:jc w:val="both"/>
@@ -1118,7 +1136,7 @@
         <w:t>grid Solar Power Plant installed is in compliance with the latest minimum.</w:t>
       </w:r>
     </w:p>
-    <w:p>
+    <w:p xmlns:wp14="http://schemas.microsoft.com/office/word/2010/wordml" wp14:textId="77777777">
       <w:pPr>
         <w:ind w:left="810" w:right="810"/>
         <w:rPr>
@@ -1142,7 +1160,7 @@
         <w:gridCol w:w="2520"/>
         <w:gridCol w:w="2803"/>
       </w:tblGrid>
-      <w:tr>
+      <w:tr xmlns:wp14="http://schemas.microsoft.com/office/word/2010/wordml" wp14:textId="77777777">
         <w:trPr>
           <w:trHeight w:val="419"/>
         </w:trPr>
@@ -1151,7 +1169,7 @@
             <w:tcW w:w="1563" w:type="dxa"/>
             <w:vAlign w:val="center"/>
           </w:tcPr>
-          <w:p>
+          <w:p wp14:textId="77777777">
             <w:pPr>
               <w:ind w:right="612"/>
               <w:rPr>
@@ -1201,7 +1219,7 @@
             <w:tcW w:w="1800" w:type="dxa"/>
             <w:vAlign w:val="center"/>
           </w:tcPr>
-          <w:p>
+          <w:p wp14:textId="77777777">
             <w:pPr>
               <w:ind w:right="810"/>
               <w:rPr>
@@ -1225,7 +1243,7 @@
             <w:tcW w:w="2520" w:type="dxa"/>
             <w:vAlign w:val="center"/>
           </w:tcPr>
-          <w:p>
+          <w:p wp14:textId="77777777">
             <w:pPr>
               <w:ind w:right="810"/>
               <w:rPr>
@@ -1249,7 +1267,7 @@
             <w:tcW w:w="2803" w:type="dxa"/>
             <w:vAlign w:val="center"/>
           </w:tcPr>
-          <w:p>
+          <w:p wp14:textId="77777777">
             <w:pPr>
               <w:ind w:right="585"/>
               <w:rPr>
@@ -1269,7 +1287,7 @@
           </w:p>
         </w:tc>
       </w:tr>
-      <w:tr>
+      <w:tr xmlns:wp14="http://schemas.microsoft.com/office/word/2010/wordml" wp14:textId="77777777">
         <w:trPr>
           <w:trHeight w:val="567"/>
         </w:trPr>
@@ -1278,7 +1296,7 @@
             <w:tcW w:w="1563" w:type="dxa"/>
             <w:vAlign w:val="center"/>
           </w:tcPr>
-          <w:p>
+          <w:p wp14:textId="77777777">
             <w:pPr>
               <w:ind w:right="612"/>
               <w:rPr>
@@ -1302,7 +1320,7 @@
             <w:tcW w:w="1800" w:type="dxa"/>
             <w:vAlign w:val="center"/>
           </w:tcPr>
-          <w:p>
+          <w:p wp14:textId="77777777">
             <w:pPr>
               <w:ind w:right="810"/>
               <w:rPr>
@@ -1326,7 +1344,7 @@
             <w:tcW w:w="2520" w:type="dxa"/>
             <w:vAlign w:val="center"/>
           </w:tcPr>
-          <w:p>
+          <w:p wp14:textId="77777777">
             <w:pPr>
               <w:ind w:right="-18"/>
               <w:rPr>
@@ -1376,7 +1394,7 @@
             <w:tcW w:w="2803" w:type="dxa"/>
             <w:vAlign w:val="center"/>
           </w:tcPr>
-          <w:p>
+          <w:p wp14:textId="77777777">
             <w:pPr>
               <w:spacing w:before="240"/>
               <w:ind w:right="-95"/>
@@ -1415,7 +1433,7 @@
           </w:p>
         </w:tc>
       </w:tr>
-      <w:tr>
+      <w:tr xmlns:wp14="http://schemas.microsoft.com/office/word/2010/wordml" wp14:textId="77777777">
         <w:trPr>
           <w:trHeight w:val="808"/>
         </w:trPr>
@@ -1424,7 +1442,7 @@
             <w:tcW w:w="1563" w:type="dxa"/>
             <w:vAlign w:val="center"/>
           </w:tcPr>
-          <w:p>
+          <w:p wp14:textId="77777777">
             <w:pPr>
               <w:ind w:right="612"/>
               <w:rPr>
@@ -1448,7 +1466,7 @@
             <w:tcW w:w="1800" w:type="dxa"/>
             <w:vAlign w:val="center"/>
           </w:tcPr>
-          <w:p>
+          <w:p wp14:textId="77777777">
             <w:pPr>
               <w:ind w:right="810"/>
               <w:rPr>
@@ -1472,7 +1490,7 @@
             <w:tcW w:w="2520" w:type="dxa"/>
             <w:vAlign w:val="center"/>
           </w:tcPr>
-          <w:p>
+          <w:p wp14:textId="77777777">
             <w:pPr>
               <w:ind w:right="810"/>
               <w:rPr>
@@ -1514,7 +1532,7 @@
             <w:tcW w:w="2803" w:type="dxa"/>
             <w:vAlign w:val="center"/>
           </w:tcPr>
-          <w:p>
+          <w:p wp14:textId="77777777">
             <w:pPr>
               <w:ind w:right="-5"/>
               <w:rPr>
@@ -1553,7 +1571,7 @@
         </w:tc>
       </w:tr>
     </w:tbl>
-    <w:p>
+    <w:p xmlns:wp14="http://schemas.microsoft.com/office/word/2010/wordml" wp14:textId="77777777">
       <w:pPr>
         <w:ind w:right="810"/>
         <w:rPr>
@@ -1573,7 +1591,7 @@
         <w:t xml:space="preserve">                           </w:t>
       </w:r>
     </w:p>
-    <w:p>
+    <w:p xmlns:wp14="http://schemas.microsoft.com/office/word/2010/wordml" wp14:textId="77777777">
       <w:pPr>
         <w:ind w:left="1350" w:right="810"/>
         <w:rPr>
@@ -1613,7 +1631,7 @@
         <w:t xml:space="preserve"> Enterprises</w:t>
       </w:r>
     </w:p>
-    <w:p>
+    <w:p xmlns:wp14="http://schemas.microsoft.com/office/word/2010/wordml" wp14:textId="77777777">
       <w:pPr>
         <w:ind w:left="1350" w:right="810"/>
         <w:rPr>
@@ -1624,7 +1642,7 @@
         </w:rPr>
       </w:pPr>
     </w:p>
-    <w:p>
+    <w:p xmlns:wp14="http://schemas.microsoft.com/office/word/2010/wordml" wp14:textId="77777777">
       <w:pPr>
         <w:ind w:left="1350" w:right="810"/>
         <w:rPr>
@@ -1642,7 +1660,7 @@
         <w:t>Signature</w:t>
       </w:r>
     </w:p>
-    <w:p>
+    <w:p xmlns:wp14="http://schemas.microsoft.com/office/word/2010/wordml" wp14:textId="77777777">
       <w:pPr>
         <w:jc w:val="center"/>
         <w:rPr>
@@ -1660,7 +1678,7 @@
         <w:br w:type="page"/>
       </w:r>
     </w:p>
-    <w:p>
+    <w:p xmlns:wp14="http://schemas.microsoft.com/office/word/2010/wordml" wp14:textId="77777777">
       <w:pPr>
         <w:jc w:val="center"/>
         <w:rPr>
@@ -1670,7 +1688,7 @@
         </w:rPr>
       </w:pPr>
     </w:p>
-    <w:p>
+    <w:p xmlns:wp14="http://schemas.microsoft.com/office/word/2010/wordml" wp14:textId="77777777">
       <w:pPr>
         <w:jc w:val="center"/>
         <w:rPr>
@@ -1680,7 +1698,7 @@
         </w:rPr>
       </w:pPr>
     </w:p>
-    <w:p>
+    <w:p xmlns:wp14="http://schemas.microsoft.com/office/word/2010/wordml" wp14:textId="77777777">
       <w:pPr>
         <w:jc w:val="center"/>
         <w:rPr>
@@ -1690,7 +1708,7 @@
         </w:rPr>
       </w:pPr>
     </w:p>
-    <w:p>
+    <w:p xmlns:wp14="http://schemas.microsoft.com/office/word/2010/wordml" wp14:textId="77777777">
       <w:pPr>
         <w:jc w:val="center"/>
         <w:rPr>
@@ -1700,7 +1718,7 @@
         </w:rPr>
       </w:pPr>
     </w:p>
-    <w:p>
+    <w:p xmlns:wp14="http://schemas.microsoft.com/office/word/2010/wordml" wp14:textId="77777777">
       <w:pPr>
         <w:jc w:val="center"/>
         <w:rPr>
@@ -1730,7 +1748,7 @@
         <w:t xml:space="preserve"> &amp; List of Polycrystalline Silicon Photovoltaic Modules</w:t>
       </w:r>
     </w:p>
-    <w:p>
+    <w:p xmlns:wp14="http://schemas.microsoft.com/office/word/2010/wordml" wp14:textId="77777777">
       <w:pPr>
         <w:ind w:left="1440" w:right="1440"/>
         <w:jc w:val="center"/>
@@ -1747,7 +1765,7 @@
         <w:t>TO WHOMSOEVER IT MAY CONCERN</w:t>
       </w:r>
     </w:p>
-    <w:p>
+    <w:p xmlns:wp14="http://schemas.microsoft.com/office/word/2010/wordml" wp14:textId="77777777">
       <w:pPr>
         <w:ind w:left="1440" w:right="1440"/>
         <w:rPr>
@@ -1901,7 +1919,7 @@
         <w:t>}. It is also certified that all modulus are indigenous / manufactured in INDIA.</w:t>
       </w:r>
     </w:p>
-    <w:p>
+    <w:p xmlns:wp14="http://schemas.microsoft.com/office/word/2010/wordml" wp14:textId="77777777">
       <w:pPr>
         <w:ind w:left="1440" w:right="1440"/>
         <w:rPr>
@@ -1993,6 +2011,13 @@
           <w:szCs w:val="20"/>
         </w:rPr>
         <w:softHyphen/>
+      </w:r>
+      <w:r>
+        <w:rPr>
+          <w:rFonts w:ascii="Arial" w:hAnsi="Arial" w:cs="Arial"/>
+          <w:sz w:val="20"/>
+          <w:szCs w:val="20"/>
+        </w:rPr>
         <w:t xml:space="preserve"> </w:t>
       </w:r>
       <w:r>
@@ -2049,7 +2074,7 @@
         <w:gridCol w:w="4590"/>
         <w:gridCol w:w="4680"/>
       </w:tblGrid>
-      <w:tr>
+      <w:tr xmlns:wp14="http://schemas.microsoft.com/office/word/2010/wordml" wp14:textId="77777777">
         <w:trPr>
           <w:trHeight w:val="405"/>
         </w:trPr>
@@ -2058,7 +2083,7 @@
             <w:tcW w:w="4590" w:type="dxa"/>
             <w:vAlign w:val="center"/>
           </w:tcPr>
-          <w:p>
+          <w:p wp14:textId="77777777">
             <w:pPr>
               <w:jc w:val="center"/>
               <w:rPr>
@@ -2080,7 +2105,7 @@
             <w:tcW w:w="4680" w:type="dxa"/>
             <w:vAlign w:val="center"/>
           </w:tcPr>
-          <w:p>
+          <w:p wp14:textId="77777777">
             <w:pPr>
               <w:jc w:val="center"/>
               <w:rPr>
@@ -2098,7 +2123,7 @@
           </w:p>
         </w:tc>
       </w:tr>
-      <w:tr>
+      <w:tr xmlns:wp14="http://schemas.microsoft.com/office/word/2010/wordml" wp14:textId="77777777">
         <w:trPr>
           <w:trHeight w:val="405"/>
         </w:trPr>
@@ -2107,7 +2132,7 @@
             <w:tcW w:w="4590" w:type="dxa"/>
             <w:vAlign w:val="center"/>
           </w:tcPr>
-          <w:p>
+          <w:p wp14:textId="77777777">
             <w:pPr>
               <w:jc w:val="center"/>
               <w:rPr>
@@ -2129,7 +2154,7 @@
             <w:tcW w:w="4680" w:type="dxa"/>
             <w:vAlign w:val="center"/>
           </w:tcPr>
-          <w:p>
+          <w:p wp14:textId="77777777">
             <w:pPr>
               <w:jc w:val="center"/>
               <w:rPr>
@@ -2147,7 +2172,7 @@
           </w:p>
         </w:tc>
       </w:tr>
-      <w:tr>
+      <w:tr xmlns:wp14="http://schemas.microsoft.com/office/word/2010/wordml" wp14:textId="77777777">
         <w:trPr>
           <w:trHeight w:val="405"/>
         </w:trPr>
@@ -2156,7 +2181,7 @@
             <w:tcW w:w="4590" w:type="dxa"/>
             <w:vAlign w:val="center"/>
           </w:tcPr>
-          <w:p>
+          <w:p wp14:textId="77777777">
             <w:pPr>
               <w:jc w:val="center"/>
               <w:rPr>
@@ -2178,7 +2203,7 @@
             <w:tcW w:w="4680" w:type="dxa"/>
             <w:vAlign w:val="center"/>
           </w:tcPr>
-          <w:p>
+          <w:p wp14:textId="77777777">
             <w:pPr>
               <w:jc w:val="center"/>
               <w:rPr>
@@ -2196,7 +2221,7 @@
           </w:p>
         </w:tc>
       </w:tr>
-      <w:tr>
+      <w:tr xmlns:wp14="http://schemas.microsoft.com/office/word/2010/wordml" wp14:textId="77777777">
         <w:trPr>
           <w:trHeight w:val="405"/>
         </w:trPr>
@@ -2205,7 +2230,7 @@
             <w:tcW w:w="4590" w:type="dxa"/>
             <w:vAlign w:val="center"/>
           </w:tcPr>
-          <w:p>
+          <w:p wp14:textId="77777777">
             <w:pPr>
               <w:jc w:val="center"/>
               <w:rPr>
@@ -2227,7 +2252,7 @@
             <w:tcW w:w="4680" w:type="dxa"/>
             <w:vAlign w:val="center"/>
           </w:tcPr>
-          <w:p>
+          <w:p wp14:textId="77777777">
             <w:pPr>
               <w:jc w:val="center"/>
               <w:rPr>
@@ -2245,7 +2270,7 @@
           </w:p>
         </w:tc>
       </w:tr>
-      <w:tr>
+      <w:tr xmlns:wp14="http://schemas.microsoft.com/office/word/2010/wordml" wp14:textId="77777777">
         <w:trPr>
           <w:trHeight w:val="405"/>
         </w:trPr>
@@ -2254,7 +2279,7 @@
             <w:tcW w:w="4590" w:type="dxa"/>
             <w:vAlign w:val="center"/>
           </w:tcPr>
-          <w:p>
+          <w:p wp14:textId="77777777">
             <w:pPr>
               <w:jc w:val="center"/>
               <w:rPr>
@@ -2276,7 +2301,7 @@
             <w:tcW w:w="4680" w:type="dxa"/>
             <w:vAlign w:val="center"/>
           </w:tcPr>
-          <w:p>
+          <w:p wp14:textId="77777777">
             <w:pPr>
               <w:jc w:val="center"/>
               <w:rPr>
@@ -2294,7 +2319,7 @@
           </w:p>
         </w:tc>
       </w:tr>
-      <w:tr>
+      <w:tr xmlns:wp14="http://schemas.microsoft.com/office/word/2010/wordml" wp14:textId="77777777">
         <w:trPr>
           <w:trHeight w:val="405"/>
         </w:trPr>
@@ -2303,7 +2328,7 @@
             <w:tcW w:w="4590" w:type="dxa"/>
             <w:vAlign w:val="center"/>
           </w:tcPr>
-          <w:p>
+          <w:p wp14:textId="77777777">
             <w:pPr>
               <w:jc w:val="center"/>
               <w:rPr>
@@ -2325,7 +2350,7 @@
             <w:tcW w:w="4680" w:type="dxa"/>
             <w:vAlign w:val="center"/>
           </w:tcPr>
-          <w:p>
+          <w:p wp14:textId="77777777">
             <w:pPr>
               <w:jc w:val="center"/>
               <w:rPr>
@@ -2343,7 +2368,7 @@
           </w:p>
         </w:tc>
       </w:tr>
-      <w:tr>
+      <w:tr xmlns:wp14="http://schemas.microsoft.com/office/word/2010/wordml" wp14:textId="77777777">
         <w:trPr>
           <w:trHeight w:val="405"/>
         </w:trPr>
@@ -2352,7 +2377,7 @@
             <w:tcW w:w="4590" w:type="dxa"/>
             <w:vAlign w:val="center"/>
           </w:tcPr>
-          <w:p>
+          <w:p wp14:textId="77777777">
             <w:pPr>
               <w:jc w:val="center"/>
               <w:rPr>
@@ -2374,7 +2399,7 @@
             <w:tcW w:w="4680" w:type="dxa"/>
             <w:vAlign w:val="center"/>
           </w:tcPr>
-          <w:p>
+          <w:p wp14:textId="77777777">
             <w:pPr>
               <w:jc w:val="center"/>
               <w:rPr>
@@ -2392,7 +2417,7 @@
           </w:p>
         </w:tc>
       </w:tr>
-      <w:tr>
+      <w:tr xmlns:wp14="http://schemas.microsoft.com/office/word/2010/wordml" wp14:textId="77777777">
         <w:trPr>
           <w:trHeight w:val="405"/>
         </w:trPr>
@@ -2401,7 +2426,7 @@
             <w:tcW w:w="4590" w:type="dxa"/>
             <w:vAlign w:val="center"/>
           </w:tcPr>
-          <w:p>
+          <w:p wp14:textId="77777777">
             <w:pPr>
               <w:jc w:val="center"/>
               <w:rPr>
@@ -2423,7 +2448,7 @@
             <w:tcW w:w="4680" w:type="dxa"/>
             <w:vAlign w:val="center"/>
           </w:tcPr>
-          <w:p>
+          <w:p wp14:textId="77777777">
             <w:pPr>
               <w:jc w:val="center"/>
               <w:rPr>
@@ -2441,7 +2466,7 @@
           </w:p>
         </w:tc>
       </w:tr>
-      <w:tr>
+      <w:tr xmlns:wp14="http://schemas.microsoft.com/office/word/2010/wordml" wp14:textId="77777777">
         <w:trPr>
           <w:trHeight w:val="405"/>
         </w:trPr>
@@ -2450,7 +2475,7 @@
             <w:tcW w:w="4590" w:type="dxa"/>
             <w:vAlign w:val="center"/>
           </w:tcPr>
-          <w:p>
+          <w:p wp14:textId="77777777">
             <w:pPr>
               <w:jc w:val="center"/>
               <w:rPr>
@@ -2472,7 +2497,7 @@
             <w:tcW w:w="4680" w:type="dxa"/>
             <w:vAlign w:val="center"/>
           </w:tcPr>
-          <w:p>
+          <w:p wp14:textId="77777777">
             <w:pPr>
               <w:jc w:val="center"/>
               <w:rPr>
@@ -2490,7 +2515,7 @@
           </w:p>
         </w:tc>
       </w:tr>
-      <w:tr>
+      <w:tr xmlns:wp14="http://schemas.microsoft.com/office/word/2010/wordml" wp14:textId="77777777">
         <w:trPr>
           <w:trHeight w:val="425"/>
         </w:trPr>
@@ -2499,7 +2524,7 @@
             <w:tcW w:w="4590" w:type="dxa"/>
             <w:vAlign w:val="center"/>
           </w:tcPr>
-          <w:p>
+          <w:p wp14:textId="77777777">
             <w:pPr>
               <w:jc w:val="center"/>
               <w:rPr>
@@ -2521,7 +2546,7 @@
             <w:tcW w:w="4680" w:type="dxa"/>
             <w:vAlign w:val="center"/>
           </w:tcPr>
-          <w:p>
+          <w:p wp14:textId="77777777">
             <w:pPr>
               <w:jc w:val="center"/>
               <w:rPr>
@@ -2539,7 +2564,7 @@
           </w:p>
         </w:tc>
       </w:tr>
-      <w:tr>
+      <w:tr xmlns:wp14="http://schemas.microsoft.com/office/word/2010/wordml" wp14:textId="77777777">
         <w:trPr>
           <w:trHeight w:val="425"/>
         </w:trPr>
@@ -2548,7 +2573,7 @@
             <w:tcW w:w="4590" w:type="dxa"/>
             <w:vAlign w:val="center"/>
           </w:tcPr>
-          <w:p>
+          <w:p wp14:textId="77777777">
             <w:pPr>
               <w:jc w:val="center"/>
               <w:rPr>
@@ -2570,7 +2595,7 @@
             <w:tcW w:w="4680" w:type="dxa"/>
             <w:vAlign w:val="center"/>
           </w:tcPr>
-          <w:p>
+          <w:p wp14:textId="77777777">
             <w:pPr>
               <w:jc w:val="center"/>
               <w:rPr>
@@ -2588,7 +2613,7 @@
           </w:p>
         </w:tc>
       </w:tr>
-      <w:tr>
+      <w:tr xmlns:wp14="http://schemas.microsoft.com/office/word/2010/wordml" wp14:textId="77777777">
         <w:trPr>
           <w:trHeight w:val="425"/>
         </w:trPr>
@@ -2597,7 +2622,7 @@
             <w:tcW w:w="4590" w:type="dxa"/>
             <w:vAlign w:val="center"/>
           </w:tcPr>
-          <w:p>
+          <w:p wp14:textId="77777777">
             <w:pPr>
               <w:jc w:val="center"/>
               <w:rPr>
@@ -2619,7 +2644,7 @@
             <w:tcW w:w="4680" w:type="dxa"/>
             <w:vAlign w:val="center"/>
           </w:tcPr>
-          <w:p>
+          <w:p wp14:textId="77777777">
             <w:pPr>
               <w:jc w:val="center"/>
               <w:rPr>
@@ -2638,15 +2663,15 @@
         </w:tc>
       </w:tr>
     </w:tbl>
-    <w:p>
-      <w:pPr>
-        <w:rPr>
-          <w:sz w:val="20"/>
-          <w:szCs w:val="20"/>
-        </w:rPr>
-      </w:pPr>
-    </w:p>
-    <w:p>
+    <w:p xmlns:wp14="http://schemas.microsoft.com/office/word/2010/wordml" wp14:textId="77777777">
+      <w:pPr>
+        <w:rPr>
+          <w:sz w:val="20"/>
+          <w:szCs w:val="20"/>
+        </w:rPr>
+      </w:pPr>
+    </w:p>
+    <w:p xmlns:wp14="http://schemas.microsoft.com/office/word/2010/wordml" wp14:textId="77777777">
       <w:pPr>
         <w:rPr>
           <w:b/>
@@ -2696,7 +2721,7 @@
         <w:t xml:space="preserve"> Enterprises</w:t>
       </w:r>
     </w:p>
-    <w:p>
+    <w:p xmlns:wp14="http://schemas.microsoft.com/office/word/2010/wordml" wp14:textId="77777777">
       <w:pPr>
         <w:rPr>
           <w:b/>
@@ -2705,7 +2730,7 @@
         </w:rPr>
       </w:pPr>
     </w:p>
-    <w:p>
+    <w:p xmlns:wp14="http://schemas.microsoft.com/office/word/2010/wordml" wp14:textId="77777777">
       <w:pPr>
         <w:ind w:left="720" w:firstLine="720"/>
         <w:rPr>
@@ -2722,7 +2747,7 @@
       </w:r>
     </w:p>
     <w:sectPr>
-      <w:pgSz w:w="12240" w:h="15840"/>
+      <w:pgSz w:w="12240" w:h="15840" w:orient="portrait"/>
       <w:pgMar w:top="0" w:right="0" w:bottom="0" w:left="0" w:header="720" w:footer="720" w:gutter="0"/>
       <w:cols w:space="720"/>
       <w:docGrid w:linePitch="360"/>
@@ -2746,7 +2771,7 @@
         <w:ind w:left="720" w:hanging="360"/>
       </w:pPr>
       <w:rPr>
-        <w:rFonts w:ascii="Symbol" w:hAnsi="Symbol" w:hint="default"/>
+        <w:rFonts w:hint="default" w:ascii="Symbol" w:hAnsi="Symbol"/>
       </w:rPr>
     </w:lvl>
     <w:lvl w:ilvl="1" w:tplc="04090003" w:tentative="1">
@@ -2758,7 +2783,7 @@
         <w:ind w:left="1440" w:hanging="360"/>
       </w:pPr>
       <w:rPr>
-        <w:rFonts w:ascii="Courier New" w:hAnsi="Courier New" w:cs="Courier New" w:hint="default"/>
+        <w:rFonts w:hint="default" w:ascii="Courier New" w:hAnsi="Courier New" w:cs="Courier New"/>
       </w:rPr>
     </w:lvl>
     <w:lvl w:ilvl="2" w:tplc="04090005" w:tentative="1">
@@ -2770,7 +2795,7 @@
         <w:ind w:left="2160" w:hanging="360"/>
       </w:pPr>
       <w:rPr>
-        <w:rFonts w:ascii="Wingdings" w:hAnsi="Wingdings" w:hint="default"/>
+        <w:rFonts w:hint="default" w:ascii="Wingdings" w:hAnsi="Wingdings"/>
       </w:rPr>
     </w:lvl>
     <w:lvl w:ilvl="3" w:tplc="04090001" w:tentative="1">
@@ -2782,7 +2807,7 @@
         <w:ind w:left="2880" w:hanging="360"/>
       </w:pPr>
       <w:rPr>
-        <w:rFonts w:ascii="Symbol" w:hAnsi="Symbol" w:hint="default"/>
+        <w:rFonts w:hint="default" w:ascii="Symbol" w:hAnsi="Symbol"/>
       </w:rPr>
     </w:lvl>
     <w:lvl w:ilvl="4" w:tplc="04090003" w:tentative="1">
@@ -2794,7 +2819,7 @@
         <w:ind w:left="3600" w:hanging="360"/>
       </w:pPr>
       <w:rPr>
-        <w:rFonts w:ascii="Courier New" w:hAnsi="Courier New" w:cs="Courier New" w:hint="default"/>
+        <w:rFonts w:hint="default" w:ascii="Courier New" w:hAnsi="Courier New" w:cs="Courier New"/>
       </w:rPr>
     </w:lvl>
     <w:lvl w:ilvl="5" w:tplc="04090005" w:tentative="1">
@@ -2806,7 +2831,7 @@
         <w:ind w:left="4320" w:hanging="360"/>
       </w:pPr>
       <w:rPr>
-        <w:rFonts w:ascii="Wingdings" w:hAnsi="Wingdings" w:hint="default"/>
+        <w:rFonts w:hint="default" w:ascii="Wingdings" w:hAnsi="Wingdings"/>
       </w:rPr>
     </w:lvl>
     <w:lvl w:ilvl="6" w:tplc="04090001" w:tentative="1">
@@ -2818,7 +2843,7 @@
         <w:ind w:left="5040" w:hanging="360"/>
       </w:pPr>
       <w:rPr>
-        <w:rFonts w:ascii="Symbol" w:hAnsi="Symbol" w:hint="default"/>
+        <w:rFonts w:hint="default" w:ascii="Symbol" w:hAnsi="Symbol"/>
       </w:rPr>
     </w:lvl>
     <w:lvl w:ilvl="7" w:tplc="04090003" w:tentative="1">
@@ -2830,7 +2855,7 @@
         <w:ind w:left="5760" w:hanging="360"/>
       </w:pPr>
       <w:rPr>
-        <w:rFonts w:ascii="Courier New" w:hAnsi="Courier New" w:cs="Courier New" w:hint="default"/>
+        <w:rFonts w:hint="default" w:ascii="Courier New" w:hAnsi="Courier New" w:cs="Courier New"/>
       </w:rPr>
     </w:lvl>
     <w:lvl w:ilvl="8" w:tplc="04090005" w:tentative="1">
@@ -2842,7 +2867,7 @@
         <w:ind w:left="6480" w:hanging="360"/>
       </w:pPr>
       <w:rPr>
-        <w:rFonts w:ascii="Wingdings" w:hAnsi="Wingdings" w:hint="default"/>
+        <w:rFonts w:hint="default" w:ascii="Wingdings" w:hAnsi="Wingdings"/>
       </w:rPr>
     </w:lvl>
   </w:abstractNum>
@@ -2859,7 +2884,7 @@
         <w:ind w:left="720" w:hanging="360"/>
       </w:pPr>
       <w:rPr>
-        <w:rFonts w:ascii="Symbol" w:hAnsi="Symbol" w:hint="default"/>
+        <w:rFonts w:hint="default" w:ascii="Symbol" w:hAnsi="Symbol"/>
       </w:rPr>
     </w:lvl>
     <w:lvl w:ilvl="1" w:tplc="04090003" w:tentative="1">
@@ -2871,7 +2896,7 @@
         <w:ind w:left="1440" w:hanging="360"/>
       </w:pPr>
       <w:rPr>
-        <w:rFonts w:ascii="Courier New" w:hAnsi="Courier New" w:cs="Courier New" w:hint="default"/>
+        <w:rFonts w:hint="default" w:ascii="Courier New" w:hAnsi="Courier New" w:cs="Courier New"/>
       </w:rPr>
     </w:lvl>
     <w:lvl w:ilvl="2" w:tplc="04090005" w:tentative="1">
@@ -2883,7 +2908,7 @@
         <w:ind w:left="2160" w:hanging="360"/>
       </w:pPr>
       <w:rPr>
-        <w:rFonts w:ascii="Wingdings" w:hAnsi="Wingdings" w:hint="default"/>
+        <w:rFonts w:hint="default" w:ascii="Wingdings" w:hAnsi="Wingdings"/>
       </w:rPr>
     </w:lvl>
     <w:lvl w:ilvl="3" w:tplc="04090001" w:tentative="1">
@@ -2895,7 +2920,7 @@
         <w:ind w:left="2880" w:hanging="360"/>
       </w:pPr>
       <w:rPr>
-        <w:rFonts w:ascii="Symbol" w:hAnsi="Symbol" w:hint="default"/>
+        <w:rFonts w:hint="default" w:ascii="Symbol" w:hAnsi="Symbol"/>
       </w:rPr>
     </w:lvl>
     <w:lvl w:ilvl="4" w:tplc="04090003" w:tentative="1">
@@ -2907,7 +2932,7 @@
         <w:ind w:left="3600" w:hanging="360"/>
       </w:pPr>
       <w:rPr>
-        <w:rFonts w:ascii="Courier New" w:hAnsi="Courier New" w:cs="Courier New" w:hint="default"/>
+        <w:rFonts w:hint="default" w:ascii="Courier New" w:hAnsi="Courier New" w:cs="Courier New"/>
       </w:rPr>
     </w:lvl>
     <w:lvl w:ilvl="5" w:tplc="04090005" w:tentative="1">
@@ -2919,7 +2944,7 @@
         <w:ind w:left="4320" w:hanging="360"/>
       </w:pPr>
       <w:rPr>
-        <w:rFonts w:ascii="Wingdings" w:hAnsi="Wingdings" w:hint="default"/>
+        <w:rFonts w:hint="default" w:ascii="Wingdings" w:hAnsi="Wingdings"/>
       </w:rPr>
     </w:lvl>
     <w:lvl w:ilvl="6" w:tplc="04090001" w:tentative="1">
@@ -2931,7 +2956,7 @@
         <w:ind w:left="5040" w:hanging="360"/>
       </w:pPr>
       <w:rPr>
-        <w:rFonts w:ascii="Symbol" w:hAnsi="Symbol" w:hint="default"/>
+        <w:rFonts w:hint="default" w:ascii="Symbol" w:hAnsi="Symbol"/>
       </w:rPr>
     </w:lvl>
     <w:lvl w:ilvl="7" w:tplc="04090003" w:tentative="1">
@@ -2943,7 +2968,7 @@
         <w:ind w:left="5760" w:hanging="360"/>
       </w:pPr>
       <w:rPr>
-        <w:rFonts w:ascii="Courier New" w:hAnsi="Courier New" w:cs="Courier New" w:hint="default"/>
+        <w:rFonts w:hint="default" w:ascii="Courier New" w:hAnsi="Courier New" w:cs="Courier New"/>
       </w:rPr>
     </w:lvl>
     <w:lvl w:ilvl="8" w:tplc="04090005" w:tentative="1">
@@ -2955,7 +2980,7 @@
         <w:ind w:left="6480" w:hanging="360"/>
       </w:pPr>
       <w:rPr>
-        <w:rFonts w:ascii="Wingdings" w:hAnsi="Wingdings" w:hint="default"/>
+        <w:rFonts w:hint="default" w:ascii="Wingdings" w:hAnsi="Wingdings"/>
       </w:rPr>
     </w:lvl>
   </w:abstractNum>
@@ -2969,11 +2994,11 @@
 </file>
 
 <file path=word/styles.xml><?xml version="1.0" encoding="utf-8"?>
-<w:styles xmlns:r="http://schemas.openxmlformats.org/officeDocument/2006/relationships" xmlns:w="http://schemas.openxmlformats.org/wordprocessingml/2006/main">
+<w:styles xmlns:w14="http://schemas.microsoft.com/office/word/2010/wordml" xmlns:wp14="http://schemas.microsoft.com/office/word/2010/wordprocessingDrawing" xmlns:r="http://schemas.openxmlformats.org/officeDocument/2006/relationships" xmlns:w="http://schemas.openxmlformats.org/wordprocessingml/2006/main" xmlns:mc="http://schemas.openxmlformats.org/markup-compatibility/2006" mc:Ignorable="w14 wp14">
   <w:docDefaults>
     <w:rPrDefault>
       <w:rPr>
-        <w:rFonts w:asciiTheme="minorHAnsi" w:eastAsiaTheme="minorEastAsia" w:hAnsiTheme="minorHAnsi" w:cstheme="minorBidi"/>
+        <w:rFonts w:asciiTheme="minorHAnsi" w:hAnsiTheme="minorHAnsi" w:eastAsiaTheme="minorEastAsia" w:cstheme="minorBidi"/>
         <w:sz w:val="22"/>
         <w:szCs w:val="22"/>
         <w:lang w:val="en-US" w:eastAsia="en-US" w:bidi="ar-SA"/>
@@ -2986,8 +3011,8 @@
     </w:pPrDefault>
   </w:docDefaults>
   <w:latentStyles w:defLockedState="0" w:defUIPriority="99" w:defSemiHidden="1" w:defUnhideWhenUsed="1" w:defQFormat="0" w:count="267">
-    <w:lsdException w:name="Normal" w:semiHidden="0" w:uiPriority="0" w:unhideWhenUsed="0" w:qFormat="1"/>
-    <w:lsdException w:name="heading 1" w:semiHidden="0" w:uiPriority="9" w:unhideWhenUsed="0" w:qFormat="1"/>
+    <w:lsdException w:name="Normal" w:uiPriority="0" w:semiHidden="0" w:unhideWhenUsed="0" w:qFormat="1"/>
+    <w:lsdException w:name="heading 1" w:uiPriority="9" w:semiHidden="0" w:unhideWhenUsed="0" w:qFormat="1"/>
     <w:lsdException w:name="heading 2" w:uiPriority="9" w:qFormat="1"/>
     <w:lsdException w:name="heading 3" w:uiPriority="9" w:qFormat="1"/>
     <w:lsdException w:name="heading 4" w:uiPriority="9" w:qFormat="1"/>
@@ -3006,136 +3031,136 @@
     <w:lsdException w:name="toc 8" w:uiPriority="39"/>
     <w:lsdException w:name="toc 9" w:uiPriority="39"/>
     <w:lsdException w:name="caption" w:uiPriority="35" w:qFormat="1"/>
-    <w:lsdException w:name="Title" w:semiHidden="0" w:uiPriority="10" w:unhideWhenUsed="0" w:qFormat="1"/>
+    <w:lsdException w:name="Title" w:uiPriority="10" w:semiHidden="0" w:unhideWhenUsed="0" w:qFormat="1"/>
     <w:lsdException w:name="Default Paragraph Font" w:uiPriority="1"/>
-    <w:lsdException w:name="Subtitle" w:semiHidden="0" w:uiPriority="11" w:unhideWhenUsed="0" w:qFormat="1"/>
-    <w:lsdException w:name="Strong" w:semiHidden="0" w:uiPriority="22" w:unhideWhenUsed="0" w:qFormat="1"/>
-    <w:lsdException w:name="Emphasis" w:semiHidden="0" w:uiPriority="20" w:unhideWhenUsed="0" w:qFormat="1"/>
-    <w:lsdException w:name="Table Grid" w:semiHidden="0" w:uiPriority="59" w:unhideWhenUsed="0"/>
+    <w:lsdException w:name="Subtitle" w:uiPriority="11" w:semiHidden="0" w:unhideWhenUsed="0" w:qFormat="1"/>
+    <w:lsdException w:name="Strong" w:uiPriority="22" w:semiHidden="0" w:unhideWhenUsed="0" w:qFormat="1"/>
+    <w:lsdException w:name="Emphasis" w:uiPriority="20" w:semiHidden="0" w:unhideWhenUsed="0" w:qFormat="1"/>
+    <w:lsdException w:name="Table Grid" w:uiPriority="59" w:semiHidden="0" w:unhideWhenUsed="0"/>
     <w:lsdException w:name="Placeholder Text" w:unhideWhenUsed="0"/>
-    <w:lsdException w:name="No Spacing" w:semiHidden="0" w:uiPriority="1" w:unhideWhenUsed="0" w:qFormat="1"/>
-    <w:lsdException w:name="Light Shading" w:semiHidden="0" w:uiPriority="60" w:unhideWhenUsed="0"/>
-    <w:lsdException w:name="Light List" w:semiHidden="0" w:uiPriority="61" w:unhideWhenUsed="0"/>
-    <w:lsdException w:name="Light Grid" w:semiHidden="0" w:uiPriority="62" w:unhideWhenUsed="0"/>
-    <w:lsdException w:name="Medium Shading 1" w:semiHidden="0" w:uiPriority="63" w:unhideWhenUsed="0"/>
-    <w:lsdException w:name="Medium Shading 2" w:semiHidden="0" w:uiPriority="64" w:unhideWhenUsed="0"/>
-    <w:lsdException w:name="Medium List 1" w:semiHidden="0" w:uiPriority="65" w:unhideWhenUsed="0"/>
-    <w:lsdException w:name="Medium List 2" w:semiHidden="0" w:uiPriority="66" w:unhideWhenUsed="0"/>
-    <w:lsdException w:name="Medium Grid 1" w:semiHidden="0" w:uiPriority="67" w:unhideWhenUsed="0"/>
-    <w:lsdException w:name="Medium Grid 2" w:semiHidden="0" w:uiPriority="68" w:unhideWhenUsed="0"/>
-    <w:lsdException w:name="Medium Grid 3" w:semiHidden="0" w:uiPriority="69" w:unhideWhenUsed="0"/>
-    <w:lsdException w:name="Dark List" w:semiHidden="0" w:uiPriority="70" w:unhideWhenUsed="0"/>
-    <w:lsdException w:name="Colorful Shading" w:semiHidden="0" w:uiPriority="71" w:unhideWhenUsed="0"/>
-    <w:lsdException w:name="Colorful List" w:semiHidden="0" w:uiPriority="72" w:unhideWhenUsed="0"/>
-    <w:lsdException w:name="Colorful Grid" w:semiHidden="0" w:uiPriority="73" w:unhideWhenUsed="0"/>
-    <w:lsdException w:name="Light Shading Accent 1" w:semiHidden="0" w:uiPriority="60" w:unhideWhenUsed="0"/>
-    <w:lsdException w:name="Light List Accent 1" w:semiHidden="0" w:uiPriority="61" w:unhideWhenUsed="0"/>
-    <w:lsdException w:name="Light Grid Accent 1" w:semiHidden="0" w:uiPriority="62" w:unhideWhenUsed="0"/>
-    <w:lsdException w:name="Medium Shading 1 Accent 1" w:semiHidden="0" w:uiPriority="63" w:unhideWhenUsed="0"/>
-    <w:lsdException w:name="Medium Shading 2 Accent 1" w:semiHidden="0" w:uiPriority="64" w:unhideWhenUsed="0"/>
-    <w:lsdException w:name="Medium List 1 Accent 1" w:semiHidden="0" w:uiPriority="65" w:unhideWhenUsed="0"/>
+    <w:lsdException w:name="No Spacing" w:uiPriority="1" w:semiHidden="0" w:unhideWhenUsed="0" w:qFormat="1"/>
+    <w:lsdException w:name="Light Shading" w:uiPriority="60" w:semiHidden="0" w:unhideWhenUsed="0"/>
+    <w:lsdException w:name="Light List" w:uiPriority="61" w:semiHidden="0" w:unhideWhenUsed="0"/>
+    <w:lsdException w:name="Light Grid" w:uiPriority="62" w:semiHidden="0" w:unhideWhenUsed="0"/>
+    <w:lsdException w:name="Medium Shading 1" w:uiPriority="63" w:semiHidden="0" w:unhideWhenUsed="0"/>
+    <w:lsdException w:name="Medium Shading 2" w:uiPriority="64" w:semiHidden="0" w:unhideWhenUsed="0"/>
+    <w:lsdException w:name="Medium List 1" w:uiPriority="65" w:semiHidden="0" w:unhideWhenUsed="0"/>
+    <w:lsdException w:name="Medium List 2" w:uiPriority="66" w:semiHidden="0" w:unhideWhenUsed="0"/>
+    <w:lsdException w:name="Medium Grid 1" w:uiPriority="67" w:semiHidden="0" w:unhideWhenUsed="0"/>
+    <w:lsdException w:name="Medium Grid 2" w:uiPriority="68" w:semiHidden="0" w:unhideWhenUsed="0"/>
+    <w:lsdException w:name="Medium Grid 3" w:uiPriority="69" w:semiHidden="0" w:unhideWhenUsed="0"/>
+    <w:lsdException w:name="Dark List" w:uiPriority="70" w:semiHidden="0" w:unhideWhenUsed="0"/>
+    <w:lsdException w:name="Colorful Shading" w:uiPriority="71" w:semiHidden="0" w:unhideWhenUsed="0"/>
+    <w:lsdException w:name="Colorful List" w:uiPriority="72" w:semiHidden="0" w:unhideWhenUsed="0"/>
+    <w:lsdException w:name="Colorful Grid" w:uiPriority="73" w:semiHidden="0" w:unhideWhenUsed="0"/>
+    <w:lsdException w:name="Light Shading Accent 1" w:uiPriority="60" w:semiHidden="0" w:unhideWhenUsed="0"/>
+    <w:lsdException w:name="Light List Accent 1" w:uiPriority="61" w:semiHidden="0" w:unhideWhenUsed="0"/>
+    <w:lsdException w:name="Light Grid Accent 1" w:uiPriority="62" w:semiHidden="0" w:unhideWhenUsed="0"/>
+    <w:lsdException w:name="Medium Shading 1 Accent 1" w:uiPriority="63" w:semiHidden="0" w:unhideWhenUsed="0"/>
+    <w:lsdException w:name="Medium Shading 2 Accent 1" w:uiPriority="64" w:semiHidden="0" w:unhideWhenUsed="0"/>
+    <w:lsdException w:name="Medium List 1 Accent 1" w:uiPriority="65" w:semiHidden="0" w:unhideWhenUsed="0"/>
     <w:lsdException w:name="Revision" w:unhideWhenUsed="0"/>
-    <w:lsdException w:name="List Paragraph" w:semiHidden="0" w:uiPriority="34" w:unhideWhenUsed="0" w:qFormat="1"/>
-    <w:lsdException w:name="Quote" w:semiHidden="0" w:uiPriority="29" w:unhideWhenUsed="0" w:qFormat="1"/>
-    <w:lsdException w:name="Intense Quote" w:semiHidden="0" w:uiPriority="30" w:unhideWhenUsed="0" w:qFormat="1"/>
-    <w:lsdException w:name="Medium List 2 Accent 1" w:semiHidden="0" w:uiPriority="66" w:unhideWhenUsed="0"/>
-    <w:lsdException w:name="Medium Grid 1 Accent 1" w:semiHidden="0" w:uiPriority="67" w:unhideWhenUsed="0"/>
-    <w:lsdException w:name="Medium Grid 2 Accent 1" w:semiHidden="0" w:uiPriority="68" w:unhideWhenUsed="0"/>
-    <w:lsdException w:name="Medium Grid 3 Accent 1" w:semiHidden="0" w:uiPriority="69" w:unhideWhenUsed="0"/>
-    <w:lsdException w:name="Dark List Accent 1" w:semiHidden="0" w:uiPriority="70" w:unhideWhenUsed="0"/>
-    <w:lsdException w:name="Colorful Shading Accent 1" w:semiHidden="0" w:uiPriority="71" w:unhideWhenUsed="0"/>
-    <w:lsdException w:name="Colorful List Accent 1" w:semiHidden="0" w:uiPriority="72" w:unhideWhenUsed="0"/>
-    <w:lsdException w:name="Colorful Grid Accent 1" w:semiHidden="0" w:uiPriority="73" w:unhideWhenUsed="0"/>
-    <w:lsdException w:name="Light Shading Accent 2" w:semiHidden="0" w:uiPriority="60" w:unhideWhenUsed="0"/>
-    <w:lsdException w:name="Light List Accent 2" w:semiHidden="0" w:uiPriority="61" w:unhideWhenUsed="0"/>
-    <w:lsdException w:name="Light Grid Accent 2" w:semiHidden="0" w:uiPriority="62" w:unhideWhenUsed="0"/>
-    <w:lsdException w:name="Medium Shading 1 Accent 2" w:semiHidden="0" w:uiPriority="63" w:unhideWhenUsed="0"/>
-    <w:lsdException w:name="Medium Shading 2 Accent 2" w:semiHidden="0" w:uiPriority="64" w:unhideWhenUsed="0"/>
-    <w:lsdException w:name="Medium List 1 Accent 2" w:semiHidden="0" w:uiPriority="65" w:unhideWhenUsed="0"/>
-    <w:lsdException w:name="Medium List 2 Accent 2" w:semiHidden="0" w:uiPriority="66" w:unhideWhenUsed="0"/>
-    <w:lsdException w:name="Medium Grid 1 Accent 2" w:semiHidden="0" w:uiPriority="67" w:unhideWhenUsed="0"/>
-    <w:lsdException w:name="Medium Grid 2 Accent 2" w:semiHidden="0" w:uiPriority="68" w:unhideWhenUsed="0"/>
-    <w:lsdException w:name="Medium Grid 3 Accent 2" w:semiHidden="0" w:uiPriority="69" w:unhideWhenUsed="0"/>
-    <w:lsdException w:name="Dark List Accent 2" w:semiHidden="0" w:uiPriority="70" w:unhideWhenUsed="0"/>
-    <w:lsdException w:name="Colorful Shading Accent 2" w:semiHidden="0" w:uiPriority="71" w:unhideWhenUsed="0"/>
-    <w:lsdException w:name="Colorful List Accent 2" w:semiHidden="0" w:uiPriority="72" w:unhideWhenUsed="0"/>
-    <w:lsdException w:name="Colorful Grid Accent 2" w:semiHidden="0" w:uiPriority="73" w:unhideWhenUsed="0"/>
-    <w:lsdException w:name="Light Shading Accent 3" w:semiHidden="0" w:uiPriority="60" w:unhideWhenUsed="0"/>
-    <w:lsdException w:name="Light List Accent 3" w:semiHidden="0" w:uiPriority="61" w:unhideWhenUsed="0"/>
-    <w:lsdException w:name="Light Grid Accent 3" w:semiHidden="0" w:uiPriority="62" w:unhideWhenUsed="0"/>
-    <w:lsdException w:name="Medium Shading 1 Accent 3" w:semiHidden="0" w:uiPriority="63" w:unhideWhenUsed="0"/>
-    <w:lsdException w:name="Medium Shading 2 Accent 3" w:semiHidden="0" w:uiPriority="64" w:unhideWhenUsed="0"/>
-    <w:lsdException w:name="Medium List 1 Accent 3" w:semiHidden="0" w:uiPriority="65" w:unhideWhenUsed="0"/>
-    <w:lsdException w:name="Medium List 2 Accent 3" w:semiHidden="0" w:uiPriority="66" w:unhideWhenUsed="0"/>
-    <w:lsdException w:name="Medium Grid 1 Accent 3" w:semiHidden="0" w:uiPriority="67" w:unhideWhenUsed="0"/>
-    <w:lsdException w:name="Medium Grid 2 Accent 3" w:semiHidden="0" w:uiPriority="68" w:unhideWhenUsed="0"/>
-    <w:lsdException w:name="Medium Grid 3 Accent 3" w:semiHidden="0" w:uiPriority="69" w:unhideWhenUsed="0"/>
-    <w:lsdException w:name="Dark List Accent 3" w:semiHidden="0" w:uiPriority="70" w:unhideWhenUsed="0"/>
-    <w:lsdException w:name="Colorful Shading Accent 3" w:semiHidden="0" w:uiPriority="71" w:unhideWhenUsed="0"/>
-    <w:lsdException w:name="Colorful List Accent 3" w:semiHidden="0" w:uiPriority="72" w:unhideWhenUsed="0"/>
-    <w:lsdException w:name="Colorful Grid Accent 3" w:semiHidden="0" w:uiPriority="73" w:unhideWhenUsed="0"/>
-    <w:lsdException w:name="Light Shading Accent 4" w:semiHidden="0" w:uiPriority="60" w:unhideWhenUsed="0"/>
-    <w:lsdException w:name="Light List Accent 4" w:semiHidden="0" w:uiPriority="61" w:unhideWhenUsed="0"/>
-    <w:lsdException w:name="Light Grid Accent 4" w:semiHidden="0" w:uiPriority="62" w:unhideWhenUsed="0"/>
-    <w:lsdException w:name="Medium Shading 1 Accent 4" w:semiHidden="0" w:uiPriority="63" w:unhideWhenUsed="0"/>
-    <w:lsdException w:name="Medium Shading 2 Accent 4" w:semiHidden="0" w:uiPriority="64" w:unhideWhenUsed="0"/>
-    <w:lsdException w:name="Medium List 1 Accent 4" w:semiHidden="0" w:uiPriority="65" w:unhideWhenUsed="0"/>
-    <w:lsdException w:name="Medium List 2 Accent 4" w:semiHidden="0" w:uiPriority="66" w:unhideWhenUsed="0"/>
-    <w:lsdException w:name="Medium Grid 1 Accent 4" w:semiHidden="0" w:uiPriority="67" w:unhideWhenUsed="0"/>
-    <w:lsdException w:name="Medium Grid 2 Accent 4" w:semiHidden="0" w:uiPriority="68" w:unhideWhenUsed="0"/>
-    <w:lsdException w:name="Medium Grid 3 Accent 4" w:semiHidden="0" w:uiPriority="69" w:unhideWhenUsed="0"/>
-    <w:lsdException w:name="Dark List Accent 4" w:semiHidden="0" w:uiPriority="70" w:unhideWhenUsed="0"/>
-    <w:lsdException w:name="Colorful Shading Accent 4" w:semiHidden="0" w:uiPriority="71" w:unhideWhenUsed="0"/>
-    <w:lsdException w:name="Colorful List Accent 4" w:semiHidden="0" w:uiPriority="72" w:unhideWhenUsed="0"/>
-    <w:lsdException w:name="Colorful Grid Accent 4" w:semiHidden="0" w:uiPriority="73" w:unhideWhenUsed="0"/>
-    <w:lsdException w:name="Light Shading Accent 5" w:semiHidden="0" w:uiPriority="60" w:unhideWhenUsed="0"/>
-    <w:lsdException w:name="Light List Accent 5" w:semiHidden="0" w:uiPriority="61" w:unhideWhenUsed="0"/>
-    <w:lsdException w:name="Light Grid Accent 5" w:semiHidden="0" w:uiPriority="62" w:unhideWhenUsed="0"/>
-    <w:lsdException w:name="Medium Shading 1 Accent 5" w:semiHidden="0" w:uiPriority="63" w:unhideWhenUsed="0"/>
-    <w:lsdException w:name="Medium Shading 2 Accent 5" w:semiHidden="0" w:uiPriority="64" w:unhideWhenUsed="0"/>
-    <w:lsdException w:name="Medium List 1 Accent 5" w:semiHidden="0" w:uiPriority="65" w:unhideWhenUsed="0"/>
-    <w:lsdException w:name="Medium List 2 Accent 5" w:semiHidden="0" w:uiPriority="66" w:unhideWhenUsed="0"/>
-    <w:lsdException w:name="Medium Grid 1 Accent 5" w:semiHidden="0" w:uiPriority="67" w:unhideWhenUsed="0"/>
-    <w:lsdException w:name="Medium Grid 2 Accent 5" w:semiHidden="0" w:uiPriority="68" w:unhideWhenUsed="0"/>
-    <w:lsdException w:name="Medium Grid 3 Accent 5" w:semiHidden="0" w:uiPriority="69" w:unhideWhenUsed="0"/>
-    <w:lsdException w:name="Dark List Accent 5" w:semiHidden="0" w:uiPriority="70" w:unhideWhenUsed="0"/>
-    <w:lsdException w:name="Colorful Shading Accent 5" w:semiHidden="0" w:uiPriority="71" w:unhideWhenUsed="0"/>
-    <w:lsdException w:name="Colorful List Accent 5" w:semiHidden="0" w:uiPriority="72" w:unhideWhenUsed="0"/>
-    <w:lsdException w:name="Colorful Grid Accent 5" w:semiHidden="0" w:uiPriority="73" w:unhideWhenUsed="0"/>
-    <w:lsdException w:name="Light Shading Accent 6" w:semiHidden="0" w:uiPriority="60" w:unhideWhenUsed="0"/>
-    <w:lsdException w:name="Light List Accent 6" w:semiHidden="0" w:uiPriority="61" w:unhideWhenUsed="0"/>
-    <w:lsdException w:name="Light Grid Accent 6" w:semiHidden="0" w:uiPriority="62" w:unhideWhenUsed="0"/>
-    <w:lsdException w:name="Medium Shading 1 Accent 6" w:semiHidden="0" w:uiPriority="63" w:unhideWhenUsed="0"/>
-    <w:lsdException w:name="Medium Shading 2 Accent 6" w:semiHidden="0" w:uiPriority="64" w:unhideWhenUsed="0"/>
-    <w:lsdException w:name="Medium List 1 Accent 6" w:semiHidden="0" w:uiPriority="65" w:unhideWhenUsed="0"/>
-    <w:lsdException w:name="Medium List 2 Accent 6" w:semiHidden="0" w:uiPriority="66" w:unhideWhenUsed="0"/>
-    <w:lsdException w:name="Medium Grid 1 Accent 6" w:semiHidden="0" w:uiPriority="67" w:unhideWhenUsed="0"/>
-    <w:lsdException w:name="Medium Grid 2 Accent 6" w:semiHidden="0" w:uiPriority="68" w:unhideWhenUsed="0"/>
-    <w:lsdException w:name="Medium Grid 3 Accent 6" w:semiHidden="0" w:uiPriority="69" w:unhideWhenUsed="0"/>
-    <w:lsdException w:name="Dark List Accent 6" w:semiHidden="0" w:uiPriority="70" w:unhideWhenUsed="0"/>
-    <w:lsdException w:name="Colorful Shading Accent 6" w:semiHidden="0" w:uiPriority="71" w:unhideWhenUsed="0"/>
-    <w:lsdException w:name="Colorful List Accent 6" w:semiHidden="0" w:uiPriority="72" w:unhideWhenUsed="0"/>
-    <w:lsdException w:name="Colorful Grid Accent 6" w:semiHidden="0" w:uiPriority="73" w:unhideWhenUsed="0"/>
-    <w:lsdException w:name="Subtle Emphasis" w:semiHidden="0" w:uiPriority="19" w:unhideWhenUsed="0" w:qFormat="1"/>
-    <w:lsdException w:name="Intense Emphasis" w:semiHidden="0" w:uiPriority="21" w:unhideWhenUsed="0" w:qFormat="1"/>
-    <w:lsdException w:name="Subtle Reference" w:semiHidden="0" w:uiPriority="31" w:unhideWhenUsed="0" w:qFormat="1"/>
-    <w:lsdException w:name="Intense Reference" w:semiHidden="0" w:uiPriority="32" w:unhideWhenUsed="0" w:qFormat="1"/>
-    <w:lsdException w:name="Book Title" w:semiHidden="0" w:uiPriority="33" w:unhideWhenUsed="0" w:qFormat="1"/>
+    <w:lsdException w:name="List Paragraph" w:uiPriority="34" w:semiHidden="0" w:unhideWhenUsed="0" w:qFormat="1"/>
+    <w:lsdException w:name="Quote" w:uiPriority="29" w:semiHidden="0" w:unhideWhenUsed="0" w:qFormat="1"/>
+    <w:lsdException w:name="Intense Quote" w:uiPriority="30" w:semiHidden="0" w:unhideWhenUsed="0" w:qFormat="1"/>
+    <w:lsdException w:name="Medium List 2 Accent 1" w:uiPriority="66" w:semiHidden="0" w:unhideWhenUsed="0"/>
+    <w:lsdException w:name="Medium Grid 1 Accent 1" w:uiPriority="67" w:semiHidden="0" w:unhideWhenUsed="0"/>
+    <w:lsdException w:name="Medium Grid 2 Accent 1" w:uiPriority="68" w:semiHidden="0" w:unhideWhenUsed="0"/>
+    <w:lsdException w:name="Medium Grid 3 Accent 1" w:uiPriority="69" w:semiHidden="0" w:unhideWhenUsed="0"/>
+    <w:lsdException w:name="Dark List Accent 1" w:uiPriority="70" w:semiHidden="0" w:unhideWhenUsed="0"/>
+    <w:lsdException w:name="Colorful Shading Accent 1" w:uiPriority="71" w:semiHidden="0" w:unhideWhenUsed="0"/>
+    <w:lsdException w:name="Colorful List Accent 1" w:uiPriority="72" w:semiHidden="0" w:unhideWhenUsed="0"/>
+    <w:lsdException w:name="Colorful Grid Accent 1" w:uiPriority="73" w:semiHidden="0" w:unhideWhenUsed="0"/>
+    <w:lsdException w:name="Light Shading Accent 2" w:uiPriority="60" w:semiHidden="0" w:unhideWhenUsed="0"/>
+    <w:lsdException w:name="Light List Accent 2" w:uiPriority="61" w:semiHidden="0" w:unhideWhenUsed="0"/>
+    <w:lsdException w:name="Light Grid Accent 2" w:uiPriority="62" w:semiHidden="0" w:unhideWhenUsed="0"/>
+    <w:lsdException w:name="Medium Shading 1 Accent 2" w:uiPriority="63" w:semiHidden="0" w:unhideWhenUsed="0"/>
+    <w:lsdException w:name="Medium Shading 2 Accent 2" w:uiPriority="64" w:semiHidden="0" w:unhideWhenUsed="0"/>
+    <w:lsdException w:name="Medium List 1 Accent 2" w:uiPriority="65" w:semiHidden="0" w:unhideWhenUsed="0"/>
+    <w:lsdException w:name="Medium List 2 Accent 2" w:uiPriority="66" w:semiHidden="0" w:unhideWhenUsed="0"/>
+    <w:lsdException w:name="Medium Grid 1 Accent 2" w:uiPriority="67" w:semiHidden="0" w:unhideWhenUsed="0"/>
+    <w:lsdException w:name="Medium Grid 2 Accent 2" w:uiPriority="68" w:semiHidden="0" w:unhideWhenUsed="0"/>
+    <w:lsdException w:name="Medium Grid 3 Accent 2" w:uiPriority="69" w:semiHidden="0" w:unhideWhenUsed="0"/>
+    <w:lsdException w:name="Dark List Accent 2" w:uiPriority="70" w:semiHidden="0" w:unhideWhenUsed="0"/>
+    <w:lsdException w:name="Colorful Shading Accent 2" w:uiPriority="71" w:semiHidden="0" w:unhideWhenUsed="0"/>
+    <w:lsdException w:name="Colorful List Accent 2" w:uiPriority="72" w:semiHidden="0" w:unhideWhenUsed="0"/>
+    <w:lsdException w:name="Colorful Grid Accent 2" w:uiPriority="73" w:semiHidden="0" w:unhideWhenUsed="0"/>
+    <w:lsdException w:name="Light Shading Accent 3" w:uiPriority="60" w:semiHidden="0" w:unhideWhenUsed="0"/>
+    <w:lsdException w:name="Light List Accent 3" w:uiPriority="61" w:semiHidden="0" w:unhideWhenUsed="0"/>
+    <w:lsdException w:name="Light Grid Accent 3" w:uiPriority="62" w:semiHidden="0" w:unhideWhenUsed="0"/>
+    <w:lsdException w:name="Medium Shading 1 Accent 3" w:uiPriority="63" w:semiHidden="0" w:unhideWhenUsed="0"/>
+    <w:lsdException w:name="Medium Shading 2 Accent 3" w:uiPriority="64" w:semiHidden="0" w:unhideWhenUsed="0"/>
+    <w:lsdException w:name="Medium List 1 Accent 3" w:uiPriority="65" w:semiHidden="0" w:unhideWhenUsed="0"/>
+    <w:lsdException w:name="Medium List 2 Accent 3" w:uiPriority="66" w:semiHidden="0" w:unhideWhenUsed="0"/>
+    <w:lsdException w:name="Medium Grid 1 Accent 3" w:uiPriority="67" w:semiHidden="0" w:unhideWhenUsed="0"/>
+    <w:lsdException w:name="Medium Grid 2 Accent 3" w:uiPriority="68" w:semiHidden="0" w:unhideWhenUsed="0"/>
+    <w:lsdException w:name="Medium Grid 3 Accent 3" w:uiPriority="69" w:semiHidden="0" w:unhideWhenUsed="0"/>
+    <w:lsdException w:name="Dark List Accent 3" w:uiPriority="70" w:semiHidden="0" w:unhideWhenUsed="0"/>
+    <w:lsdException w:name="Colorful Shading Accent 3" w:uiPriority="71" w:semiHidden="0" w:unhideWhenUsed="0"/>
+    <w:lsdException w:name="Colorful List Accent 3" w:uiPriority="72" w:semiHidden="0" w:unhideWhenUsed="0"/>
+    <w:lsdException w:name="Colorful Grid Accent 3" w:uiPriority="73" w:semiHidden="0" w:unhideWhenUsed="0"/>
+    <w:lsdException w:name="Light Shading Accent 4" w:uiPriority="60" w:semiHidden="0" w:unhideWhenUsed="0"/>
+    <w:lsdException w:name="Light List Accent 4" w:uiPriority="61" w:semiHidden="0" w:unhideWhenUsed="0"/>
+    <w:lsdException w:name="Light Grid Accent 4" w:uiPriority="62" w:semiHidden="0" w:unhideWhenUsed="0"/>
+    <w:lsdException w:name="Medium Shading 1 Accent 4" w:uiPriority="63" w:semiHidden="0" w:unhideWhenUsed="0"/>
+    <w:lsdException w:name="Medium Shading 2 Accent 4" w:uiPriority="64" w:semiHidden="0" w:unhideWhenUsed="0"/>
+    <w:lsdException w:name="Medium List 1 Accent 4" w:uiPriority="65" w:semiHidden="0" w:unhideWhenUsed="0"/>
+    <w:lsdException w:name="Medium List 2 Accent 4" w:uiPriority="66" w:semiHidden="0" w:unhideWhenUsed="0"/>
+    <w:lsdException w:name="Medium Grid 1 Accent 4" w:uiPriority="67" w:semiHidden="0" w:unhideWhenUsed="0"/>
+    <w:lsdException w:name="Medium Grid 2 Accent 4" w:uiPriority="68" w:semiHidden="0" w:unhideWhenUsed="0"/>
+    <w:lsdException w:name="Medium Grid 3 Accent 4" w:uiPriority="69" w:semiHidden="0" w:unhideWhenUsed="0"/>
+    <w:lsdException w:name="Dark List Accent 4" w:uiPriority="70" w:semiHidden="0" w:unhideWhenUsed="0"/>
+    <w:lsdException w:name="Colorful Shading Accent 4" w:uiPriority="71" w:semiHidden="0" w:unhideWhenUsed="0"/>
+    <w:lsdException w:name="Colorful List Accent 4" w:uiPriority="72" w:semiHidden="0" w:unhideWhenUsed="0"/>
+    <w:lsdException w:name="Colorful Grid Accent 4" w:uiPriority="73" w:semiHidden="0" w:unhideWhenUsed="0"/>
+    <w:lsdException w:name="Light Shading Accent 5" w:uiPriority="60" w:semiHidden="0" w:unhideWhenUsed="0"/>
+    <w:lsdException w:name="Light List Accent 5" w:uiPriority="61" w:semiHidden="0" w:unhideWhenUsed="0"/>
+    <w:lsdException w:name="Light Grid Accent 5" w:uiPriority="62" w:semiHidden="0" w:unhideWhenUsed="0"/>
+    <w:lsdException w:name="Medium Shading 1 Accent 5" w:uiPriority="63" w:semiHidden="0" w:unhideWhenUsed="0"/>
+    <w:lsdException w:name="Medium Shading 2 Accent 5" w:uiPriority="64" w:semiHidden="0" w:unhideWhenUsed="0"/>
+    <w:lsdException w:name="Medium List 1 Accent 5" w:uiPriority="65" w:semiHidden="0" w:unhideWhenUsed="0"/>
+    <w:lsdException w:name="Medium List 2 Accent 5" w:uiPriority="66" w:semiHidden="0" w:unhideWhenUsed="0"/>
+    <w:lsdException w:name="Medium Grid 1 Accent 5" w:uiPriority="67" w:semiHidden="0" w:unhideWhenUsed="0"/>
+    <w:lsdException w:name="Medium Grid 2 Accent 5" w:uiPriority="68" w:semiHidden="0" w:unhideWhenUsed="0"/>
+    <w:lsdException w:name="Medium Grid 3 Accent 5" w:uiPriority="69" w:semiHidden="0" w:unhideWhenUsed="0"/>
+    <w:lsdException w:name="Dark List Accent 5" w:uiPriority="70" w:semiHidden="0" w:unhideWhenUsed="0"/>
+    <w:lsdException w:name="Colorful Shading Accent 5" w:uiPriority="71" w:semiHidden="0" w:unhideWhenUsed="0"/>
+    <w:lsdException w:name="Colorful List Accent 5" w:uiPriority="72" w:semiHidden="0" w:unhideWhenUsed="0"/>
+    <w:lsdException w:name="Colorful Grid Accent 5" w:uiPriority="73" w:semiHidden="0" w:unhideWhenUsed="0"/>
+    <w:lsdException w:name="Light Shading Accent 6" w:uiPriority="60" w:semiHidden="0" w:unhideWhenUsed="0"/>
+    <w:lsdException w:name="Light List Accent 6" w:uiPriority="61" w:semiHidden="0" w:unhideWhenUsed="0"/>
+    <w:lsdException w:name="Light Grid Accent 6" w:uiPriority="62" w:semiHidden="0" w:unhideWhenUsed="0"/>
+    <w:lsdException w:name="Medium Shading 1 Accent 6" w:uiPriority="63" w:semiHidden="0" w:unhideWhenUsed="0"/>
+    <w:lsdException w:name="Medium Shading 2 Accent 6" w:uiPriority="64" w:semiHidden="0" w:unhideWhenUsed="0"/>
+    <w:lsdException w:name="Medium List 1 Accent 6" w:uiPriority="65" w:semiHidden="0" w:unhideWhenUsed="0"/>
+    <w:lsdException w:name="Medium List 2 Accent 6" w:uiPriority="66" w:semiHidden="0" w:unhideWhenUsed="0"/>
+    <w:lsdException w:name="Medium Grid 1 Accent 6" w:uiPriority="67" w:semiHidden="0" w:unhideWhenUsed="0"/>
+    <w:lsdException w:name="Medium Grid 2 Accent 6" w:uiPriority="68" w:semiHidden="0" w:unhideWhenUsed="0"/>
+    <w:lsdException w:name="Medium Grid 3 Accent 6" w:uiPriority="69" w:semiHidden="0" w:unhideWhenUsed="0"/>
+    <w:lsdException w:name="Dark List Accent 6" w:uiPriority="70" w:semiHidden="0" w:unhideWhenUsed="0"/>
+    <w:lsdException w:name="Colorful Shading Accent 6" w:uiPriority="71" w:semiHidden="0" w:unhideWhenUsed="0"/>
+    <w:lsdException w:name="Colorful List Accent 6" w:uiPriority="72" w:semiHidden="0" w:unhideWhenUsed="0"/>
+    <w:lsdException w:name="Colorful Grid Accent 6" w:uiPriority="73" w:semiHidden="0" w:unhideWhenUsed="0"/>
+    <w:lsdException w:name="Subtle Emphasis" w:uiPriority="19" w:semiHidden="0" w:unhideWhenUsed="0" w:qFormat="1"/>
+    <w:lsdException w:name="Intense Emphasis" w:uiPriority="21" w:semiHidden="0" w:unhideWhenUsed="0" w:qFormat="1"/>
+    <w:lsdException w:name="Subtle Reference" w:uiPriority="31" w:semiHidden="0" w:unhideWhenUsed="0" w:qFormat="1"/>
+    <w:lsdException w:name="Intense Reference" w:uiPriority="32" w:semiHidden="0" w:unhideWhenUsed="0" w:qFormat="1"/>
+    <w:lsdException w:name="Book Title" w:uiPriority="33" w:semiHidden="0" w:unhideWhenUsed="0" w:qFormat="1"/>
     <w:lsdException w:name="Bibliography" w:uiPriority="37"/>
     <w:lsdException w:name="TOC Heading" w:uiPriority="39" w:qFormat="1"/>
   </w:latentStyles>
-  <w:style w:type="paragraph" w:default="1" w:styleId="Normal">
+  <w:style w:type="paragraph" w:styleId="Normal" w:default="1">
     <w:name w:val="Normal"/>
     <w:qFormat/>
     <w:rsid w:val="00441023"/>
   </w:style>
-  <w:style w:type="character" w:default="1" w:styleId="DefaultParagraphFont">
+  <w:style w:type="character" w:styleId="DefaultParagraphFont" w:default="1">
     <w:name w:val="Default Paragraph Font"/>
     <w:uiPriority w:val="1"/>
     <w:semiHidden/>
     <w:unhideWhenUsed/>
   </w:style>
-  <w:style w:type="table" w:default="1" w:styleId="TableNormal">
+  <w:style w:type="table" w:styleId="TableNormal" w:default="1">
     <w:name w:val="Normal Table"/>
     <w:uiPriority w:val="99"/>
     <w:semiHidden/>
@@ -3151,7 +3176,7 @@
       </w:tblCellMar>
     </w:tblPr>
   </w:style>
-  <w:style w:type="numbering" w:default="1" w:styleId="NoList">
+  <w:style w:type="numbering" w:styleId="NoList" w:default="1">
     <w:name w:val="No List"/>
     <w:uiPriority w:val="99"/>
     <w:semiHidden/>
@@ -3174,7 +3199,7 @@
       <w:szCs w:val="16"/>
     </w:rPr>
   </w:style>
-  <w:style w:type="character" w:customStyle="1" w:styleId="BalloonTextChar">
+  <w:style w:type="character" w:styleId="BalloonTextChar" w:customStyle="1">
     <w:name w:val="Balloon Text Char"/>
     <w:basedOn w:val="DefaultParagraphFont"/>
     <w:link w:val="BalloonText"/>
@@ -3198,12 +3223,12 @@
     <w:tblPr>
       <w:tblInd w:w="0" w:type="dxa"/>
       <w:tblBorders>
-        <w:top w:val="single" w:sz="4" w:space="0" w:color="000000" w:themeColor="text1"/>
-        <w:left w:val="single" w:sz="4" w:space="0" w:color="000000" w:themeColor="text1"/>
-        <w:bottom w:val="single" w:sz="4" w:space="0" w:color="000000" w:themeColor="text1"/>
-        <w:right w:val="single" w:sz="4" w:space="0" w:color="000000" w:themeColor="text1"/>
-        <w:insideH w:val="single" w:sz="4" w:space="0" w:color="000000" w:themeColor="text1"/>
-        <w:insideV w:val="single" w:sz="4" w:space="0" w:color="000000" w:themeColor="text1"/>
+        <w:top w:val="single" w:color="000000" w:themeColor="text1" w:sz="4" w:space="0"/>
+        <w:left w:val="single" w:color="000000" w:themeColor="text1" w:sz="4" w:space="0"/>
+        <w:bottom w:val="single" w:color="000000" w:themeColor="text1" w:sz="4" w:space="0"/>
+        <w:right w:val="single" w:color="000000" w:themeColor="text1" w:sz="4" w:space="0"/>
+        <w:insideH w:val="single" w:color="000000" w:themeColor="text1" w:sz="4" w:space="0"/>
+        <w:insideV w:val="single" w:color="000000" w:themeColor="text1" w:sz="4" w:space="0"/>
       </w:tblBorders>
       <w:tblCellMar>
         <w:top w:w="0" w:type="dxa"/>

</xml_diff>

<commit_message>
separate safety and work completion certificate
</commit_message>
<xml_diff>
--- a/backend/templates/MamtaEnterprises_Docs.docx
+++ b/backend/templates/MamtaEnterprises_Docs.docx
@@ -46,7 +46,7 @@
         </w:rPr>
       </w:pPr>
     </w:p>
-    <w:p xmlns:wp14="http://schemas.microsoft.com/office/word/2010/wordml" wp14:textId="2DF4750F">
+    <w:p xmlns:wp14="http://schemas.microsoft.com/office/word/2010/wordml" wp14:textId="2EEBFE1B">
       <w:pPr>
         <w:jc w:val="center"/>
         <w:rPr>
@@ -75,7 +75,7 @@
           <w:szCs w:val="28"/>
           <w:u w:val="single"/>
         </w:rPr>
-        <w:t xml:space="preserve"> / Work Completion</w:t>
+        <w:t xml:space="preserve"> </w:t>
       </w:r>
       <w:r>
         <w:rPr>
@@ -85,7 +85,7 @@
           <w:szCs w:val="28"/>
           <w:u w:val="single"/>
         </w:rPr>
-        <w:t xml:space="preserve"> Certificate</w:t>
+        <w:t>Certificate</w:t>
       </w:r>
     </w:p>
     <w:p xmlns:wp14="http://schemas.microsoft.com/office/word/2010/wordml" wp14:textId="77777777">
@@ -805,8 +805,537 @@
         <w:br w:type="page"/>
       </w:r>
     </w:p>
-    <w:p xmlns:wp14="http://schemas.microsoft.com/office/word/2010/wordml" wp14:textId="77777777">
-      <w:pPr>
+    <w:p>
+      <w:pPr>
+        <w:jc w:val="center"/>
+        <w:rPr>
+          <w:b w:val="1"/>
+          <w:bCs w:val="1"/>
+          <w:sz w:val="28"/>
+          <w:szCs w:val="28"/>
+          <w:u w:val="single"/>
+        </w:rPr>
+      </w:pPr>
+    </w:p>
+    <w:p>
+      <w:pPr>
+        <w:jc w:val="center"/>
+        <w:rPr>
+          <w:b w:val="1"/>
+          <w:bCs w:val="1"/>
+          <w:sz w:val="28"/>
+          <w:szCs w:val="28"/>
+          <w:u w:val="single"/>
+        </w:rPr>
+      </w:pPr>
+    </w:p>
+    <w:p>
+      <w:pPr>
+        <w:jc w:val="center"/>
+        <w:rPr>
+          <w:b w:val="1"/>
+          <w:bCs w:val="1"/>
+          <w:sz w:val="28"/>
+          <w:szCs w:val="28"/>
+          <w:u w:val="single"/>
+        </w:rPr>
+      </w:pPr>
+    </w:p>
+    <w:p>
+      <w:pPr>
+        <w:jc w:val="center"/>
+        <w:rPr>
+          <w:b w:val="1"/>
+          <w:bCs w:val="1"/>
+          <w:sz w:val="28"/>
+          <w:szCs w:val="28"/>
+          <w:u w:val="single"/>
+        </w:rPr>
+      </w:pPr>
+    </w:p>
+    <w:p>
+      <w:pPr>
+        <w:jc w:val="center"/>
+        <w:rPr>
+          <w:b w:val="1"/>
+          <w:bCs w:val="1"/>
+          <w:sz w:val="28"/>
+          <w:szCs w:val="28"/>
+          <w:u w:val="single"/>
+        </w:rPr>
+      </w:pPr>
+      <w:r>
+        <w:rPr>
+          <w:b w:val="1"/>
+          <w:bCs w:val="1"/>
+          <w:sz w:val="28"/>
+          <w:szCs w:val="28"/>
+          <w:u w:val="single"/>
+        </w:rPr>
+        <w:t>Work Completion Certificate</w:t>
+      </w:r>
+    </w:p>
+    <w:p>
+      <w:pPr>
+        <w:ind w:left="1440" w:right="1440"/>
+        <w:rPr>
+          <w:rFonts w:ascii="Arial" w:hAnsi="Arial" w:cs="Arial"/>
+        </w:rPr>
+      </w:pPr>
+      <w:r>
+        <w:rPr>
+          <w:rFonts w:ascii="Arial" w:hAnsi="Arial" w:cs="Arial"/>
+        </w:rPr>
+        <w:t>It is certified that the Solar Power Plant of capacity</w:t>
+      </w:r>
+      <w:r>
+        <w:rPr>
+          <w:rFonts w:ascii="Arial" w:hAnsi="Arial" w:cs="Arial"/>
+        </w:rPr>
+        <w:t xml:space="preserve"> {</w:t>
+      </w:r>
+      <w:r>
+        <w:rPr>
+          <w:rFonts w:ascii="Arial" w:hAnsi="Arial" w:cs="Arial"/>
+        </w:rPr>
+        <w:t>net_solar_capacity</w:t>
+      </w:r>
+      <w:r>
+        <w:rPr>
+          <w:rFonts w:ascii="Arial" w:hAnsi="Arial" w:cs="Arial"/>
+        </w:rPr>
+        <w:t xml:space="preserve">} </w:t>
+      </w:r>
+      <w:r>
+        <w:rPr>
+          <w:rFonts w:ascii="Arial" w:hAnsi="Arial" w:cs="Arial"/>
+        </w:rPr>
+        <w:t>KW</w:t>
+      </w:r>
+      <w:r>
+        <w:rPr>
+          <w:rFonts w:ascii="Arial" w:hAnsi="Arial" w:cs="Arial"/>
+        </w:rPr>
+        <w:t xml:space="preserve"> </w:t>
+      </w:r>
+      <w:r>
+        <w:rPr>
+          <w:rFonts w:ascii="Arial" w:hAnsi="Arial" w:cs="Arial"/>
+        </w:rPr>
+        <w:t>installed by Mamta Enterprises at</w:t>
+      </w:r>
+      <w:r>
+        <w:rPr>
+          <w:rFonts w:ascii="Arial" w:hAnsi="Arial" w:cs="Arial"/>
+        </w:rPr>
+        <w:t xml:space="preserve"> {</w:t>
+      </w:r>
+      <w:r>
+        <w:rPr>
+          <w:rFonts w:ascii="Arial" w:hAnsi="Arial" w:cs="Arial"/>
+        </w:rPr>
+        <w:t>consumer_name</w:t>
+      </w:r>
+      <w:r>
+        <w:rPr>
+          <w:rFonts w:ascii="Arial" w:hAnsi="Arial" w:cs="Arial"/>
+        </w:rPr>
+        <w:t>}, {</w:t>
+      </w:r>
+      <w:r>
+        <w:rPr>
+          <w:rFonts w:ascii="Arial" w:hAnsi="Arial" w:cs="Arial"/>
+        </w:rPr>
+        <w:t>consumer_address</w:t>
+      </w:r>
+      <w:r>
+        <w:rPr>
+          <w:rFonts w:ascii="Arial" w:hAnsi="Arial" w:cs="Arial"/>
+        </w:rPr>
+        <w:t>},</w:t>
+      </w:r>
+      <w:r>
+        <w:rPr>
+          <w:rFonts w:ascii="Arial" w:hAnsi="Arial" w:cs="Arial"/>
+        </w:rPr>
+        <w:t xml:space="preserve"> Invoice No.</w:t>
+      </w:r>
+      <w:r>
+        <w:rPr>
+          <w:rFonts w:ascii="Arial" w:hAnsi="Arial" w:cs="Arial"/>
+        </w:rPr>
+        <w:t xml:space="preserve"> {</w:t>
+      </w:r>
+      <w:r>
+        <w:rPr>
+          <w:rFonts w:ascii="Arial" w:hAnsi="Arial" w:cs="Arial"/>
+        </w:rPr>
+        <w:t>invoice_number</w:t>
+      </w:r>
+      <w:r>
+        <w:rPr>
+          <w:rFonts w:ascii="Arial" w:hAnsi="Arial" w:cs="Arial"/>
+        </w:rPr>
+        <w:t>}</w:t>
+      </w:r>
+      <w:r>
+        <w:rPr>
+          <w:rFonts w:ascii="Arial" w:hAnsi="Arial" w:cs="Arial"/>
+        </w:rPr>
+        <w:t xml:space="preserve">, Dated: </w:t>
+      </w:r>
+      <w:r>
+        <w:rPr>
+          <w:rFonts w:ascii="Arial" w:hAnsi="Arial" w:cs="Arial"/>
+        </w:rPr>
+        <w:t>{</w:t>
+      </w:r>
+      <w:r>
+        <w:rPr>
+          <w:rFonts w:ascii="Arial" w:hAnsi="Arial" w:cs="Arial"/>
+        </w:rPr>
+        <w:t>invoice_date</w:t>
+      </w:r>
+      <w:r>
+        <w:rPr>
+          <w:rFonts w:ascii="Arial" w:hAnsi="Arial" w:cs="Arial"/>
+        </w:rPr>
+        <w:t xml:space="preserve">}, </w:t>
+      </w:r>
+      <w:r>
+        <w:rPr>
+          <w:rFonts w:ascii="Arial" w:hAnsi="Arial" w:cs="Arial"/>
+        </w:rPr>
+        <w:t xml:space="preserve">in this system we have installed one inverter of capacity </w:t>
+      </w:r>
+      <w:r>
+        <w:rPr>
+          <w:rFonts w:ascii="Arial" w:hAnsi="Arial" w:cs="Arial"/>
+        </w:rPr>
+        <w:t>{</w:t>
+      </w:r>
+      <w:r>
+        <w:rPr>
+          <w:rFonts w:ascii="Arial" w:hAnsi="Arial" w:cs="Arial"/>
+        </w:rPr>
+        <w:t>inverter_capacity</w:t>
+      </w:r>
+      <w:r>
+        <w:rPr>
+          <w:rFonts w:ascii="Arial" w:hAnsi="Arial" w:cs="Arial"/>
+        </w:rPr>
+        <w:t>}</w:t>
+      </w:r>
+      <w:r>
+        <w:rPr>
+          <w:rFonts w:ascii="Arial" w:hAnsi="Arial" w:cs="Arial"/>
+        </w:rPr>
+        <w:t xml:space="preserve"> KW and</w:t>
+      </w:r>
+      <w:r>
+        <w:rPr>
+          <w:rFonts w:ascii="Arial" w:hAnsi="Arial" w:cs="Arial"/>
+        </w:rPr>
+        <w:t xml:space="preserve"> {</w:t>
+      </w:r>
+      <w:r>
+        <w:rPr>
+          <w:rFonts w:ascii="Arial" w:hAnsi="Arial" w:cs="Arial"/>
+        </w:rPr>
+        <w:t>no_of_panels</w:t>
+      </w:r>
+      <w:r>
+        <w:rPr>
+          <w:rFonts w:ascii="Arial" w:hAnsi="Arial" w:cs="Arial"/>
+        </w:rPr>
+        <w:t xml:space="preserve">} </w:t>
+      </w:r>
+      <w:r>
+        <w:rPr>
+          <w:rFonts w:ascii="Arial" w:hAnsi="Arial" w:cs="Arial"/>
+        </w:rPr>
+        <w:t xml:space="preserve">modules of </w:t>
+      </w:r>
+      <w:r>
+        <w:rPr>
+          <w:rFonts w:ascii="Arial" w:hAnsi="Arial" w:cs="Arial"/>
+        </w:rPr>
+        <w:t>{</w:t>
+      </w:r>
+      <w:r>
+        <w:rPr>
+          <w:rFonts w:ascii="Arial" w:hAnsi="Arial" w:cs="Arial"/>
+        </w:rPr>
+        <w:t>panel_capacity</w:t>
+      </w:r>
+      <w:r>
+        <w:rPr>
+          <w:rFonts w:ascii="Arial" w:hAnsi="Arial" w:cs="Arial"/>
+        </w:rPr>
+        <w:t>}</w:t>
+      </w:r>
+      <w:r>
+        <w:rPr>
+          <w:rFonts w:ascii="Arial" w:hAnsi="Arial" w:cs="Arial"/>
+        </w:rPr>
+        <w:t xml:space="preserve"> watt</w:t>
+      </w:r>
+    </w:p>
+    <w:p>
+      <w:pPr>
+        <w:ind w:left="1440" w:right="1440"/>
+        <w:rPr>
+          <w:rFonts w:ascii="Arial" w:hAnsi="Arial" w:cs="Arial"/>
+        </w:rPr>
+      </w:pPr>
+      <w:r>
+        <w:rPr>
+          <w:rFonts w:ascii="Arial" w:hAnsi="Arial" w:cs="Arial"/>
+        </w:rPr>
+        <w:t xml:space="preserve">  Make of Inverter              :   </w:t>
+      </w:r>
+      <w:r>
+        <w:rPr>
+          <w:rFonts w:ascii="Arial" w:hAnsi="Arial" w:cs="Arial"/>
+        </w:rPr>
+        <w:t xml:space="preserve">   {</w:t>
+      </w:r>
+      <w:r>
+        <w:rPr>
+          <w:rFonts w:ascii="Arial" w:hAnsi="Arial" w:cs="Arial"/>
+        </w:rPr>
+        <w:t>inverter_brand</w:t>
+      </w:r>
+      <w:r>
+        <w:rPr>
+          <w:rFonts w:ascii="Arial" w:hAnsi="Arial" w:cs="Arial"/>
+        </w:rPr>
+        <w:t>}</w:t>
+      </w:r>
+    </w:p>
+    <w:p>
+      <w:pPr>
+        <w:ind w:left="1440" w:right="1440"/>
+        <w:rPr>
+          <w:rFonts w:ascii="Arial" w:hAnsi="Arial" w:cs="Arial"/>
+        </w:rPr>
+      </w:pPr>
+      <w:r>
+        <w:rPr>
+          <w:rFonts w:ascii="Arial" w:hAnsi="Arial" w:cs="Arial"/>
+        </w:rPr>
+        <w:t xml:space="preserve">  Make of Module</w:t>
+      </w:r>
+      <w:r>
+        <w:rPr>
+          <w:rFonts w:ascii="Arial" w:hAnsi="Arial" w:cs="Arial"/>
+        </w:rPr>
+        <w:t xml:space="preserve">              :</w:t>
+      </w:r>
+      <w:r>
+        <w:tab/>
+      </w:r>
+      <w:r>
+        <w:rPr>
+          <w:rFonts w:ascii="Arial" w:hAnsi="Arial" w:cs="Arial"/>
+        </w:rPr>
+        <w:t xml:space="preserve">  {</w:t>
+      </w:r>
+      <w:r>
+        <w:rPr>
+          <w:rFonts w:ascii="Arial" w:hAnsi="Arial" w:cs="Arial"/>
+        </w:rPr>
+        <w:t>panel_brand</w:t>
+      </w:r>
+      <w:r>
+        <w:rPr>
+          <w:rFonts w:ascii="Arial" w:hAnsi="Arial" w:cs="Arial"/>
+        </w:rPr>
+        <w:t>}</w:t>
+      </w:r>
+    </w:p>
+    <w:p>
+      <w:pPr>
+        <w:ind w:left="1440" w:right="1440"/>
+        <w:rPr>
+          <w:rFonts w:ascii="Arial" w:hAnsi="Arial" w:cs="Arial"/>
+        </w:rPr>
+      </w:pPr>
+      <w:r>
+        <w:rPr>
+          <w:rFonts w:ascii="Arial" w:hAnsi="Arial" w:cs="Arial"/>
+        </w:rPr>
+        <w:t xml:space="preserve">  Number of Earthing</w:t>
+      </w:r>
+      <w:r>
+        <w:rPr>
+          <w:rFonts w:ascii="Arial" w:hAnsi="Arial" w:cs="Arial"/>
+        </w:rPr>
+        <w:t xml:space="preserve">         :      </w:t>
+      </w:r>
+      <w:r>
+        <w:rPr>
+          <w:rFonts w:ascii="Arial" w:hAnsi="Arial" w:cs="Arial"/>
+        </w:rPr>
+        <w:t>3</w:t>
+      </w:r>
+    </w:p>
+    <w:p>
+      <w:pPr>
+        <w:ind w:left="1440" w:right="1440"/>
+        <w:rPr>
+          <w:rFonts w:ascii="Arial" w:hAnsi="Arial" w:cs="Arial"/>
+        </w:rPr>
+      </w:pPr>
+      <w:r>
+        <w:rPr>
+          <w:rFonts w:ascii="Arial" w:hAnsi="Arial" w:cs="Arial"/>
+        </w:rPr>
+        <w:t xml:space="preserve">  Surge Protection Device :</w:t>
+      </w:r>
+      <w:r>
+        <w:rPr>
+          <w:rFonts w:ascii="Arial" w:hAnsi="Arial" w:cs="Arial"/>
+        </w:rPr>
+        <w:t xml:space="preserve">      </w:t>
+      </w:r>
+      <w:r>
+        <w:rPr>
+          <w:rFonts w:ascii="Arial" w:hAnsi="Arial" w:cs="Arial"/>
+        </w:rPr>
+        <w:t>Yes</w:t>
+      </w:r>
+    </w:p>
+    <w:p>
+      <w:pPr>
+        <w:ind w:left="1440" w:right="1440"/>
+        <w:rPr>
+          <w:rFonts w:ascii="Arial" w:hAnsi="Arial" w:cs="Arial"/>
+        </w:rPr>
+      </w:pPr>
+      <w:r>
+        <w:rPr>
+          <w:rFonts w:ascii="Arial" w:hAnsi="Arial" w:cs="Arial"/>
+        </w:rPr>
+        <w:t>We, Mamta Enterprises, near Bank of India, Jind Road, Kaithal, HR, certify that this system is installed as per MNRE guidelines and is safe (all the safety measures are being taken care of )</w:t>
+      </w:r>
+      <w:r>
+        <w:rPr>
+          <w:rFonts w:ascii="Arial" w:hAnsi="Arial" w:cs="Arial"/>
+        </w:rPr>
+        <w:t>.</w:t>
+      </w:r>
+    </w:p>
+    <w:p>
+      <w:pPr>
+        <w:tabs>
+          <w:tab w:val="left" w:leader="none" w:pos="4140"/>
+        </w:tabs>
+        <w:ind w:left="1440" w:right="1440"/>
+        <w:rPr>
+          <w:rFonts w:ascii="Arial" w:hAnsi="Arial" w:cs="Arial"/>
+        </w:rPr>
+      </w:pPr>
+      <w:r>
+        <w:rPr>
+          <w:rFonts w:ascii="Arial" w:hAnsi="Arial" w:cs="Arial"/>
+        </w:rPr>
+        <w:t>Thanking you</w:t>
+      </w:r>
+      <w:r>
+        <w:rPr>
+          <w:rFonts w:ascii="Arial" w:hAnsi="Arial" w:cs="Arial"/>
+        </w:rPr>
+        <w:t>.</w:t>
+      </w:r>
+    </w:p>
+    <w:p>
+      <w:pPr>
+        <w:ind w:left="1440" w:right="1440"/>
+        <w:rPr>
+          <w:rFonts w:ascii="Arial" w:hAnsi="Arial" w:cs="Arial"/>
+        </w:rPr>
+      </w:pPr>
+    </w:p>
+    <w:p>
+      <w:pPr>
+        <w:ind w:left="1440" w:right="1440"/>
+        <w:rPr>
+          <w:rFonts w:ascii="Arial" w:hAnsi="Arial" w:cs="Arial"/>
+        </w:rPr>
+      </w:pPr>
+      <w:r>
+        <w:rPr>
+          <w:rFonts w:ascii="Arial" w:hAnsi="Arial" w:cs="Arial"/>
+        </w:rPr>
+        <w:t>Yours truly,</w:t>
+      </w:r>
+    </w:p>
+    <w:p>
+      <w:pPr>
+        <w:ind w:left="1440" w:right="1440"/>
+        <w:rPr>
+          <w:rFonts w:ascii="Arial" w:hAnsi="Arial" w:cs="Arial"/>
+        </w:rPr>
+      </w:pPr>
+      <w:r>
+        <w:rPr>
+          <w:rFonts w:ascii="Arial" w:hAnsi="Arial" w:cs="Arial"/>
+        </w:rPr>
+        <w:t>For Mamta Enterprises</w:t>
+      </w:r>
+    </w:p>
+    <w:p>
+      <w:pPr>
+        <w:ind w:left="1440" w:right="1440"/>
+        <w:rPr>
+          <w:rFonts w:ascii="Arial" w:hAnsi="Arial" w:cs="Arial"/>
+        </w:rPr>
+      </w:pPr>
+    </w:p>
+    <w:p>
+      <w:pPr>
+        <w:ind w:left="1440" w:right="1440"/>
+        <w:rPr>
+          <w:rFonts w:ascii="Arial" w:hAnsi="Arial" w:cs="Arial"/>
+        </w:rPr>
+      </w:pPr>
+      <w:r>
+        <w:rPr>
+          <w:rFonts w:ascii="Arial" w:hAnsi="Arial" w:cs="Arial"/>
+        </w:rPr>
+        <w:t>Auth.</w:t>
+      </w:r>
+      <w:r>
+        <w:rPr>
+          <w:rFonts w:ascii="Arial" w:hAnsi="Arial" w:cs="Arial"/>
+        </w:rPr>
+        <w:t xml:space="preserve"> </w:t>
+      </w:r>
+      <w:r>
+        <w:rPr>
+          <w:rFonts w:ascii="Arial" w:hAnsi="Arial" w:cs="Arial"/>
+        </w:rPr>
+        <w:t>Signatory</w:t>
+      </w:r>
+    </w:p>
+    <w:p>
+      <w:pPr>
+        <w:pStyle w:val="Normal"/>
+        <w:jc w:val="center"/>
+        <w:rPr>
+          <w:rFonts w:ascii="Arial" w:hAnsi="Arial" w:cs="Arial"/>
+        </w:rPr>
+      </w:pPr>
+    </w:p>
+    <w:p>
+      <w:r>
+        <w:br w:type="page"/>
+      </w:r>
+    </w:p>
+    <w:p>
+      <w:pPr>
+        <w:pStyle w:val="Normal"/>
         <w:jc w:val="center"/>
         <w:rPr>
           <w:rFonts w:ascii="Arial" w:hAnsi="Arial" w:cs="Arial"/>

</xml_diff>

<commit_message>
fix formating in docs.
</commit_message>
<xml_diff>
--- a/backend/templates/MamtaEnterprises_Docs.docx
+++ b/backend/templates/MamtaEnterprises_Docs.docx
@@ -1,8 +1,8 @@
 
 <file path=word/document.xml><?xml version="1.0" encoding="utf-8"?>
-<w:document xmlns:w14="http://schemas.microsoft.com/office/word/2010/wordml" xmlns:wp14="http://schemas.microsoft.com/office/word/2010/wordprocessingDrawing" xmlns:ve="http://schemas.openxmlformats.org/markup-compatibility/2006" xmlns:o="urn:schemas-microsoft-com:office:office" xmlns:r="http://schemas.openxmlformats.org/officeDocument/2006/relationships" xmlns:m="http://schemas.openxmlformats.org/officeDocument/2006/math" xmlns:v="urn:schemas-microsoft-com:vml" xmlns:wp="http://schemas.openxmlformats.org/drawingml/2006/wordprocessingDrawing" xmlns:w10="urn:schemas-microsoft-com:office:word" xmlns:w="http://schemas.openxmlformats.org/wordprocessingml/2006/main" xmlns:wne="http://schemas.microsoft.com/office/word/2006/wordml" xmlns:mc="http://schemas.openxmlformats.org/markup-compatibility/2006" mc:Ignorable="w14 wp14">
+<w:document xmlns:ve="http://schemas.openxmlformats.org/markup-compatibility/2006" xmlns:o="urn:schemas-microsoft-com:office:office" xmlns:r="http://schemas.openxmlformats.org/officeDocument/2006/relationships" xmlns:m="http://schemas.openxmlformats.org/officeDocument/2006/math" xmlns:v="urn:schemas-microsoft-com:vml" xmlns:wp="http://schemas.openxmlformats.org/drawingml/2006/wordprocessingDrawing" xmlns:w10="urn:schemas-microsoft-com:office:word" xmlns:w="http://schemas.openxmlformats.org/wordprocessingml/2006/main" xmlns:wne="http://schemas.microsoft.com/office/word/2006/wordml">
   <w:body>
-    <w:p xmlns:wp14="http://schemas.microsoft.com/office/word/2010/wordml" wp14:textId="77777777">
+    <w:p>
       <w:pPr>
         <w:jc w:val="center"/>
         <w:rPr>
@@ -13,7 +13,7 @@
         </w:rPr>
       </w:pPr>
     </w:p>
-    <w:p xmlns:wp14="http://schemas.microsoft.com/office/word/2010/wordml" wp14:textId="77777777">
+    <w:p>
       <w:pPr>
         <w:jc w:val="center"/>
         <w:rPr>
@@ -24,7 +24,7 @@
         </w:rPr>
       </w:pPr>
     </w:p>
-    <w:p xmlns:wp14="http://schemas.microsoft.com/office/word/2010/wordml" wp14:textId="77777777">
+    <w:p>
       <w:pPr>
         <w:jc w:val="center"/>
         <w:rPr>
@@ -35,7 +35,7 @@
         </w:rPr>
       </w:pPr>
     </w:p>
-    <w:p xmlns:wp14="http://schemas.microsoft.com/office/word/2010/wordml" wp14:textId="77777777">
+    <w:p>
       <w:pPr>
         <w:jc w:val="center"/>
         <w:rPr>
@@ -46,12 +46,12 @@
         </w:rPr>
       </w:pPr>
     </w:p>
-    <w:p xmlns:wp14="http://schemas.microsoft.com/office/word/2010/wordml" wp14:textId="2EEBFE1B">
+    <w:p>
       <w:pPr>
         <w:jc w:val="center"/>
         <w:rPr>
-          <w:b w:val="1"/>
-          <w:bCs w:val="1"/>
+          <w:b/>
+          <w:bCs/>
           <w:sz w:val="28"/>
           <w:szCs w:val="28"/>
           <w:u w:val="single"/>
@@ -59,8 +59,8 @@
       </w:pPr>
       <w:r>
         <w:rPr>
-          <w:b w:val="1"/>
-          <w:bCs w:val="1"/>
+          <w:b/>
+          <w:bCs/>
           <w:sz w:val="28"/>
           <w:szCs w:val="28"/>
           <w:u w:val="single"/>
@@ -69,26 +69,348 @@
       </w:r>
       <w:r>
         <w:rPr>
-          <w:b w:val="1"/>
-          <w:bCs w:val="1"/>
+          <w:b/>
+          <w:bCs/>
           <w:sz w:val="28"/>
           <w:szCs w:val="28"/>
           <w:u w:val="single"/>
         </w:rPr>
+        <w:t>Certificate</w:t>
+      </w:r>
+    </w:p>
+    <w:p>
+      <w:pPr>
+        <w:ind w:left="1440" w:right="1440"/>
+        <w:rPr>
+          <w:rFonts w:ascii="Arial" w:hAnsi="Arial" w:cs="Arial"/>
+        </w:rPr>
+      </w:pPr>
+      <w:r>
+        <w:rPr>
+          <w:rFonts w:ascii="Arial" w:hAnsi="Arial" w:cs="Arial"/>
+        </w:rPr>
+        <w:t>It is c</w:t>
+      </w:r>
+      <w:r>
+        <w:rPr>
+          <w:rFonts w:ascii="Arial" w:hAnsi="Arial" w:cs="Arial"/>
+        </w:rPr>
+        <w:t xml:space="preserve">ertified that </w:t>
+      </w:r>
+      <w:r>
+        <w:rPr>
+          <w:rFonts w:ascii="Arial" w:hAnsi="Arial" w:cs="Arial"/>
+        </w:rPr>
+        <w:t>t</w:t>
+      </w:r>
+      <w:r>
+        <w:rPr>
+          <w:rFonts w:ascii="Arial" w:hAnsi="Arial" w:cs="Arial"/>
+        </w:rPr>
+        <w:t>he Solar Power Plant of capacity</w:t>
+      </w:r>
+      <w:r>
+        <w:rPr>
+          <w:rFonts w:ascii="Arial" w:hAnsi="Arial" w:cs="Arial"/>
+        </w:rPr>
+        <w:t xml:space="preserve"> {</w:t>
+      </w:r>
+      <w:proofErr w:type="spellStart"/>
+      <w:r>
+        <w:rPr>
+          <w:rFonts w:ascii="Arial" w:hAnsi="Arial" w:cs="Arial"/>
+        </w:rPr>
+        <w:t>net_solar_capacity</w:t>
+      </w:r>
+      <w:proofErr w:type="spellEnd"/>
+      <w:r>
+        <w:rPr>
+          <w:rFonts w:ascii="Arial" w:hAnsi="Arial" w:cs="Arial"/>
+        </w:rPr>
+        <w:t>}</w:t>
+      </w:r>
+      <w:r>
+        <w:rPr>
+          <w:rFonts w:ascii="Arial" w:hAnsi="Arial" w:cs="Arial"/>
+        </w:rPr>
         <w:t xml:space="preserve"> </w:t>
       </w:r>
       <w:r>
         <w:rPr>
-          <w:b w:val="1"/>
-          <w:bCs w:val="1"/>
-          <w:sz w:val="28"/>
-          <w:szCs w:val="28"/>
-          <w:u w:val="single"/>
-        </w:rPr>
-        <w:t>Certificate</w:t>
-      </w:r>
-    </w:p>
-    <w:p xmlns:wp14="http://schemas.microsoft.com/office/word/2010/wordml" wp14:textId="77777777">
+          <w:rFonts w:ascii="Arial" w:hAnsi="Arial" w:cs="Arial"/>
+        </w:rPr>
+        <w:t>K</w:t>
+      </w:r>
+      <w:r>
+        <w:rPr>
+          <w:rFonts w:ascii="Arial" w:hAnsi="Arial" w:cs="Arial"/>
+        </w:rPr>
+        <w:t>W</w:t>
+      </w:r>
+      <w:r>
+        <w:rPr>
+          <w:rFonts w:ascii="Arial" w:hAnsi="Arial" w:cs="Arial"/>
+        </w:rPr>
+        <w:t xml:space="preserve"> </w:t>
+      </w:r>
+      <w:r>
+        <w:rPr>
+          <w:rFonts w:ascii="Arial" w:hAnsi="Arial" w:cs="Arial"/>
+        </w:rPr>
+        <w:t xml:space="preserve">installed by </w:t>
+      </w:r>
+      <w:proofErr w:type="spellStart"/>
+      <w:r>
+        <w:rPr>
+          <w:rFonts w:ascii="Arial" w:hAnsi="Arial" w:cs="Arial"/>
+        </w:rPr>
+        <w:t>Mamta</w:t>
+      </w:r>
+      <w:proofErr w:type="spellEnd"/>
+      <w:r>
+        <w:rPr>
+          <w:rFonts w:ascii="Arial" w:hAnsi="Arial" w:cs="Arial"/>
+        </w:rPr>
+        <w:t xml:space="preserve"> Enterprises</w:t>
+      </w:r>
+      <w:r>
+        <w:rPr>
+          <w:rFonts w:ascii="Arial" w:hAnsi="Arial" w:cs="Arial"/>
+        </w:rPr>
+        <w:t xml:space="preserve"> at</w:t>
+      </w:r>
+      <w:r>
+        <w:rPr>
+          <w:rFonts w:ascii="Arial" w:hAnsi="Arial" w:cs="Arial"/>
+        </w:rPr>
+        <w:t xml:space="preserve"> </w:t>
+      </w:r>
+      <w:r>
+        <w:rPr>
+          <w:rFonts w:ascii="Arial" w:hAnsi="Arial" w:cs="Arial"/>
+        </w:rPr>
+        <w:t>{</w:t>
+      </w:r>
+      <w:proofErr w:type="spellStart"/>
+      <w:r>
+        <w:rPr>
+          <w:rFonts w:ascii="Arial" w:hAnsi="Arial" w:cs="Arial"/>
+        </w:rPr>
+        <w:t>consumer_name</w:t>
+      </w:r>
+      <w:proofErr w:type="spellEnd"/>
+      <w:r>
+        <w:rPr>
+          <w:rFonts w:ascii="Arial" w:hAnsi="Arial" w:cs="Arial"/>
+        </w:rPr>
+        <w:t>}</w:t>
+      </w:r>
+      <w:r>
+        <w:rPr>
+          <w:rFonts w:ascii="Arial" w:hAnsi="Arial" w:cs="Arial"/>
+        </w:rPr>
+        <w:t>,</w:t>
+      </w:r>
+      <w:r>
+        <w:rPr>
+          <w:rFonts w:ascii="Arial" w:hAnsi="Arial" w:cs="Arial"/>
+        </w:rPr>
+        <w:t xml:space="preserve"> {</w:t>
+      </w:r>
+      <w:proofErr w:type="spellStart"/>
+      <w:r>
+        <w:rPr>
+          <w:rFonts w:ascii="Arial" w:hAnsi="Arial" w:cs="Arial"/>
+        </w:rPr>
+        <w:t>consumer_address</w:t>
+      </w:r>
+      <w:proofErr w:type="spellEnd"/>
+      <w:r>
+        <w:rPr>
+          <w:rFonts w:ascii="Arial" w:hAnsi="Arial" w:cs="Arial"/>
+        </w:rPr>
+        <w:t>}</w:t>
+      </w:r>
+      <w:r>
+        <w:rPr>
+          <w:rFonts w:ascii="Arial" w:hAnsi="Arial" w:cs="Arial"/>
+        </w:rPr>
+        <w:t>,</w:t>
+      </w:r>
+      <w:r>
+        <w:rPr>
+          <w:rFonts w:ascii="Arial" w:hAnsi="Arial" w:cs="Arial"/>
+        </w:rPr>
+        <w:t xml:space="preserve"> Invoice No.</w:t>
+      </w:r>
+      <w:r>
+        <w:rPr>
+          <w:rFonts w:ascii="Arial" w:hAnsi="Arial" w:cs="Arial"/>
+        </w:rPr>
+        <w:t xml:space="preserve"> </w:t>
+      </w:r>
+      <w:r>
+        <w:rPr>
+          <w:rFonts w:ascii="Arial" w:hAnsi="Arial" w:cs="Arial"/>
+        </w:rPr>
+        <w:t>{</w:t>
+      </w:r>
+      <w:proofErr w:type="spellStart"/>
+      <w:r>
+        <w:rPr>
+          <w:rFonts w:ascii="Arial" w:hAnsi="Arial" w:cs="Arial"/>
+        </w:rPr>
+        <w:t>invoice_number</w:t>
+      </w:r>
+      <w:proofErr w:type="spellEnd"/>
+      <w:r>
+        <w:rPr>
+          <w:rFonts w:ascii="Arial" w:hAnsi="Arial" w:cs="Arial"/>
+        </w:rPr>
+        <w:t>}</w:t>
+      </w:r>
+      <w:r>
+        <w:rPr>
+          <w:rFonts w:ascii="Arial" w:hAnsi="Arial" w:cs="Arial"/>
+        </w:rPr>
+        <w:t xml:space="preserve">, Dated: </w:t>
+      </w:r>
+      <w:r>
+        <w:rPr>
+          <w:rFonts w:ascii="Arial" w:hAnsi="Arial" w:cs="Arial"/>
+        </w:rPr>
+        <w:t>{</w:t>
+      </w:r>
+      <w:proofErr w:type="spellStart"/>
+      <w:r>
+        <w:rPr>
+          <w:rFonts w:ascii="Arial" w:hAnsi="Arial" w:cs="Arial"/>
+        </w:rPr>
+        <w:t>invoice_date</w:t>
+      </w:r>
+      <w:proofErr w:type="spellEnd"/>
+      <w:r>
+        <w:rPr>
+          <w:rFonts w:ascii="Arial" w:hAnsi="Arial" w:cs="Arial"/>
+        </w:rPr>
+        <w:t>}</w:t>
+      </w:r>
+      <w:r>
+        <w:rPr>
+          <w:rFonts w:ascii="Arial" w:hAnsi="Arial" w:cs="Arial"/>
+        </w:rPr>
+        <w:t xml:space="preserve">, </w:t>
+      </w:r>
+      <w:r>
+        <w:rPr>
+          <w:rFonts w:ascii="Arial" w:hAnsi="Arial" w:cs="Arial"/>
+        </w:rPr>
+        <w:t>in this system we have inst</w:t>
+      </w:r>
+      <w:r>
+        <w:rPr>
+          <w:rFonts w:ascii="Arial" w:hAnsi="Arial" w:cs="Arial"/>
+        </w:rPr>
+        <w:t xml:space="preserve">alled one inverter of capacity </w:t>
+      </w:r>
+      <w:r>
+        <w:rPr>
+          <w:rFonts w:ascii="Arial" w:hAnsi="Arial" w:cs="Arial"/>
+        </w:rPr>
+        <w:t>{</w:t>
+      </w:r>
+      <w:proofErr w:type="spellStart"/>
+      <w:r>
+        <w:rPr>
+          <w:rFonts w:ascii="Arial" w:hAnsi="Arial" w:cs="Arial"/>
+        </w:rPr>
+        <w:t>inverter_capacity</w:t>
+      </w:r>
+      <w:proofErr w:type="spellEnd"/>
+      <w:r>
+        <w:rPr>
+          <w:rFonts w:ascii="Arial" w:hAnsi="Arial" w:cs="Arial"/>
+        </w:rPr>
+        <w:t>}</w:t>
+      </w:r>
+      <w:r>
+        <w:rPr>
+          <w:rFonts w:ascii="Arial" w:hAnsi="Arial" w:cs="Arial"/>
+        </w:rPr>
+        <w:t xml:space="preserve"> KW</w:t>
+      </w:r>
+      <w:r>
+        <w:rPr>
+          <w:rFonts w:ascii="Arial" w:hAnsi="Arial" w:cs="Arial"/>
+        </w:rPr>
+        <w:t xml:space="preserve"> and</w:t>
+      </w:r>
+      <w:r>
+        <w:rPr>
+          <w:rFonts w:ascii="Arial" w:hAnsi="Arial" w:cs="Arial"/>
+        </w:rPr>
+        <w:t xml:space="preserve"> {</w:t>
+      </w:r>
+      <w:proofErr w:type="spellStart"/>
+      <w:r>
+        <w:rPr>
+          <w:rFonts w:ascii="Arial" w:hAnsi="Arial" w:cs="Arial"/>
+        </w:rPr>
+        <w:t>no_of_panels</w:t>
+      </w:r>
+      <w:proofErr w:type="spellEnd"/>
+      <w:r>
+        <w:rPr>
+          <w:rFonts w:ascii="Arial" w:hAnsi="Arial" w:cs="Arial"/>
+        </w:rPr>
+        <w:t xml:space="preserve">} </w:t>
+      </w:r>
+      <w:r>
+        <w:rPr>
+          <w:rFonts w:ascii="Arial" w:hAnsi="Arial" w:cs="Arial"/>
+        </w:rPr>
+        <w:t>module</w:t>
+      </w:r>
+      <w:r>
+        <w:rPr>
+          <w:rFonts w:ascii="Arial" w:hAnsi="Arial" w:cs="Arial"/>
+        </w:rPr>
+        <w:t>s</w:t>
+      </w:r>
+      <w:r>
+        <w:rPr>
+          <w:rFonts w:ascii="Arial" w:hAnsi="Arial" w:cs="Arial"/>
+        </w:rPr>
+        <w:t xml:space="preserve"> of </w:t>
+      </w:r>
+      <w:r>
+        <w:rPr>
+          <w:rFonts w:ascii="Arial" w:hAnsi="Arial" w:cs="Arial"/>
+        </w:rPr>
+        <w:t>{</w:t>
+      </w:r>
+      <w:proofErr w:type="spellStart"/>
+      <w:r>
+        <w:rPr>
+          <w:rFonts w:ascii="Arial" w:hAnsi="Arial" w:cs="Arial"/>
+        </w:rPr>
+        <w:t>panel_capacity</w:t>
+      </w:r>
+      <w:proofErr w:type="spellEnd"/>
+      <w:r>
+        <w:rPr>
+          <w:rFonts w:ascii="Arial" w:hAnsi="Arial" w:cs="Arial"/>
+        </w:rPr>
+        <w:t>}</w:t>
+      </w:r>
+      <w:r>
+        <w:rPr>
+          <w:rFonts w:ascii="Arial" w:hAnsi="Arial" w:cs="Arial"/>
+        </w:rPr>
+        <w:t xml:space="preserve"> watt</w:t>
+      </w:r>
+    </w:p>
+    <w:p>
       <w:pPr>
         <w:ind w:left="1440" w:right="1440"/>
         <w:rPr>
@@ -99,38 +421,26 @@
         <w:rPr>
           <w:rFonts w:ascii="Arial" w:hAnsi="Arial" w:cs="Arial"/>
         </w:rPr>
-        <w:t>It is c</w:t>
-      </w:r>
-      <w:r>
-        <w:rPr>
-          <w:rFonts w:ascii="Arial" w:hAnsi="Arial" w:cs="Arial"/>
-        </w:rPr>
-        <w:t xml:space="preserve">ertified that </w:t>
-      </w:r>
-      <w:r>
-        <w:rPr>
-          <w:rFonts w:ascii="Arial" w:hAnsi="Arial" w:cs="Arial"/>
-        </w:rPr>
-        <w:t>t</w:t>
-      </w:r>
-      <w:r>
-        <w:rPr>
-          <w:rFonts w:ascii="Arial" w:hAnsi="Arial" w:cs="Arial"/>
-        </w:rPr>
-        <w:t>he Solar Power Plant of capacity</w:t>
-      </w:r>
-      <w:r>
-        <w:rPr>
-          <w:rFonts w:ascii="Arial" w:hAnsi="Arial" w:cs="Arial"/>
-        </w:rPr>
-        <w:t xml:space="preserve"> {</w:t>
+        <w:t xml:space="preserve">  Make of Inverter              :   </w:t>
+      </w:r>
+      <w:r>
+        <w:rPr>
+          <w:rFonts w:ascii="Arial" w:hAnsi="Arial" w:cs="Arial"/>
+        </w:rPr>
+        <w:t>{</w:t>
       </w:r>
       <w:proofErr w:type="spellStart"/>
       <w:r>
         <w:rPr>
           <w:rFonts w:ascii="Arial" w:hAnsi="Arial" w:cs="Arial"/>
         </w:rPr>
-        <w:t>net_solar_capacity</w:t>
+        <w:t>inverter</w:t>
+      </w:r>
+      <w:r>
+        <w:rPr>
+          <w:rFonts w:ascii="Arial" w:hAnsi="Arial" w:cs="Arial"/>
+        </w:rPr>
+        <w:t>_brand</w:t>
       </w:r>
       <w:proofErr w:type="spellEnd"/>
       <w:r>
@@ -139,41 +449,145 @@
         </w:rPr>
         <w:t>}</w:t>
       </w:r>
-      <w:r>
-        <w:rPr>
-          <w:rFonts w:ascii="Arial" w:hAnsi="Arial" w:cs="Arial"/>
-        </w:rPr>
-        <w:t xml:space="preserve"> </w:t>
-      </w:r>
-      <w:r>
-        <w:rPr>
-          <w:rFonts w:ascii="Arial" w:hAnsi="Arial" w:cs="Arial"/>
-        </w:rPr>
-        <w:t>K</w:t>
-      </w:r>
-      <w:r>
-        <w:rPr>
-          <w:rFonts w:ascii="Arial" w:hAnsi="Arial" w:cs="Arial"/>
-        </w:rPr>
-        <w:t>W</w:t>
-      </w:r>
-      <w:r>
-        <w:rPr>
-          <w:rFonts w:ascii="Arial" w:hAnsi="Arial" w:cs="Arial"/>
-        </w:rPr>
-        <w:t xml:space="preserve"> </w:t>
-      </w:r>
-      <w:r>
-        <w:rPr>
-          <w:rFonts w:ascii="Arial" w:hAnsi="Arial" w:cs="Arial"/>
-        </w:rPr>
-        <w:t xml:space="preserve">installed by </w:t>
+    </w:p>
+    <w:p>
+      <w:pPr>
+        <w:ind w:left="1440" w:right="1440"/>
+        <w:rPr>
+          <w:rFonts w:ascii="Arial" w:hAnsi="Arial" w:cs="Arial"/>
+        </w:rPr>
+      </w:pPr>
+      <w:r>
+        <w:rPr>
+          <w:rFonts w:ascii="Arial" w:hAnsi="Arial" w:cs="Arial"/>
+        </w:rPr>
+        <w:t xml:space="preserve">  Make of Module</w:t>
+      </w:r>
+      <w:r>
+        <w:rPr>
+          <w:rFonts w:ascii="Arial" w:hAnsi="Arial" w:cs="Arial"/>
+        </w:rPr>
+        <w:t xml:space="preserve">              :   </w:t>
+      </w:r>
+      <w:r>
+        <w:rPr>
+          <w:rFonts w:ascii="Arial" w:hAnsi="Arial" w:cs="Arial"/>
+        </w:rPr>
+        <w:t>{</w:t>
       </w:r>
       <w:proofErr w:type="spellStart"/>
       <w:r>
         <w:rPr>
           <w:rFonts w:ascii="Arial" w:hAnsi="Arial" w:cs="Arial"/>
         </w:rPr>
+        <w:t>panel</w:t>
+      </w:r>
+      <w:r>
+        <w:rPr>
+          <w:rFonts w:ascii="Arial" w:hAnsi="Arial" w:cs="Arial"/>
+        </w:rPr>
+        <w:t>_brand</w:t>
+      </w:r>
+      <w:proofErr w:type="spellEnd"/>
+      <w:r>
+        <w:rPr>
+          <w:rFonts w:ascii="Arial" w:hAnsi="Arial" w:cs="Arial"/>
+        </w:rPr>
+        <w:t>}</w:t>
+      </w:r>
+    </w:p>
+    <w:p>
+      <w:pPr>
+        <w:ind w:left="1440" w:right="1440"/>
+        <w:rPr>
+          <w:rFonts w:ascii="Arial" w:hAnsi="Arial" w:cs="Arial"/>
+        </w:rPr>
+      </w:pPr>
+      <w:r>
+        <w:rPr>
+          <w:rFonts w:ascii="Arial" w:hAnsi="Arial" w:cs="Arial"/>
+        </w:rPr>
+        <w:t xml:space="preserve">  Number of </w:t>
+      </w:r>
+      <w:proofErr w:type="spellStart"/>
+      <w:r>
+        <w:rPr>
+          <w:rFonts w:ascii="Arial" w:hAnsi="Arial" w:cs="Arial"/>
+        </w:rPr>
+        <w:t>Earthing</w:t>
+      </w:r>
+      <w:proofErr w:type="spellEnd"/>
+      <w:r>
+        <w:rPr>
+          <w:rFonts w:ascii="Arial" w:hAnsi="Arial" w:cs="Arial"/>
+        </w:rPr>
+        <w:t xml:space="preserve">         : </w:t>
+      </w:r>
+      <w:r>
+        <w:rPr>
+          <w:rFonts w:ascii="Arial" w:hAnsi="Arial" w:cs="Arial"/>
+        </w:rPr>
+        <w:t xml:space="preserve">  </w:t>
+      </w:r>
+      <w:r>
+        <w:rPr>
+          <w:rFonts w:ascii="Arial" w:hAnsi="Arial" w:cs="Arial"/>
+        </w:rPr>
+        <w:t>3</w:t>
+      </w:r>
+    </w:p>
+    <w:p>
+      <w:pPr>
+        <w:ind w:left="1440" w:right="1440"/>
+        <w:rPr>
+          <w:rFonts w:ascii="Arial" w:hAnsi="Arial" w:cs="Arial"/>
+        </w:rPr>
+      </w:pPr>
+      <w:r>
+        <w:rPr>
+          <w:rFonts w:ascii="Arial" w:hAnsi="Arial" w:cs="Arial"/>
+        </w:rPr>
+        <w:t xml:space="preserve">  Surge Protection </w:t>
+      </w:r>
+      <w:proofErr w:type="gramStart"/>
+      <w:r>
+        <w:rPr>
+          <w:rFonts w:ascii="Arial" w:hAnsi="Arial" w:cs="Arial"/>
+        </w:rPr>
+        <w:t>Device :</w:t>
+      </w:r>
+      <w:proofErr w:type="gramEnd"/>
+      <w:r>
+        <w:rPr>
+          <w:rFonts w:ascii="Arial" w:hAnsi="Arial" w:cs="Arial"/>
+        </w:rPr>
+        <w:t xml:space="preserve">   </w:t>
+      </w:r>
+      <w:r>
+        <w:rPr>
+          <w:rFonts w:ascii="Arial" w:hAnsi="Arial" w:cs="Arial"/>
+        </w:rPr>
+        <w:t>Yes</w:t>
+      </w:r>
+    </w:p>
+    <w:p>
+      <w:pPr>
+        <w:ind w:left="1440" w:right="1440"/>
+        <w:rPr>
+          <w:rFonts w:ascii="Arial" w:hAnsi="Arial" w:cs="Arial"/>
+        </w:rPr>
+      </w:pPr>
+      <w:r>
+        <w:rPr>
+          <w:rFonts w:ascii="Arial" w:hAnsi="Arial" w:cs="Arial"/>
+        </w:rPr>
+        <w:t xml:space="preserve">We, </w:t>
+      </w:r>
+      <w:proofErr w:type="spellStart"/>
+      <w:r>
+        <w:rPr>
+          <w:rFonts w:ascii="Arial" w:hAnsi="Arial" w:cs="Arial"/>
+        </w:rPr>
         <w:t>Mamta</w:t>
       </w:r>
       <w:proofErr w:type="spellEnd"/>
@@ -181,504 +595,62 @@
         <w:rPr>
           <w:rFonts w:ascii="Arial" w:hAnsi="Arial" w:cs="Arial"/>
         </w:rPr>
-        <w:t xml:space="preserve"> Enterprises</w:t>
-      </w:r>
-      <w:r>
-        <w:rPr>
-          <w:rFonts w:ascii="Arial" w:hAnsi="Arial" w:cs="Arial"/>
-        </w:rPr>
-        <w:t xml:space="preserve"> at</w:t>
-      </w:r>
-      <w:r>
-        <w:rPr>
-          <w:rFonts w:ascii="Arial" w:hAnsi="Arial" w:cs="Arial"/>
-        </w:rPr>
-        <w:t xml:space="preserve"> </w:t>
-      </w:r>
-      <w:r>
-        <w:rPr>
-          <w:rFonts w:ascii="Arial" w:hAnsi="Arial" w:cs="Arial"/>
-        </w:rPr>
-        <w:t>{</w:t>
+        <w:t xml:space="preserve"> Enterprises, </w:t>
+      </w:r>
+      <w:r>
+        <w:rPr>
+          <w:rFonts w:ascii="Arial" w:hAnsi="Arial" w:cs="Arial"/>
+        </w:rPr>
+        <w:t xml:space="preserve">near Bank of India, </w:t>
       </w:r>
       <w:proofErr w:type="spellStart"/>
       <w:r>
         <w:rPr>
           <w:rFonts w:ascii="Arial" w:hAnsi="Arial" w:cs="Arial"/>
         </w:rPr>
-        <w:t>consumer_name</w:t>
+        <w:t>Jind</w:t>
       </w:r>
       <w:proofErr w:type="spellEnd"/>
       <w:r>
         <w:rPr>
           <w:rFonts w:ascii="Arial" w:hAnsi="Arial" w:cs="Arial"/>
         </w:rPr>
-        <w:t>}</w:t>
-      </w:r>
-      <w:r>
-        <w:rPr>
-          <w:rFonts w:ascii="Arial" w:hAnsi="Arial" w:cs="Arial"/>
-        </w:rPr>
-        <w:t>,</w:t>
-      </w:r>
-      <w:r>
-        <w:rPr>
-          <w:rFonts w:ascii="Arial" w:hAnsi="Arial" w:cs="Arial"/>
-        </w:rPr>
-        <w:t xml:space="preserve"> {</w:t>
-      </w:r>
-      <w:proofErr w:type="spellStart"/>
-      <w:r>
-        <w:rPr>
-          <w:rFonts w:ascii="Arial" w:hAnsi="Arial" w:cs="Arial"/>
-        </w:rPr>
-        <w:t>consumer_address</w:t>
-      </w:r>
-      <w:proofErr w:type="spellEnd"/>
-      <w:r>
-        <w:rPr>
-          <w:rFonts w:ascii="Arial" w:hAnsi="Arial" w:cs="Arial"/>
-        </w:rPr>
-        <w:t>}</w:t>
-      </w:r>
-      <w:r>
-        <w:rPr>
-          <w:rFonts w:ascii="Arial" w:hAnsi="Arial" w:cs="Arial"/>
-        </w:rPr>
-        <w:t>,</w:t>
-      </w:r>
-      <w:r>
-        <w:rPr>
-          <w:rFonts w:ascii="Arial" w:hAnsi="Arial" w:cs="Arial"/>
-        </w:rPr>
-        <w:t xml:space="preserve"> Invoice No.</w:t>
-      </w:r>
-      <w:r>
-        <w:rPr>
-          <w:rFonts w:ascii="Arial" w:hAnsi="Arial" w:cs="Arial"/>
-        </w:rPr>
-        <w:t xml:space="preserve"> </w:t>
-      </w:r>
-      <w:r>
-        <w:rPr>
-          <w:rFonts w:ascii="Arial" w:hAnsi="Arial" w:cs="Arial"/>
-        </w:rPr>
-        <w:t>{</w:t>
-      </w:r>
-      <w:proofErr w:type="spellStart"/>
-      <w:r>
-        <w:rPr>
-          <w:rFonts w:ascii="Arial" w:hAnsi="Arial" w:cs="Arial"/>
-        </w:rPr>
-        <w:t>invoice_number</w:t>
-      </w:r>
-      <w:proofErr w:type="spellEnd"/>
-      <w:r>
-        <w:rPr>
-          <w:rFonts w:ascii="Arial" w:hAnsi="Arial" w:cs="Arial"/>
-        </w:rPr>
-        <w:t>}</w:t>
-      </w:r>
-      <w:r>
-        <w:rPr>
-          <w:rFonts w:ascii="Arial" w:hAnsi="Arial" w:cs="Arial"/>
-        </w:rPr>
-        <w:t xml:space="preserve">, Dated: </w:t>
-      </w:r>
-      <w:r>
-        <w:rPr>
-          <w:rFonts w:ascii="Arial" w:hAnsi="Arial" w:cs="Arial"/>
-        </w:rPr>
-        <w:t>{</w:t>
-      </w:r>
-      <w:proofErr w:type="spellStart"/>
-      <w:r>
-        <w:rPr>
-          <w:rFonts w:ascii="Arial" w:hAnsi="Arial" w:cs="Arial"/>
-        </w:rPr>
-        <w:t>invoice_date</w:t>
-      </w:r>
-      <w:proofErr w:type="spellEnd"/>
-      <w:r>
-        <w:rPr>
-          <w:rFonts w:ascii="Arial" w:hAnsi="Arial" w:cs="Arial"/>
-        </w:rPr>
-        <w:t>}</w:t>
-      </w:r>
-      <w:r>
-        <w:rPr>
-          <w:rFonts w:ascii="Arial" w:hAnsi="Arial" w:cs="Arial"/>
-        </w:rPr>
-        <w:t xml:space="preserve">, </w:t>
-      </w:r>
-      <w:r>
-        <w:rPr>
-          <w:rFonts w:ascii="Arial" w:hAnsi="Arial" w:cs="Arial"/>
-        </w:rPr>
-        <w:t>in this system we have inst</w:t>
-      </w:r>
-      <w:r>
-        <w:rPr>
-          <w:rFonts w:ascii="Arial" w:hAnsi="Arial" w:cs="Arial"/>
-        </w:rPr>
-        <w:t xml:space="preserve">alled one inverter of capacity </w:t>
-      </w:r>
-      <w:r>
-        <w:rPr>
-          <w:rFonts w:ascii="Arial" w:hAnsi="Arial" w:cs="Arial"/>
-        </w:rPr>
-        <w:t>{</w:t>
-      </w:r>
-      <w:proofErr w:type="spellStart"/>
-      <w:r>
-        <w:rPr>
-          <w:rFonts w:ascii="Arial" w:hAnsi="Arial" w:cs="Arial"/>
-        </w:rPr>
-        <w:t>inverter_capacity</w:t>
-      </w:r>
-      <w:proofErr w:type="spellEnd"/>
-      <w:r>
-        <w:rPr>
-          <w:rFonts w:ascii="Arial" w:hAnsi="Arial" w:cs="Arial"/>
-        </w:rPr>
-        <w:t>}</w:t>
-      </w:r>
-      <w:r>
-        <w:rPr>
-          <w:rFonts w:ascii="Arial" w:hAnsi="Arial" w:cs="Arial"/>
-        </w:rPr>
-        <w:t xml:space="preserve"> KW</w:t>
-      </w:r>
-      <w:r>
-        <w:rPr>
-          <w:rFonts w:ascii="Arial" w:hAnsi="Arial" w:cs="Arial"/>
-        </w:rPr>
-        <w:t xml:space="preserve"> and</w:t>
-      </w:r>
-      <w:r>
-        <w:rPr>
-          <w:rFonts w:ascii="Arial" w:hAnsi="Arial" w:cs="Arial"/>
-        </w:rPr>
-        <w:t xml:space="preserve"> {</w:t>
-      </w:r>
-      <w:proofErr w:type="spellStart"/>
-      <w:r>
-        <w:rPr>
-          <w:rFonts w:ascii="Arial" w:hAnsi="Arial" w:cs="Arial"/>
-        </w:rPr>
-        <w:t>no_of_panels</w:t>
-      </w:r>
-      <w:proofErr w:type="spellEnd"/>
-      <w:r>
-        <w:rPr>
-          <w:rFonts w:ascii="Arial" w:hAnsi="Arial" w:cs="Arial"/>
-        </w:rPr>
-        <w:t xml:space="preserve">} </w:t>
-      </w:r>
-      <w:r>
-        <w:rPr>
-          <w:rFonts w:ascii="Arial" w:hAnsi="Arial" w:cs="Arial"/>
-        </w:rPr>
-        <w:t>module</w:t>
-      </w:r>
-      <w:r>
-        <w:rPr>
-          <w:rFonts w:ascii="Arial" w:hAnsi="Arial" w:cs="Arial"/>
-        </w:rPr>
-        <w:t>s</w:t>
-      </w:r>
-      <w:r>
-        <w:rPr>
-          <w:rFonts w:ascii="Arial" w:hAnsi="Arial" w:cs="Arial"/>
-        </w:rPr>
-        <w:t xml:space="preserve"> of </w:t>
-      </w:r>
-      <w:r>
-        <w:rPr>
-          <w:rFonts w:ascii="Arial" w:hAnsi="Arial" w:cs="Arial"/>
-        </w:rPr>
-        <w:t>{</w:t>
-      </w:r>
-      <w:proofErr w:type="spellStart"/>
-      <w:r>
-        <w:rPr>
-          <w:rFonts w:ascii="Arial" w:hAnsi="Arial" w:cs="Arial"/>
-        </w:rPr>
-        <w:t>panel_capacity</w:t>
-      </w:r>
-      <w:proofErr w:type="spellEnd"/>
-      <w:r>
-        <w:rPr>
-          <w:rFonts w:ascii="Arial" w:hAnsi="Arial" w:cs="Arial"/>
-        </w:rPr>
-        <w:t>}</w:t>
-      </w:r>
-      <w:r>
-        <w:rPr>
-          <w:rFonts w:ascii="Arial" w:hAnsi="Arial" w:cs="Arial"/>
-        </w:rPr>
-        <w:t xml:space="preserve"> watt</w:t>
-      </w:r>
-    </w:p>
-    <w:p xmlns:wp14="http://schemas.microsoft.com/office/word/2010/wordml" wp14:textId="77777777">
-      <w:pPr>
-        <w:ind w:left="1440" w:right="1440"/>
-        <w:rPr>
-          <w:rFonts w:ascii="Arial" w:hAnsi="Arial" w:cs="Arial"/>
-        </w:rPr>
-      </w:pPr>
-      <w:r>
-        <w:rPr>
-          <w:rFonts w:ascii="Arial" w:hAnsi="Arial" w:cs="Arial"/>
-        </w:rPr>
-        <w:t xml:space="preserve">  Make of Inverter              :   </w:t>
-      </w:r>
-      <w:r>
-        <w:rPr>
-          <w:rFonts w:ascii="Arial" w:hAnsi="Arial" w:cs="Arial"/>
-        </w:rPr>
-        <w:t xml:space="preserve">  </w:t>
-      </w:r>
-      <w:r>
-        <w:rPr>
-          <w:rFonts w:ascii="Arial" w:hAnsi="Arial" w:cs="Arial"/>
-        </w:rPr>
-        <w:t xml:space="preserve"> </w:t>
-      </w:r>
-      <w:r>
-        <w:rPr>
-          <w:rFonts w:ascii="Arial" w:hAnsi="Arial" w:cs="Arial"/>
-        </w:rPr>
-        <w:t>{</w:t>
-      </w:r>
-      <w:proofErr w:type="spellStart"/>
-      <w:r>
-        <w:rPr>
-          <w:rFonts w:ascii="Arial" w:hAnsi="Arial" w:cs="Arial"/>
-        </w:rPr>
-        <w:t>inverter</w:t>
-      </w:r>
-      <w:r>
-        <w:rPr>
-          <w:rFonts w:ascii="Arial" w:hAnsi="Arial" w:cs="Arial"/>
-        </w:rPr>
-        <w:t>_brand</w:t>
-      </w:r>
-      <w:proofErr w:type="spellEnd"/>
-      <w:r>
-        <w:rPr>
-          <w:rFonts w:ascii="Arial" w:hAnsi="Arial" w:cs="Arial"/>
-        </w:rPr>
-        <w:t>}</w:t>
-      </w:r>
-    </w:p>
-    <w:p xmlns:wp14="http://schemas.microsoft.com/office/word/2010/wordml" wp14:textId="77777777">
-      <w:pPr>
-        <w:ind w:left="1440" w:right="1440"/>
-        <w:rPr>
-          <w:rFonts w:ascii="Arial" w:hAnsi="Arial" w:cs="Arial"/>
-        </w:rPr>
-      </w:pPr>
-      <w:r>
-        <w:rPr>
-          <w:rFonts w:ascii="Arial" w:hAnsi="Arial" w:cs="Arial"/>
-        </w:rPr>
-        <w:t xml:space="preserve">  Make of Module</w:t>
-      </w:r>
-      <w:r>
-        <w:rPr>
-          <w:rFonts w:ascii="Arial" w:hAnsi="Arial" w:cs="Arial"/>
-        </w:rPr>
-        <w:t xml:space="preserve">              :</w:t>
-      </w:r>
-      <w:r>
-        <w:rPr>
-          <w:rFonts w:ascii="Arial" w:hAnsi="Arial" w:cs="Arial"/>
-        </w:rPr>
-        <w:tab/>
-      </w:r>
-      <w:r>
-        <w:rPr>
-          <w:rFonts w:ascii="Arial" w:hAnsi="Arial" w:cs="Arial"/>
-        </w:rPr>
-        <w:t xml:space="preserve">  {</w:t>
-      </w:r>
-      <w:proofErr w:type="spellStart"/>
-      <w:r>
-        <w:rPr>
-          <w:rFonts w:ascii="Arial" w:hAnsi="Arial" w:cs="Arial"/>
-        </w:rPr>
-        <w:t>panel</w:t>
-      </w:r>
-      <w:r>
-        <w:rPr>
-          <w:rFonts w:ascii="Arial" w:hAnsi="Arial" w:cs="Arial"/>
-        </w:rPr>
-        <w:t>_brand</w:t>
-      </w:r>
-      <w:proofErr w:type="spellEnd"/>
-      <w:r>
-        <w:rPr>
-          <w:rFonts w:ascii="Arial" w:hAnsi="Arial" w:cs="Arial"/>
-        </w:rPr>
-        <w:t>}</w:t>
-      </w:r>
-    </w:p>
-    <w:p xmlns:wp14="http://schemas.microsoft.com/office/word/2010/wordml" wp14:textId="77777777">
-      <w:pPr>
-        <w:ind w:left="1440" w:right="1440"/>
-        <w:rPr>
-          <w:rFonts w:ascii="Arial" w:hAnsi="Arial" w:cs="Arial"/>
-        </w:rPr>
-      </w:pPr>
-      <w:r>
-        <w:rPr>
-          <w:rFonts w:ascii="Arial" w:hAnsi="Arial" w:cs="Arial"/>
-        </w:rPr>
-        <w:t xml:space="preserve">  Number of </w:t>
-      </w:r>
-      <w:proofErr w:type="spellStart"/>
-      <w:r>
-        <w:rPr>
-          <w:rFonts w:ascii="Arial" w:hAnsi="Arial" w:cs="Arial"/>
-        </w:rPr>
-        <w:t>Earthing</w:t>
-      </w:r>
-      <w:proofErr w:type="spellEnd"/>
-      <w:r>
-        <w:rPr>
-          <w:rFonts w:ascii="Arial" w:hAnsi="Arial" w:cs="Arial"/>
-        </w:rPr>
-        <w:t xml:space="preserve">         : </w:t>
-      </w:r>
-      <w:r>
-        <w:rPr>
-          <w:rFonts w:ascii="Arial" w:hAnsi="Arial" w:cs="Arial"/>
-        </w:rPr>
-        <w:t xml:space="preserve">     </w:t>
-      </w:r>
-      <w:r>
-        <w:rPr>
-          <w:rFonts w:ascii="Arial" w:hAnsi="Arial" w:cs="Arial"/>
-        </w:rPr>
-        <w:t>3</w:t>
-      </w:r>
-    </w:p>
-    <w:p xmlns:wp14="http://schemas.microsoft.com/office/word/2010/wordml" wp14:textId="77777777">
-      <w:pPr>
-        <w:ind w:left="1440" w:right="1440"/>
-        <w:rPr>
-          <w:rFonts w:ascii="Arial" w:hAnsi="Arial" w:cs="Arial"/>
-        </w:rPr>
-      </w:pPr>
-      <w:r>
-        <w:rPr>
-          <w:rFonts w:ascii="Arial" w:hAnsi="Arial" w:cs="Arial"/>
-        </w:rPr>
-        <w:t xml:space="preserve">  Surge Protection </w:t>
+        <w:t xml:space="preserve"> Road, </w:t>
+      </w:r>
+      <w:r>
+        <w:rPr>
+          <w:rFonts w:ascii="Arial" w:hAnsi="Arial" w:cs="Arial"/>
+        </w:rPr>
+        <w:t>Kaithal, HR, certify that this system is installed as pe</w:t>
+      </w:r>
+      <w:r>
+        <w:rPr>
+          <w:rFonts w:ascii="Arial" w:hAnsi="Arial" w:cs="Arial"/>
+        </w:rPr>
+        <w:t>r MNRE guidelines and is safe (</w:t>
+      </w:r>
+      <w:r>
+        <w:rPr>
+          <w:rFonts w:ascii="Arial" w:hAnsi="Arial" w:cs="Arial"/>
+        </w:rPr>
+        <w:t xml:space="preserve">all the safety measures are being taken care </w:t>
       </w:r>
       <w:proofErr w:type="gramStart"/>
       <w:r>
         <w:rPr>
           <w:rFonts w:ascii="Arial" w:hAnsi="Arial" w:cs="Arial"/>
         </w:rPr>
-        <w:t>Device :</w:t>
+        <w:t>of )</w:t>
       </w:r>
       <w:proofErr w:type="gramEnd"/>
       <w:r>
         <w:rPr>
           <w:rFonts w:ascii="Arial" w:hAnsi="Arial" w:cs="Arial"/>
         </w:rPr>
-        <w:t xml:space="preserve">      </w:t>
-      </w:r>
-      <w:r>
-        <w:rPr>
-          <w:rFonts w:ascii="Arial" w:hAnsi="Arial" w:cs="Arial"/>
-        </w:rPr>
-        <w:t>Yes</w:t>
-      </w:r>
-    </w:p>
-    <w:p xmlns:wp14="http://schemas.microsoft.com/office/word/2010/wordml" wp14:textId="77777777">
-      <w:pPr>
-        <w:ind w:left="1440" w:right="1440"/>
-        <w:rPr>
-          <w:rFonts w:ascii="Arial" w:hAnsi="Arial" w:cs="Arial"/>
-        </w:rPr>
-      </w:pPr>
-      <w:r>
-        <w:rPr>
-          <w:rFonts w:ascii="Arial" w:hAnsi="Arial" w:cs="Arial"/>
-        </w:rPr>
-        <w:t xml:space="preserve">We, </w:t>
-      </w:r>
-      <w:proofErr w:type="spellStart"/>
-      <w:r>
-        <w:rPr>
-          <w:rFonts w:ascii="Arial" w:hAnsi="Arial" w:cs="Arial"/>
-        </w:rPr>
-        <w:t>Mamta</w:t>
-      </w:r>
-      <w:proofErr w:type="spellEnd"/>
-      <w:r>
-        <w:rPr>
-          <w:rFonts w:ascii="Arial" w:hAnsi="Arial" w:cs="Arial"/>
-        </w:rPr>
-        <w:t xml:space="preserve"> Enterprises, </w:t>
-      </w:r>
-      <w:r>
-        <w:rPr>
-          <w:rFonts w:ascii="Arial" w:hAnsi="Arial" w:cs="Arial"/>
-        </w:rPr>
-        <w:t xml:space="preserve">near Bank of India, </w:t>
-      </w:r>
-      <w:proofErr w:type="spellStart"/>
-      <w:r>
-        <w:rPr>
-          <w:rFonts w:ascii="Arial" w:hAnsi="Arial" w:cs="Arial"/>
-        </w:rPr>
-        <w:t>Jind</w:t>
-      </w:r>
-      <w:proofErr w:type="spellEnd"/>
-      <w:r>
-        <w:rPr>
-          <w:rFonts w:ascii="Arial" w:hAnsi="Arial" w:cs="Arial"/>
-        </w:rPr>
-        <w:t xml:space="preserve"> Road, </w:t>
-      </w:r>
-      <w:r>
-        <w:rPr>
-          <w:rFonts w:ascii="Arial" w:hAnsi="Arial" w:cs="Arial"/>
-        </w:rPr>
-        <w:t>Kaithal, HR, certify that this system is installed as pe</w:t>
-      </w:r>
-      <w:r>
-        <w:rPr>
-          <w:rFonts w:ascii="Arial" w:hAnsi="Arial" w:cs="Arial"/>
-        </w:rPr>
-        <w:t>r MNRE guidelines and is safe (</w:t>
-      </w:r>
-      <w:r>
-        <w:rPr>
-          <w:rFonts w:ascii="Arial" w:hAnsi="Arial" w:cs="Arial"/>
-        </w:rPr>
-        <w:t xml:space="preserve">all the safety measures are being taken care </w:t>
-      </w:r>
-      <w:proofErr w:type="gramStart"/>
-      <w:r>
-        <w:rPr>
-          <w:rFonts w:ascii="Arial" w:hAnsi="Arial" w:cs="Arial"/>
-        </w:rPr>
-        <w:t>of )</w:t>
-      </w:r>
-      <w:proofErr w:type="gramEnd"/>
-      <w:r>
-        <w:rPr>
-          <w:rFonts w:ascii="Arial" w:hAnsi="Arial" w:cs="Arial"/>
-        </w:rPr>
         <w:t>.</w:t>
       </w:r>
     </w:p>
-    <w:p xmlns:wp14="http://schemas.microsoft.com/office/word/2010/wordml" wp14:textId="77777777">
+    <w:p>
       <w:pPr>
         <w:tabs>
           <w:tab w:val="left" w:pos="4140"/>
@@ -701,7 +673,7 @@
         <w:t>.</w:t>
       </w:r>
     </w:p>
-    <w:p xmlns:wp14="http://schemas.microsoft.com/office/word/2010/wordml" wp14:textId="77777777">
+    <w:p>
       <w:pPr>
         <w:ind w:left="1440" w:right="1440"/>
         <w:rPr>
@@ -709,7 +681,7 @@
         </w:rPr>
       </w:pPr>
     </w:p>
-    <w:p xmlns:wp14="http://schemas.microsoft.com/office/word/2010/wordml" wp14:textId="77777777">
+    <w:p>
       <w:pPr>
         <w:ind w:left="1440" w:right="1440"/>
         <w:rPr>
@@ -723,7 +695,7 @@
         <w:t>Yours truly,</w:t>
       </w:r>
     </w:p>
-    <w:p xmlns:wp14="http://schemas.microsoft.com/office/word/2010/wordml" wp14:textId="77777777">
+    <w:p>
       <w:pPr>
         <w:ind w:left="1440" w:right="1440"/>
         <w:rPr>
@@ -751,7 +723,7 @@
         <w:t xml:space="preserve"> Enterprises</w:t>
       </w:r>
     </w:p>
-    <w:p xmlns:wp14="http://schemas.microsoft.com/office/word/2010/wordml" wp14:textId="77777777">
+    <w:p>
       <w:pPr>
         <w:ind w:left="1440" w:right="1440"/>
         <w:rPr>
@@ -759,7 +731,7 @@
         </w:rPr>
       </w:pPr>
     </w:p>
-    <w:p xmlns:wp14="http://schemas.microsoft.com/office/word/2010/wordml" wp14:textId="77777777">
+    <w:p>
       <w:pPr>
         <w:ind w:left="1440" w:right="1440"/>
         <w:rPr>
@@ -776,12 +748,6 @@
         <w:rPr>
           <w:rFonts w:ascii="Arial" w:hAnsi="Arial" w:cs="Arial"/>
         </w:rPr>
-        <w:t xml:space="preserve"> </w:t>
-      </w:r>
-      <w:r>
-        <w:rPr>
-          <w:rFonts w:ascii="Arial" w:hAnsi="Arial" w:cs="Arial"/>
-        </w:rPr>
         <w:t>S</w:t>
       </w:r>
       <w:r>
@@ -791,7 +757,7 @@
         <w:t>ignatory</w:t>
       </w:r>
     </w:p>
-    <w:p xmlns:wp14="http://schemas.microsoft.com/office/word/2010/wordml" wp14:textId="77777777">
+    <w:p>
       <w:pPr>
         <w:jc w:val="center"/>
         <w:rPr>
@@ -809,8 +775,8 @@
       <w:pPr>
         <w:jc w:val="center"/>
         <w:rPr>
-          <w:b w:val="1"/>
-          <w:bCs w:val="1"/>
+          <w:b/>
+          <w:bCs/>
           <w:sz w:val="28"/>
           <w:szCs w:val="28"/>
           <w:u w:val="single"/>
@@ -821,8 +787,8 @@
       <w:pPr>
         <w:jc w:val="center"/>
         <w:rPr>
-          <w:b w:val="1"/>
-          <w:bCs w:val="1"/>
+          <w:b/>
+          <w:bCs/>
           <w:sz w:val="28"/>
           <w:szCs w:val="28"/>
           <w:u w:val="single"/>
@@ -833,8 +799,8 @@
       <w:pPr>
         <w:jc w:val="center"/>
         <w:rPr>
-          <w:b w:val="1"/>
-          <w:bCs w:val="1"/>
+          <w:b/>
+          <w:bCs/>
           <w:sz w:val="28"/>
           <w:szCs w:val="28"/>
           <w:u w:val="single"/>
@@ -845,8 +811,8 @@
       <w:pPr>
         <w:jc w:val="center"/>
         <w:rPr>
-          <w:b w:val="1"/>
-          <w:bCs w:val="1"/>
+          <w:b/>
+          <w:bCs/>
           <w:sz w:val="28"/>
           <w:szCs w:val="28"/>
           <w:u w:val="single"/>
@@ -857,8 +823,8 @@
       <w:pPr>
         <w:jc w:val="center"/>
         <w:rPr>
-          <w:b w:val="1"/>
-          <w:bCs w:val="1"/>
+          <w:b/>
+          <w:bCs/>
           <w:sz w:val="28"/>
           <w:szCs w:val="28"/>
           <w:u w:val="single"/>
@@ -866,8 +832,8 @@
       </w:pPr>
       <w:r>
         <w:rPr>
-          <w:b w:val="1"/>
-          <w:bCs w:val="1"/>
+          <w:b/>
+          <w:bCs/>
           <w:sz w:val="28"/>
           <w:szCs w:val="28"/>
           <w:u w:val="single"/>
@@ -886,31 +852,21 @@
         <w:rPr>
           <w:rFonts w:ascii="Arial" w:hAnsi="Arial" w:cs="Arial"/>
         </w:rPr>
-        <w:t>It is certified that the Solar Power Plant of capacity</w:t>
-      </w:r>
-      <w:r>
-        <w:rPr>
-          <w:rFonts w:ascii="Arial" w:hAnsi="Arial" w:cs="Arial"/>
-        </w:rPr>
-        <w:t xml:space="preserve"> {</w:t>
-      </w:r>
+        <w:t>It is certified that the Solar Power Plant of capacity {</w:t>
+      </w:r>
+      <w:proofErr w:type="spellStart"/>
       <w:r>
         <w:rPr>
           <w:rFonts w:ascii="Arial" w:hAnsi="Arial" w:cs="Arial"/>
         </w:rPr>
         <w:t>net_solar_capacity</w:t>
       </w:r>
-      <w:r>
-        <w:rPr>
-          <w:rFonts w:ascii="Arial" w:hAnsi="Arial" w:cs="Arial"/>
-        </w:rPr>
-        <w:t xml:space="preserve">} </w:t>
-      </w:r>
-      <w:r>
-        <w:rPr>
-          <w:rFonts w:ascii="Arial" w:hAnsi="Arial" w:cs="Arial"/>
-        </w:rPr>
-        <w:t>KW</w:t>
+      <w:proofErr w:type="spellEnd"/>
+      <w:r>
+        <w:rPr>
+          <w:rFonts w:ascii="Arial" w:hAnsi="Arial" w:cs="Arial"/>
+        </w:rPr>
+        <w:t>} KW</w:t>
       </w:r>
       <w:r>
         <w:rPr>
@@ -922,163 +878,21 @@
         <w:rPr>
           <w:rFonts w:ascii="Arial" w:hAnsi="Arial" w:cs="Arial"/>
         </w:rPr>
-        <w:t>installed by Mamta Enterprises at</w:t>
-      </w:r>
-      <w:r>
-        <w:rPr>
-          <w:rFonts w:ascii="Arial" w:hAnsi="Arial" w:cs="Arial"/>
-        </w:rPr>
-        <w:t xml:space="preserve"> {</w:t>
-      </w:r>
-      <w:r>
-        <w:rPr>
-          <w:rFonts w:ascii="Arial" w:hAnsi="Arial" w:cs="Arial"/>
-        </w:rPr>
-        <w:t>consumer_name</w:t>
-      </w:r>
-      <w:r>
-        <w:rPr>
-          <w:rFonts w:ascii="Arial" w:hAnsi="Arial" w:cs="Arial"/>
-        </w:rPr>
-        <w:t>}, {</w:t>
-      </w:r>
-      <w:r>
-        <w:rPr>
-          <w:rFonts w:ascii="Arial" w:hAnsi="Arial" w:cs="Arial"/>
-        </w:rPr>
-        <w:t>consumer_address</w:t>
-      </w:r>
-      <w:r>
-        <w:rPr>
-          <w:rFonts w:ascii="Arial" w:hAnsi="Arial" w:cs="Arial"/>
-        </w:rPr>
-        <w:t>},</w:t>
-      </w:r>
-      <w:r>
-        <w:rPr>
-          <w:rFonts w:ascii="Arial" w:hAnsi="Arial" w:cs="Arial"/>
-        </w:rPr>
-        <w:t xml:space="preserve"> Invoice No.</w:t>
-      </w:r>
-      <w:r>
-        <w:rPr>
-          <w:rFonts w:ascii="Arial" w:hAnsi="Arial" w:cs="Arial"/>
-        </w:rPr>
-        <w:t xml:space="preserve"> {</w:t>
-      </w:r>
-      <w:r>
-        <w:rPr>
-          <w:rFonts w:ascii="Arial" w:hAnsi="Arial" w:cs="Arial"/>
-        </w:rPr>
-        <w:t>invoice_number</w:t>
-      </w:r>
-      <w:r>
-        <w:rPr>
-          <w:rFonts w:ascii="Arial" w:hAnsi="Arial" w:cs="Arial"/>
-        </w:rPr>
-        <w:t>}</w:t>
-      </w:r>
-      <w:r>
-        <w:rPr>
-          <w:rFonts w:ascii="Arial" w:hAnsi="Arial" w:cs="Arial"/>
-        </w:rPr>
-        <w:t xml:space="preserve">, Dated: </w:t>
-      </w:r>
-      <w:r>
-        <w:rPr>
-          <w:rFonts w:ascii="Arial" w:hAnsi="Arial" w:cs="Arial"/>
-        </w:rPr>
-        <w:t>{</w:t>
-      </w:r>
-      <w:r>
-        <w:rPr>
-          <w:rFonts w:ascii="Arial" w:hAnsi="Arial" w:cs="Arial"/>
-        </w:rPr>
-        <w:t>invoice_date</w:t>
-      </w:r>
-      <w:r>
-        <w:rPr>
-          <w:rFonts w:ascii="Arial" w:hAnsi="Arial" w:cs="Arial"/>
-        </w:rPr>
-        <w:t xml:space="preserve">}, </w:t>
-      </w:r>
-      <w:r>
-        <w:rPr>
-          <w:rFonts w:ascii="Arial" w:hAnsi="Arial" w:cs="Arial"/>
-        </w:rPr>
-        <w:t xml:space="preserve">in this system we have installed one inverter of capacity </w:t>
-      </w:r>
-      <w:r>
-        <w:rPr>
-          <w:rFonts w:ascii="Arial" w:hAnsi="Arial" w:cs="Arial"/>
-        </w:rPr>
-        <w:t>{</w:t>
-      </w:r>
-      <w:r>
-        <w:rPr>
-          <w:rFonts w:ascii="Arial" w:hAnsi="Arial" w:cs="Arial"/>
-        </w:rPr>
-        <w:t>inverter_capacity</w:t>
-      </w:r>
-      <w:r>
-        <w:rPr>
-          <w:rFonts w:ascii="Arial" w:hAnsi="Arial" w:cs="Arial"/>
-        </w:rPr>
-        <w:t>}</w:t>
-      </w:r>
-      <w:r>
-        <w:rPr>
-          <w:rFonts w:ascii="Arial" w:hAnsi="Arial" w:cs="Arial"/>
-        </w:rPr>
-        <w:t xml:space="preserve"> KW and</w:t>
-      </w:r>
-      <w:r>
-        <w:rPr>
-          <w:rFonts w:ascii="Arial" w:hAnsi="Arial" w:cs="Arial"/>
-        </w:rPr>
-        <w:t xml:space="preserve"> {</w:t>
-      </w:r>
-      <w:r>
-        <w:rPr>
-          <w:rFonts w:ascii="Arial" w:hAnsi="Arial" w:cs="Arial"/>
-        </w:rPr>
-        <w:t>no_of_panels</w:t>
-      </w:r>
-      <w:r>
-        <w:rPr>
-          <w:rFonts w:ascii="Arial" w:hAnsi="Arial" w:cs="Arial"/>
-        </w:rPr>
-        <w:t xml:space="preserve">} </w:t>
-      </w:r>
-      <w:r>
-        <w:rPr>
-          <w:rFonts w:ascii="Arial" w:hAnsi="Arial" w:cs="Arial"/>
-        </w:rPr>
-        <w:t xml:space="preserve">modules of </w:t>
-      </w:r>
-      <w:r>
-        <w:rPr>
-          <w:rFonts w:ascii="Arial" w:hAnsi="Arial" w:cs="Arial"/>
-        </w:rPr>
-        <w:t>{</w:t>
-      </w:r>
-      <w:r>
-        <w:rPr>
-          <w:rFonts w:ascii="Arial" w:hAnsi="Arial" w:cs="Arial"/>
-        </w:rPr>
-        <w:t>panel_capacity</w:t>
-      </w:r>
-      <w:r>
-        <w:rPr>
-          <w:rFonts w:ascii="Arial" w:hAnsi="Arial" w:cs="Arial"/>
-        </w:rPr>
-        <w:t>}</w:t>
-      </w:r>
-      <w:r>
-        <w:rPr>
-          <w:rFonts w:ascii="Arial" w:hAnsi="Arial" w:cs="Arial"/>
-        </w:rPr>
-        <w:t xml:space="preserve"> watt</w:t>
+        <w:t xml:space="preserve">installed by </w:t>
+      </w:r>
+      <w:proofErr w:type="spellStart"/>
+      <w:r>
+        <w:rPr>
+          <w:rFonts w:ascii="Arial" w:hAnsi="Arial" w:cs="Arial"/>
+        </w:rPr>
+        <w:t>Mamta</w:t>
+      </w:r>
+      <w:proofErr w:type="spellEnd"/>
+      <w:r>
+        <w:rPr>
+          <w:rFonts w:ascii="Arial" w:hAnsi="Arial" w:cs="Arial"/>
+        </w:rPr>
+        <w:t xml:space="preserve"> Enterprises at {consumer_name}, {consumer_address}, Invoice No. {invoice_number}, Dated: {invoice_date}, in this system we have installed one inverter of capacity {inverter_capacity} KW and {no_of_panels} modules of {panel_capacity} watt</w:t>
       </w:r>
     </w:p>
     <w:p>
@@ -1092,25 +906,7 @@
         <w:rPr>
           <w:rFonts w:ascii="Arial" w:hAnsi="Arial" w:cs="Arial"/>
         </w:rPr>
-        <w:t xml:space="preserve">  Make of Inverter              :   </w:t>
-      </w:r>
-      <w:r>
-        <w:rPr>
-          <w:rFonts w:ascii="Arial" w:hAnsi="Arial" w:cs="Arial"/>
-        </w:rPr>
-        <w:t xml:space="preserve">   {</w:t>
-      </w:r>
-      <w:r>
-        <w:rPr>
-          <w:rFonts w:ascii="Arial" w:hAnsi="Arial" w:cs="Arial"/>
-        </w:rPr>
-        <w:t>inverter_brand</w:t>
-      </w:r>
-      <w:r>
-        <w:rPr>
-          <w:rFonts w:ascii="Arial" w:hAnsi="Arial" w:cs="Arial"/>
-        </w:rPr>
-        <w:t>}</w:t>
+        <w:t xml:space="preserve">  Make of Inverter              :      {inverter_brand}</w:t>
       </w:r>
     </w:p>
     <w:p>
@@ -1124,13 +920,7 @@
         <w:rPr>
           <w:rFonts w:ascii="Arial" w:hAnsi="Arial" w:cs="Arial"/>
         </w:rPr>
-        <w:t xml:space="preserve">  Make of Module</w:t>
-      </w:r>
-      <w:r>
-        <w:rPr>
-          <w:rFonts w:ascii="Arial" w:hAnsi="Arial" w:cs="Arial"/>
-        </w:rPr>
-        <w:t xml:space="preserve">              :</w:t>
+        <w:t xml:space="preserve">  Make of Module              :</w:t>
       </w:r>
       <w:r>
         <w:tab/>
@@ -1139,19 +929,7 @@
         <w:rPr>
           <w:rFonts w:ascii="Arial" w:hAnsi="Arial" w:cs="Arial"/>
         </w:rPr>
-        <w:t xml:space="preserve">  {</w:t>
-      </w:r>
-      <w:r>
-        <w:rPr>
-          <w:rFonts w:ascii="Arial" w:hAnsi="Arial" w:cs="Arial"/>
-        </w:rPr>
-        <w:t>panel_brand</w:t>
-      </w:r>
-      <w:r>
-        <w:rPr>
-          <w:rFonts w:ascii="Arial" w:hAnsi="Arial" w:cs="Arial"/>
-        </w:rPr>
-        <w:t>}</w:t>
+        <w:t xml:space="preserve">  {panel_brand}</w:t>
       </w:r>
     </w:p>
     <w:p>
@@ -1165,19 +943,7 @@
         <w:rPr>
           <w:rFonts w:ascii="Arial" w:hAnsi="Arial" w:cs="Arial"/>
         </w:rPr>
-        <w:t xml:space="preserve">  Number of Earthing</w:t>
-      </w:r>
-      <w:r>
-        <w:rPr>
-          <w:rFonts w:ascii="Arial" w:hAnsi="Arial" w:cs="Arial"/>
-        </w:rPr>
-        <w:t xml:space="preserve">         :      </w:t>
-      </w:r>
-      <w:r>
-        <w:rPr>
-          <w:rFonts w:ascii="Arial" w:hAnsi="Arial" w:cs="Arial"/>
-        </w:rPr>
-        <w:t>3</w:t>
+        <w:t xml:space="preserve">  Number of Earthing         :      3</w:t>
       </w:r>
     </w:p>
     <w:p>
@@ -1191,13 +957,21 @@
         <w:rPr>
           <w:rFonts w:ascii="Arial" w:hAnsi="Arial" w:cs="Arial"/>
         </w:rPr>
-        <w:t xml:space="preserve">  Surge Protection Device :</w:t>
-      </w:r>
-      <w:r>
-        <w:rPr>
-          <w:rFonts w:ascii="Arial" w:hAnsi="Arial" w:cs="Arial"/>
-        </w:rPr>
-        <w:t xml:space="preserve">      </w:t>
+        <w:t xml:space="preserve">  Surge Protection </w:t>
+      </w:r>
+      <w:proofErr w:type="gramStart"/>
+      <w:r>
+        <w:rPr>
+          <w:rFonts w:ascii="Arial" w:hAnsi="Arial" w:cs="Arial"/>
+        </w:rPr>
+        <w:t>Device :</w:t>
+      </w:r>
+      <w:proofErr w:type="gramEnd"/>
+      <w:r>
+        <w:rPr>
+          <w:rFonts w:ascii="Arial" w:hAnsi="Arial" w:cs="Arial"/>
+        </w:rPr>
+        <w:t xml:space="preserve"> </w:t>
       </w:r>
       <w:r>
         <w:rPr>
@@ -1217,8 +991,16 @@
         <w:rPr>
           <w:rFonts w:ascii="Arial" w:hAnsi="Arial" w:cs="Arial"/>
         </w:rPr>
-        <w:t>We, Mamta Enterprises, near Bank of India, Jind Road, Kaithal, HR, certify that this system is installed as per MNRE guidelines and is safe (all the safety measures are being taken care of )</w:t>
-      </w:r>
+        <w:t xml:space="preserve">We, Mamta Enterprises, near Bank of India, Jind Road, Kaithal, HR, certify that this system is installed as per MNRE guidelines and is safe (all the safety measures are being taken care </w:t>
+      </w:r>
+      <w:proofErr w:type="gramStart"/>
+      <w:r>
+        <w:rPr>
+          <w:rFonts w:ascii="Arial" w:hAnsi="Arial" w:cs="Arial"/>
+        </w:rPr>
+        <w:t>of )</w:t>
+      </w:r>
+      <w:proofErr w:type="gramEnd"/>
       <w:r>
         <w:rPr>
           <w:rFonts w:ascii="Arial" w:hAnsi="Arial" w:cs="Arial"/>
@@ -1229,7 +1011,7 @@
     <w:p>
       <w:pPr>
         <w:tabs>
-          <w:tab w:val="left" w:leader="none" w:pos="4140"/>
+          <w:tab w:val="left" w:pos="4140"/>
         </w:tabs>
         <w:ind w:left="1440" w:right="1440"/>
         <w:rPr>
@@ -1240,13 +1022,7 @@
         <w:rPr>
           <w:rFonts w:ascii="Arial" w:hAnsi="Arial" w:cs="Arial"/>
         </w:rPr>
-        <w:t>Thanking you</w:t>
-      </w:r>
-      <w:r>
-        <w:rPr>
-          <w:rFonts w:ascii="Arial" w:hAnsi="Arial" w:cs="Arial"/>
-        </w:rPr>
-        <w:t>.</w:t>
+        <w:t>Thanking you.</w:t>
       </w:r>
     </w:p>
     <w:p>
@@ -1304,24 +1080,11 @@
         <w:rPr>
           <w:rFonts w:ascii="Arial" w:hAnsi="Arial" w:cs="Arial"/>
         </w:rPr>
-        <w:t>Auth.</w:t>
-      </w:r>
-      <w:r>
-        <w:rPr>
-          <w:rFonts w:ascii="Arial" w:hAnsi="Arial" w:cs="Arial"/>
-        </w:rPr>
-        <w:t xml:space="preserve"> </w:t>
-      </w:r>
-      <w:r>
-        <w:rPr>
-          <w:rFonts w:ascii="Arial" w:hAnsi="Arial" w:cs="Arial"/>
-        </w:rPr>
-        <w:t>Signatory</w:t>
-      </w:r>
-    </w:p>
-    <w:p>
-      <w:pPr>
-        <w:pStyle w:val="Normal"/>
+        <w:t>Auth.Signatory</w:t>
+      </w:r>
+    </w:p>
+    <w:p>
+      <w:pPr>
         <w:jc w:val="center"/>
         <w:rPr>
           <w:rFonts w:ascii="Arial" w:hAnsi="Arial" w:cs="Arial"/>
@@ -1335,14 +1098,13 @@
     </w:p>
     <w:p>
       <w:pPr>
-        <w:pStyle w:val="Normal"/>
         <w:jc w:val="center"/>
         <w:rPr>
           <w:rFonts w:ascii="Arial" w:hAnsi="Arial" w:cs="Arial"/>
         </w:rPr>
       </w:pPr>
     </w:p>
-    <w:p xmlns:wp14="http://schemas.microsoft.com/office/word/2010/wordml" wp14:textId="77777777">
+    <w:p>
       <w:pPr>
         <w:jc w:val="center"/>
         <w:rPr>
@@ -1350,7 +1112,7 @@
         </w:rPr>
       </w:pPr>
     </w:p>
-    <w:p xmlns:wp14="http://schemas.microsoft.com/office/word/2010/wordml" wp14:textId="77777777">
+    <w:p>
       <w:pPr>
         <w:jc w:val="center"/>
         <w:rPr>
@@ -1358,7 +1120,7 @@
         </w:rPr>
       </w:pPr>
     </w:p>
-    <w:p xmlns:wp14="http://schemas.microsoft.com/office/word/2010/wordml" wp14:textId="77777777">
+    <w:p>
       <w:pPr>
         <w:jc w:val="center"/>
         <w:rPr>
@@ -1366,7 +1128,7 @@
         </w:rPr>
       </w:pPr>
     </w:p>
-    <w:p xmlns:wp14="http://schemas.microsoft.com/office/word/2010/wordml" wp14:textId="77777777">
+    <w:p>
       <w:pPr>
         <w:jc w:val="center"/>
         <w:rPr>
@@ -1383,7 +1145,7 @@
         <w:t>Warranty/Guarantee and Declaration Certificate</w:t>
       </w:r>
     </w:p>
-    <w:p xmlns:wp14="http://schemas.microsoft.com/office/word/2010/wordml" wp14:textId="77777777">
+    <w:p>
       <w:pPr>
         <w:ind w:left="1440" w:right="1440"/>
         <w:rPr>
@@ -1443,9 +1205,6 @@
       <w:r>
         <w:rPr>
           <w:rFonts w:ascii="Arial" w:hAnsi="Arial" w:cs="Arial"/>
-          <w:b/>
-          <w:sz w:val="24"/>
-          <w:szCs w:val="24"/>
         </w:rPr>
         <w:t xml:space="preserve"> </w:t>
       </w:r>
@@ -1638,7 +1397,7 @@
         <w:t xml:space="preserve"> 80% at the end of 25 years.</w:t>
       </w:r>
     </w:p>
-    <w:p xmlns:wp14="http://schemas.microsoft.com/office/word/2010/wordml" wp14:textId="77777777">
+    <w:p>
       <w:pPr>
         <w:ind w:left="1440" w:right="1440"/>
         <w:jc w:val="both"/>
@@ -1665,7 +1424,7 @@
         <w:t>grid Solar Power Plant installed is in compliance with the latest minimum.</w:t>
       </w:r>
     </w:p>
-    <w:p xmlns:wp14="http://schemas.microsoft.com/office/word/2010/wordml" wp14:textId="77777777">
+    <w:p>
       <w:pPr>
         <w:ind w:left="810" w:right="810"/>
         <w:rPr>
@@ -1689,7 +1448,7 @@
         <w:gridCol w:w="2520"/>
         <w:gridCol w:w="2803"/>
       </w:tblGrid>
-      <w:tr xmlns:wp14="http://schemas.microsoft.com/office/word/2010/wordml" wp14:textId="77777777">
+      <w:tr>
         <w:trPr>
           <w:trHeight w:val="419"/>
         </w:trPr>
@@ -1698,7 +1457,7 @@
             <w:tcW w:w="1563" w:type="dxa"/>
             <w:vAlign w:val="center"/>
           </w:tcPr>
-          <w:p wp14:textId="77777777">
+          <w:p>
             <w:pPr>
               <w:ind w:right="612"/>
               <w:rPr>
@@ -1748,7 +1507,7 @@
             <w:tcW w:w="1800" w:type="dxa"/>
             <w:vAlign w:val="center"/>
           </w:tcPr>
-          <w:p wp14:textId="77777777">
+          <w:p>
             <w:pPr>
               <w:ind w:right="810"/>
               <w:rPr>
@@ -1772,7 +1531,7 @@
             <w:tcW w:w="2520" w:type="dxa"/>
             <w:vAlign w:val="center"/>
           </w:tcPr>
-          <w:p wp14:textId="77777777">
+          <w:p>
             <w:pPr>
               <w:ind w:right="810"/>
               <w:rPr>
@@ -1796,7 +1555,7 @@
             <w:tcW w:w="2803" w:type="dxa"/>
             <w:vAlign w:val="center"/>
           </w:tcPr>
-          <w:p wp14:textId="77777777">
+          <w:p>
             <w:pPr>
               <w:ind w:right="585"/>
               <w:rPr>
@@ -1816,7 +1575,7 @@
           </w:p>
         </w:tc>
       </w:tr>
-      <w:tr xmlns:wp14="http://schemas.microsoft.com/office/word/2010/wordml" wp14:textId="77777777">
+      <w:tr>
         <w:trPr>
           <w:trHeight w:val="567"/>
         </w:trPr>
@@ -1825,7 +1584,7 @@
             <w:tcW w:w="1563" w:type="dxa"/>
             <w:vAlign w:val="center"/>
           </w:tcPr>
-          <w:p wp14:textId="77777777">
+          <w:p>
             <w:pPr>
               <w:ind w:right="612"/>
               <w:rPr>
@@ -1849,7 +1608,7 @@
             <w:tcW w:w="1800" w:type="dxa"/>
             <w:vAlign w:val="center"/>
           </w:tcPr>
-          <w:p wp14:textId="77777777">
+          <w:p>
             <w:pPr>
               <w:ind w:right="810"/>
               <w:rPr>
@@ -1873,7 +1632,7 @@
             <w:tcW w:w="2520" w:type="dxa"/>
             <w:vAlign w:val="center"/>
           </w:tcPr>
-          <w:p wp14:textId="77777777">
+          <w:p>
             <w:pPr>
               <w:ind w:right="-18"/>
               <w:rPr>
@@ -1923,7 +1682,7 @@
             <w:tcW w:w="2803" w:type="dxa"/>
             <w:vAlign w:val="center"/>
           </w:tcPr>
-          <w:p wp14:textId="77777777">
+          <w:p>
             <w:pPr>
               <w:spacing w:before="240"/>
               <w:ind w:right="-95"/>
@@ -1962,7 +1721,7 @@
           </w:p>
         </w:tc>
       </w:tr>
-      <w:tr xmlns:wp14="http://schemas.microsoft.com/office/word/2010/wordml" wp14:textId="77777777">
+      <w:tr>
         <w:trPr>
           <w:trHeight w:val="808"/>
         </w:trPr>
@@ -1971,7 +1730,7 @@
             <w:tcW w:w="1563" w:type="dxa"/>
             <w:vAlign w:val="center"/>
           </w:tcPr>
-          <w:p wp14:textId="77777777">
+          <w:p>
             <w:pPr>
               <w:ind w:right="612"/>
               <w:rPr>
@@ -1995,7 +1754,7 @@
             <w:tcW w:w="1800" w:type="dxa"/>
             <w:vAlign w:val="center"/>
           </w:tcPr>
-          <w:p wp14:textId="77777777">
+          <w:p>
             <w:pPr>
               <w:ind w:right="810"/>
               <w:rPr>
@@ -2019,7 +1778,7 @@
             <w:tcW w:w="2520" w:type="dxa"/>
             <w:vAlign w:val="center"/>
           </w:tcPr>
-          <w:p wp14:textId="77777777">
+          <w:p>
             <w:pPr>
               <w:ind w:right="810"/>
               <w:rPr>
@@ -2061,7 +1820,7 @@
             <w:tcW w:w="2803" w:type="dxa"/>
             <w:vAlign w:val="center"/>
           </w:tcPr>
-          <w:p wp14:textId="77777777">
+          <w:p>
             <w:pPr>
               <w:ind w:right="-5"/>
               <w:rPr>
@@ -2100,7 +1859,7 @@
         </w:tc>
       </w:tr>
     </w:tbl>
-    <w:p xmlns:wp14="http://schemas.microsoft.com/office/word/2010/wordml" wp14:textId="77777777">
+    <w:p>
       <w:pPr>
         <w:ind w:right="810"/>
         <w:rPr>
@@ -2110,17 +1869,48 @@
           <w:szCs w:val="24"/>
         </w:rPr>
       </w:pPr>
-      <w:r>
+    </w:p>
+    <w:p>
+      <w:pPr>
+        <w:ind w:left="1350" w:right="810"/>
         <w:rPr>
           <w:rFonts w:ascii="Arial" w:hAnsi="Arial" w:cs="Arial"/>
           <w:b/>
           <w:sz w:val="24"/>
           <w:szCs w:val="24"/>
         </w:rPr>
-        <w:t xml:space="preserve">                           </w:t>
-      </w:r>
-    </w:p>
-    <w:p xmlns:wp14="http://schemas.microsoft.com/office/word/2010/wordml" wp14:textId="77777777">
+      </w:pPr>
+      <w:r>
+        <w:rPr>
+          <w:rFonts w:ascii="Arial" w:hAnsi="Arial" w:cs="Arial"/>
+          <w:b/>
+          <w:sz w:val="24"/>
+          <w:szCs w:val="24"/>
+        </w:rPr>
+        <w:t xml:space="preserve">For </w:t>
+      </w:r>
+      <w:proofErr w:type="spellStart"/>
+      <w:r>
+        <w:rPr>
+          <w:rFonts w:ascii="Arial" w:hAnsi="Arial" w:cs="Arial"/>
+          <w:b/>
+          <w:sz w:val="24"/>
+          <w:szCs w:val="24"/>
+        </w:rPr>
+        <w:t>Mamta</w:t>
+      </w:r>
+      <w:proofErr w:type="spellEnd"/>
+      <w:r>
+        <w:rPr>
+          <w:rFonts w:ascii="Arial" w:hAnsi="Arial" w:cs="Arial"/>
+          <w:b/>
+          <w:sz w:val="24"/>
+          <w:szCs w:val="24"/>
+        </w:rPr>
+        <w:t xml:space="preserve"> Enterprises</w:t>
+      </w:r>
+    </w:p>
+    <w:p>
       <w:pPr>
         <w:ind w:left="1350" w:right="810"/>
         <w:rPr>
@@ -2130,154 +1920,123 @@
           <w:szCs w:val="24"/>
         </w:rPr>
       </w:pPr>
-      <w:r>
-        <w:rPr>
-          <w:rFonts w:ascii="Arial" w:hAnsi="Arial" w:cs="Arial"/>
+    </w:p>
+    <w:p>
+      <w:pPr>
+        <w:ind w:left="1350" w:right="810"/>
+        <w:rPr>
+          <w:rFonts w:ascii="Arial" w:hAnsi="Arial" w:cs="Arial"/>
+          <w:sz w:val="24"/>
+          <w:szCs w:val="24"/>
+        </w:rPr>
+      </w:pPr>
+      <w:r>
+        <w:rPr>
+          <w:rFonts w:ascii="Arial" w:hAnsi="Arial" w:cs="Arial"/>
+          <w:sz w:val="24"/>
+          <w:szCs w:val="24"/>
+        </w:rPr>
+        <w:t>Signature</w:t>
+      </w:r>
+    </w:p>
+    <w:p>
+      <w:pPr>
+        <w:jc w:val="center"/>
+        <w:rPr>
+          <w:rFonts w:ascii="Arial" w:hAnsi="Arial" w:cs="Arial"/>
+          <w:sz w:val="24"/>
+          <w:szCs w:val="24"/>
+        </w:rPr>
+      </w:pPr>
+      <w:r>
+        <w:rPr>
+          <w:rFonts w:ascii="Arial" w:hAnsi="Arial" w:cs="Arial"/>
+          <w:sz w:val="24"/>
+          <w:szCs w:val="24"/>
+        </w:rPr>
+        <w:br w:type="page"/>
+      </w:r>
+    </w:p>
+    <w:p>
+      <w:pPr>
+        <w:jc w:val="center"/>
+        <w:rPr>
+          <w:rFonts w:ascii="Arial" w:hAnsi="Arial" w:cs="Arial"/>
+          <w:sz w:val="24"/>
+          <w:szCs w:val="24"/>
+        </w:rPr>
+      </w:pPr>
+    </w:p>
+    <w:p>
+      <w:pPr>
+        <w:jc w:val="center"/>
+        <w:rPr>
+          <w:rFonts w:ascii="Arial" w:hAnsi="Arial" w:cs="Arial"/>
+          <w:sz w:val="24"/>
+          <w:szCs w:val="24"/>
+        </w:rPr>
+      </w:pPr>
+    </w:p>
+    <w:p>
+      <w:pPr>
+        <w:jc w:val="center"/>
+        <w:rPr>
+          <w:rFonts w:ascii="Arial" w:hAnsi="Arial" w:cs="Arial"/>
+          <w:sz w:val="24"/>
+          <w:szCs w:val="24"/>
+        </w:rPr>
+      </w:pPr>
+    </w:p>
+    <w:p>
+      <w:pPr>
+        <w:jc w:val="center"/>
+        <w:rPr>
+          <w:rFonts w:ascii="Arial" w:hAnsi="Arial" w:cs="Arial"/>
+          <w:sz w:val="24"/>
+          <w:szCs w:val="24"/>
+        </w:rPr>
+      </w:pPr>
+    </w:p>
+    <w:p>
+      <w:pPr>
+        <w:jc w:val="center"/>
+        <w:rPr>
+          <w:rFonts w:ascii="Arial" w:hAnsi="Arial" w:cs="Arial"/>
+          <w:sz w:val="24"/>
+          <w:szCs w:val="24"/>
+        </w:rPr>
+      </w:pPr>
+      <w:r>
+        <w:rPr>
           <w:b/>
           <w:sz w:val="24"/>
           <w:szCs w:val="24"/>
-        </w:rPr>
-        <w:t xml:space="preserve">For </w:t>
-      </w:r>
-      <w:proofErr w:type="spellStart"/>
-      <w:r>
-        <w:rPr>
-          <w:rFonts w:ascii="Arial" w:hAnsi="Arial" w:cs="Arial"/>
+          <w:u w:val="single"/>
+        </w:rPr>
+        <w:t>Serial No</w:t>
+      </w:r>
+      <w:proofErr w:type="gramStart"/>
+      <w:r>
+        <w:rPr>
           <w:b/>
           <w:sz w:val="24"/>
           <w:szCs w:val="24"/>
-        </w:rPr>
-        <w:t>Mamta</w:t>
-      </w:r>
-      <w:proofErr w:type="spellEnd"/>
-      <w:r>
-        <w:rPr>
-          <w:rFonts w:ascii="Arial" w:hAnsi="Arial" w:cs="Arial"/>
+          <w:u w:val="single"/>
+        </w:rPr>
+        <w:t>.&amp;</w:t>
+      </w:r>
+      <w:proofErr w:type="gramEnd"/>
+      <w:r>
+        <w:rPr>
           <w:b/>
           <w:sz w:val="24"/>
           <w:szCs w:val="24"/>
-        </w:rPr>
-        <w:t xml:space="preserve"> Enterprises</w:t>
-      </w:r>
-    </w:p>
-    <w:p xmlns:wp14="http://schemas.microsoft.com/office/word/2010/wordml" wp14:textId="77777777">
-      <w:pPr>
-        <w:ind w:left="1350" w:right="810"/>
-        <w:rPr>
-          <w:rFonts w:ascii="Arial" w:hAnsi="Arial" w:cs="Arial"/>
-          <w:b/>
-          <w:sz w:val="24"/>
-          <w:szCs w:val="24"/>
-        </w:rPr>
-      </w:pPr>
-    </w:p>
-    <w:p xmlns:wp14="http://schemas.microsoft.com/office/word/2010/wordml" wp14:textId="77777777">
-      <w:pPr>
-        <w:ind w:left="1350" w:right="810"/>
-        <w:rPr>
-          <w:rFonts w:ascii="Arial" w:hAnsi="Arial" w:cs="Arial"/>
-          <w:sz w:val="24"/>
-          <w:szCs w:val="24"/>
-        </w:rPr>
-      </w:pPr>
-      <w:r>
-        <w:rPr>
-          <w:rFonts w:ascii="Arial" w:hAnsi="Arial" w:cs="Arial"/>
-          <w:sz w:val="24"/>
-          <w:szCs w:val="24"/>
-        </w:rPr>
-        <w:t>Signature</w:t>
-      </w:r>
-    </w:p>
-    <w:p xmlns:wp14="http://schemas.microsoft.com/office/word/2010/wordml" wp14:textId="77777777">
-      <w:pPr>
-        <w:jc w:val="center"/>
-        <w:rPr>
-          <w:rFonts w:ascii="Arial" w:hAnsi="Arial" w:cs="Arial"/>
-          <w:sz w:val="24"/>
-          <w:szCs w:val="24"/>
-        </w:rPr>
-      </w:pPr>
-      <w:r>
-        <w:rPr>
-          <w:rFonts w:ascii="Arial" w:hAnsi="Arial" w:cs="Arial"/>
-          <w:sz w:val="24"/>
-          <w:szCs w:val="24"/>
-        </w:rPr>
-        <w:br w:type="page"/>
-      </w:r>
-    </w:p>
-    <w:p xmlns:wp14="http://schemas.microsoft.com/office/word/2010/wordml" wp14:textId="77777777">
-      <w:pPr>
-        <w:jc w:val="center"/>
-        <w:rPr>
-          <w:rFonts w:ascii="Arial" w:hAnsi="Arial" w:cs="Arial"/>
-          <w:sz w:val="24"/>
-          <w:szCs w:val="24"/>
-        </w:rPr>
-      </w:pPr>
-    </w:p>
-    <w:p xmlns:wp14="http://schemas.microsoft.com/office/word/2010/wordml" wp14:textId="77777777">
-      <w:pPr>
-        <w:jc w:val="center"/>
-        <w:rPr>
-          <w:rFonts w:ascii="Arial" w:hAnsi="Arial" w:cs="Arial"/>
-          <w:sz w:val="24"/>
-          <w:szCs w:val="24"/>
-        </w:rPr>
-      </w:pPr>
-    </w:p>
-    <w:p xmlns:wp14="http://schemas.microsoft.com/office/word/2010/wordml" wp14:textId="77777777">
-      <w:pPr>
-        <w:jc w:val="center"/>
-        <w:rPr>
-          <w:rFonts w:ascii="Arial" w:hAnsi="Arial" w:cs="Arial"/>
-          <w:sz w:val="24"/>
-          <w:szCs w:val="24"/>
-        </w:rPr>
-      </w:pPr>
-    </w:p>
-    <w:p xmlns:wp14="http://schemas.microsoft.com/office/word/2010/wordml" wp14:textId="77777777">
-      <w:pPr>
-        <w:jc w:val="center"/>
-        <w:rPr>
-          <w:rFonts w:ascii="Arial" w:hAnsi="Arial" w:cs="Arial"/>
-          <w:sz w:val="24"/>
-          <w:szCs w:val="24"/>
-        </w:rPr>
-      </w:pPr>
-    </w:p>
-    <w:p xmlns:wp14="http://schemas.microsoft.com/office/word/2010/wordml" wp14:textId="77777777">
-      <w:pPr>
-        <w:jc w:val="center"/>
-        <w:rPr>
-          <w:rFonts w:ascii="Arial" w:hAnsi="Arial" w:cs="Arial"/>
-          <w:sz w:val="24"/>
-          <w:szCs w:val="24"/>
-        </w:rPr>
-      </w:pPr>
-      <w:proofErr w:type="gramStart"/>
-      <w:r>
-        <w:rPr>
-          <w:b/>
-          <w:sz w:val="24"/>
-          <w:szCs w:val="24"/>
           <w:u w:val="single"/>
         </w:rPr>
-        <w:t>Serial No.</w:t>
-      </w:r>
-      <w:proofErr w:type="gramEnd"/>
-      <w:r>
-        <w:rPr>
-          <w:b/>
-          <w:sz w:val="24"/>
-          <w:szCs w:val="24"/>
-          <w:u w:val="single"/>
-        </w:rPr>
-        <w:t xml:space="preserve"> &amp; List of Polycrystalline Silicon Photovoltaic Modules</w:t>
-      </w:r>
-    </w:p>
-    <w:p xmlns:wp14="http://schemas.microsoft.com/office/word/2010/wordml" wp14:textId="77777777">
+        <w:t xml:space="preserve"> List of Polycrystalline Silicon Photovoltaic Modules</w:t>
+      </w:r>
+    </w:p>
+    <w:p>
       <w:pPr>
         <w:ind w:left="1440" w:right="1440"/>
         <w:jc w:val="center"/>
@@ -2294,7 +2053,7 @@
         <w:t>TO WHOMSOEVER IT MAY CONCERN</w:t>
       </w:r>
     </w:p>
-    <w:p xmlns:wp14="http://schemas.microsoft.com/office/word/2010/wordml" wp14:textId="77777777">
+    <w:p>
       <w:pPr>
         <w:ind w:left="1440" w:right="1440"/>
         <w:rPr>
@@ -2448,7 +2207,7 @@
         <w:t>}. It is also certified that all modulus are indigenous / manufactured in INDIA.</w:t>
       </w:r>
     </w:p>
-    <w:p xmlns:wp14="http://schemas.microsoft.com/office/word/2010/wordml" wp14:textId="77777777">
+    <w:p>
       <w:pPr>
         <w:ind w:left="1440" w:right="1440"/>
         <w:rPr>
@@ -2540,14 +2299,6 @@
           <w:szCs w:val="20"/>
         </w:rPr>
         <w:softHyphen/>
-      </w:r>
-      <w:r>
-        <w:rPr>
-          <w:rFonts w:ascii="Arial" w:hAnsi="Arial" w:cs="Arial"/>
-          <w:sz w:val="20"/>
-          <w:szCs w:val="20"/>
-        </w:rPr>
-        <w:t xml:space="preserve"> </w:t>
       </w:r>
       <w:r>
         <w:rPr>
@@ -2603,7 +2354,7 @@
         <w:gridCol w:w="4590"/>
         <w:gridCol w:w="4680"/>
       </w:tblGrid>
-      <w:tr xmlns:wp14="http://schemas.microsoft.com/office/word/2010/wordml" wp14:textId="77777777">
+      <w:tr>
         <w:trPr>
           <w:trHeight w:val="405"/>
         </w:trPr>
@@ -2612,7 +2363,7 @@
             <w:tcW w:w="4590" w:type="dxa"/>
             <w:vAlign w:val="center"/>
           </w:tcPr>
-          <w:p wp14:textId="77777777">
+          <w:p>
             <w:pPr>
               <w:jc w:val="center"/>
               <w:rPr>
@@ -2634,7 +2385,7 @@
             <w:tcW w:w="4680" w:type="dxa"/>
             <w:vAlign w:val="center"/>
           </w:tcPr>
-          <w:p wp14:textId="77777777">
+          <w:p>
             <w:pPr>
               <w:jc w:val="center"/>
               <w:rPr>
@@ -2652,7 +2403,7 @@
           </w:p>
         </w:tc>
       </w:tr>
-      <w:tr xmlns:wp14="http://schemas.microsoft.com/office/word/2010/wordml" wp14:textId="77777777">
+      <w:tr>
         <w:trPr>
           <w:trHeight w:val="405"/>
         </w:trPr>
@@ -2661,7 +2412,7 @@
             <w:tcW w:w="4590" w:type="dxa"/>
             <w:vAlign w:val="center"/>
           </w:tcPr>
-          <w:p wp14:textId="77777777">
+          <w:p>
             <w:pPr>
               <w:jc w:val="center"/>
               <w:rPr>
@@ -2683,7 +2434,7 @@
             <w:tcW w:w="4680" w:type="dxa"/>
             <w:vAlign w:val="center"/>
           </w:tcPr>
-          <w:p wp14:textId="77777777">
+          <w:p>
             <w:pPr>
               <w:jc w:val="center"/>
               <w:rPr>
@@ -2701,7 +2452,7 @@
           </w:p>
         </w:tc>
       </w:tr>
-      <w:tr xmlns:wp14="http://schemas.microsoft.com/office/word/2010/wordml" wp14:textId="77777777">
+      <w:tr>
         <w:trPr>
           <w:trHeight w:val="405"/>
         </w:trPr>
@@ -2710,7 +2461,7 @@
             <w:tcW w:w="4590" w:type="dxa"/>
             <w:vAlign w:val="center"/>
           </w:tcPr>
-          <w:p wp14:textId="77777777">
+          <w:p>
             <w:pPr>
               <w:jc w:val="center"/>
               <w:rPr>
@@ -2732,7 +2483,7 @@
             <w:tcW w:w="4680" w:type="dxa"/>
             <w:vAlign w:val="center"/>
           </w:tcPr>
-          <w:p wp14:textId="77777777">
+          <w:p>
             <w:pPr>
               <w:jc w:val="center"/>
               <w:rPr>
@@ -2750,7 +2501,7 @@
           </w:p>
         </w:tc>
       </w:tr>
-      <w:tr xmlns:wp14="http://schemas.microsoft.com/office/word/2010/wordml" wp14:textId="77777777">
+      <w:tr>
         <w:trPr>
           <w:trHeight w:val="405"/>
         </w:trPr>
@@ -2759,7 +2510,7 @@
             <w:tcW w:w="4590" w:type="dxa"/>
             <w:vAlign w:val="center"/>
           </w:tcPr>
-          <w:p wp14:textId="77777777">
+          <w:p>
             <w:pPr>
               <w:jc w:val="center"/>
               <w:rPr>
@@ -2781,7 +2532,7 @@
             <w:tcW w:w="4680" w:type="dxa"/>
             <w:vAlign w:val="center"/>
           </w:tcPr>
-          <w:p wp14:textId="77777777">
+          <w:p>
             <w:pPr>
               <w:jc w:val="center"/>
               <w:rPr>
@@ -2799,7 +2550,7 @@
           </w:p>
         </w:tc>
       </w:tr>
-      <w:tr xmlns:wp14="http://schemas.microsoft.com/office/word/2010/wordml" wp14:textId="77777777">
+      <w:tr>
         <w:trPr>
           <w:trHeight w:val="405"/>
         </w:trPr>
@@ -2808,7 +2559,7 @@
             <w:tcW w:w="4590" w:type="dxa"/>
             <w:vAlign w:val="center"/>
           </w:tcPr>
-          <w:p wp14:textId="77777777">
+          <w:p>
             <w:pPr>
               <w:jc w:val="center"/>
               <w:rPr>
@@ -2830,7 +2581,7 @@
             <w:tcW w:w="4680" w:type="dxa"/>
             <w:vAlign w:val="center"/>
           </w:tcPr>
-          <w:p wp14:textId="77777777">
+          <w:p>
             <w:pPr>
               <w:jc w:val="center"/>
               <w:rPr>
@@ -2848,7 +2599,7 @@
           </w:p>
         </w:tc>
       </w:tr>
-      <w:tr xmlns:wp14="http://schemas.microsoft.com/office/word/2010/wordml" wp14:textId="77777777">
+      <w:tr>
         <w:trPr>
           <w:trHeight w:val="405"/>
         </w:trPr>
@@ -2857,7 +2608,7 @@
             <w:tcW w:w="4590" w:type="dxa"/>
             <w:vAlign w:val="center"/>
           </w:tcPr>
-          <w:p wp14:textId="77777777">
+          <w:p>
             <w:pPr>
               <w:jc w:val="center"/>
               <w:rPr>
@@ -2879,7 +2630,7 @@
             <w:tcW w:w="4680" w:type="dxa"/>
             <w:vAlign w:val="center"/>
           </w:tcPr>
-          <w:p wp14:textId="77777777">
+          <w:p>
             <w:pPr>
               <w:jc w:val="center"/>
               <w:rPr>
@@ -2897,7 +2648,7 @@
           </w:p>
         </w:tc>
       </w:tr>
-      <w:tr xmlns:wp14="http://schemas.microsoft.com/office/word/2010/wordml" wp14:textId="77777777">
+      <w:tr>
         <w:trPr>
           <w:trHeight w:val="405"/>
         </w:trPr>
@@ -2906,7 +2657,7 @@
             <w:tcW w:w="4590" w:type="dxa"/>
             <w:vAlign w:val="center"/>
           </w:tcPr>
-          <w:p wp14:textId="77777777">
+          <w:p>
             <w:pPr>
               <w:jc w:val="center"/>
               <w:rPr>
@@ -2928,7 +2679,7 @@
             <w:tcW w:w="4680" w:type="dxa"/>
             <w:vAlign w:val="center"/>
           </w:tcPr>
-          <w:p wp14:textId="77777777">
+          <w:p>
             <w:pPr>
               <w:jc w:val="center"/>
               <w:rPr>
@@ -2946,7 +2697,7 @@
           </w:p>
         </w:tc>
       </w:tr>
-      <w:tr xmlns:wp14="http://schemas.microsoft.com/office/word/2010/wordml" wp14:textId="77777777">
+      <w:tr>
         <w:trPr>
           <w:trHeight w:val="405"/>
         </w:trPr>
@@ -2955,7 +2706,7 @@
             <w:tcW w:w="4590" w:type="dxa"/>
             <w:vAlign w:val="center"/>
           </w:tcPr>
-          <w:p wp14:textId="77777777">
+          <w:p>
             <w:pPr>
               <w:jc w:val="center"/>
               <w:rPr>
@@ -2977,7 +2728,7 @@
             <w:tcW w:w="4680" w:type="dxa"/>
             <w:vAlign w:val="center"/>
           </w:tcPr>
-          <w:p wp14:textId="77777777">
+          <w:p>
             <w:pPr>
               <w:jc w:val="center"/>
               <w:rPr>
@@ -2995,7 +2746,7 @@
           </w:p>
         </w:tc>
       </w:tr>
-      <w:tr xmlns:wp14="http://schemas.microsoft.com/office/word/2010/wordml" wp14:textId="77777777">
+      <w:tr>
         <w:trPr>
           <w:trHeight w:val="405"/>
         </w:trPr>
@@ -3004,7 +2755,7 @@
             <w:tcW w:w="4590" w:type="dxa"/>
             <w:vAlign w:val="center"/>
           </w:tcPr>
-          <w:p wp14:textId="77777777">
+          <w:p>
             <w:pPr>
               <w:jc w:val="center"/>
               <w:rPr>
@@ -3026,7 +2777,7 @@
             <w:tcW w:w="4680" w:type="dxa"/>
             <w:vAlign w:val="center"/>
           </w:tcPr>
-          <w:p wp14:textId="77777777">
+          <w:p>
             <w:pPr>
               <w:jc w:val="center"/>
               <w:rPr>
@@ -3044,7 +2795,7 @@
           </w:p>
         </w:tc>
       </w:tr>
-      <w:tr xmlns:wp14="http://schemas.microsoft.com/office/word/2010/wordml" wp14:textId="77777777">
+      <w:tr>
         <w:trPr>
           <w:trHeight w:val="425"/>
         </w:trPr>
@@ -3053,7 +2804,7 @@
             <w:tcW w:w="4590" w:type="dxa"/>
             <w:vAlign w:val="center"/>
           </w:tcPr>
-          <w:p wp14:textId="77777777">
+          <w:p>
             <w:pPr>
               <w:jc w:val="center"/>
               <w:rPr>
@@ -3075,7 +2826,7 @@
             <w:tcW w:w="4680" w:type="dxa"/>
             <w:vAlign w:val="center"/>
           </w:tcPr>
-          <w:p wp14:textId="77777777">
+          <w:p>
             <w:pPr>
               <w:jc w:val="center"/>
               <w:rPr>
@@ -3093,7 +2844,7 @@
           </w:p>
         </w:tc>
       </w:tr>
-      <w:tr xmlns:wp14="http://schemas.microsoft.com/office/word/2010/wordml" wp14:textId="77777777">
+      <w:tr>
         <w:trPr>
           <w:trHeight w:val="425"/>
         </w:trPr>
@@ -3102,7 +2853,7 @@
             <w:tcW w:w="4590" w:type="dxa"/>
             <w:vAlign w:val="center"/>
           </w:tcPr>
-          <w:p wp14:textId="77777777">
+          <w:p>
             <w:pPr>
               <w:jc w:val="center"/>
               <w:rPr>
@@ -3124,7 +2875,7 @@
             <w:tcW w:w="4680" w:type="dxa"/>
             <w:vAlign w:val="center"/>
           </w:tcPr>
-          <w:p wp14:textId="77777777">
+          <w:p>
             <w:pPr>
               <w:jc w:val="center"/>
               <w:rPr>
@@ -3142,7 +2893,7 @@
           </w:p>
         </w:tc>
       </w:tr>
-      <w:tr xmlns:wp14="http://schemas.microsoft.com/office/word/2010/wordml" wp14:textId="77777777">
+      <w:tr>
         <w:trPr>
           <w:trHeight w:val="425"/>
         </w:trPr>
@@ -3151,7 +2902,7 @@
             <w:tcW w:w="4590" w:type="dxa"/>
             <w:vAlign w:val="center"/>
           </w:tcPr>
-          <w:p wp14:textId="77777777">
+          <w:p>
             <w:pPr>
               <w:jc w:val="center"/>
               <w:rPr>
@@ -3173,7 +2924,7 @@
             <w:tcW w:w="4680" w:type="dxa"/>
             <w:vAlign w:val="center"/>
           </w:tcPr>
-          <w:p wp14:textId="77777777">
+          <w:p>
             <w:pPr>
               <w:jc w:val="center"/>
               <w:rPr>
@@ -3192,15 +2943,15 @@
         </w:tc>
       </w:tr>
     </w:tbl>
-    <w:p xmlns:wp14="http://schemas.microsoft.com/office/word/2010/wordml" wp14:textId="77777777">
-      <w:pPr>
-        <w:rPr>
-          <w:sz w:val="20"/>
-          <w:szCs w:val="20"/>
-        </w:rPr>
-      </w:pPr>
-    </w:p>
-    <w:p xmlns:wp14="http://schemas.microsoft.com/office/word/2010/wordml" wp14:textId="77777777">
+    <w:p>
+      <w:pPr>
+        <w:rPr>
+          <w:sz w:val="20"/>
+          <w:szCs w:val="20"/>
+        </w:rPr>
+      </w:pPr>
+    </w:p>
+    <w:p>
       <w:pPr>
         <w:rPr>
           <w:b/>
@@ -3210,18 +2961,11 @@
       </w:pPr>
       <w:r>
         <w:rPr>
-          <w:sz w:val="20"/>
-          <w:szCs w:val="20"/>
-        </w:rPr>
-        <w:t xml:space="preserve"> </w:t>
-      </w:r>
-      <w:r>
-        <w:rPr>
           <w:b/>
           <w:sz w:val="20"/>
           <w:szCs w:val="20"/>
         </w:rPr>
-        <w:t xml:space="preserve">                          </w:t>
+        <w:t xml:space="preserve">     </w:t>
       </w:r>
       <w:r>
         <w:rPr>
@@ -3229,7 +2973,23 @@
           <w:sz w:val="20"/>
           <w:szCs w:val="20"/>
         </w:rPr>
-        <w:t xml:space="preserve">     For </w:t>
+        <w:tab/>
+      </w:r>
+      <w:r>
+        <w:rPr>
+          <w:b/>
+          <w:sz w:val="20"/>
+          <w:szCs w:val="20"/>
+        </w:rPr>
+        <w:tab/>
+      </w:r>
+      <w:r>
+        <w:rPr>
+          <w:b/>
+          <w:sz w:val="20"/>
+          <w:szCs w:val="20"/>
+        </w:rPr>
+        <w:t xml:space="preserve">For </w:t>
       </w:r>
       <w:proofErr w:type="spellStart"/>
       <w:r>
@@ -3250,7 +3010,7 @@
         <w:t xml:space="preserve"> Enterprises</w:t>
       </w:r>
     </w:p>
-    <w:p xmlns:wp14="http://schemas.microsoft.com/office/word/2010/wordml" wp14:textId="77777777">
+    <w:p>
       <w:pPr>
         <w:rPr>
           <w:b/>
@@ -3259,7 +3019,7 @@
         </w:rPr>
       </w:pPr>
     </w:p>
-    <w:p xmlns:wp14="http://schemas.microsoft.com/office/word/2010/wordml" wp14:textId="77777777">
+    <w:p>
       <w:pPr>
         <w:ind w:left="720" w:firstLine="720"/>
         <w:rPr>
@@ -3276,7 +3036,7 @@
       </w:r>
     </w:p>
     <w:sectPr>
-      <w:pgSz w:w="12240" w:h="15840" w:orient="portrait"/>
+      <w:pgSz w:w="12240" w:h="15840"/>
       <w:pgMar w:top="0" w:right="0" w:bottom="0" w:left="0" w:header="720" w:footer="720" w:gutter="0"/>
       <w:cols w:space="720"/>
       <w:docGrid w:linePitch="360"/>
@@ -3300,7 +3060,7 @@
         <w:ind w:left="720" w:hanging="360"/>
       </w:pPr>
       <w:rPr>
-        <w:rFonts w:hint="default" w:ascii="Symbol" w:hAnsi="Symbol"/>
+        <w:rFonts w:ascii="Symbol" w:hAnsi="Symbol" w:hint="default"/>
       </w:rPr>
     </w:lvl>
     <w:lvl w:ilvl="1" w:tplc="04090003" w:tentative="1">
@@ -3312,7 +3072,7 @@
         <w:ind w:left="1440" w:hanging="360"/>
       </w:pPr>
       <w:rPr>
-        <w:rFonts w:hint="default" w:ascii="Courier New" w:hAnsi="Courier New" w:cs="Courier New"/>
+        <w:rFonts w:ascii="Courier New" w:hAnsi="Courier New" w:cs="Courier New" w:hint="default"/>
       </w:rPr>
     </w:lvl>
     <w:lvl w:ilvl="2" w:tplc="04090005" w:tentative="1">
@@ -3324,7 +3084,7 @@
         <w:ind w:left="2160" w:hanging="360"/>
       </w:pPr>
       <w:rPr>
-        <w:rFonts w:hint="default" w:ascii="Wingdings" w:hAnsi="Wingdings"/>
+        <w:rFonts w:ascii="Wingdings" w:hAnsi="Wingdings" w:hint="default"/>
       </w:rPr>
     </w:lvl>
     <w:lvl w:ilvl="3" w:tplc="04090001" w:tentative="1">
@@ -3336,7 +3096,7 @@
         <w:ind w:left="2880" w:hanging="360"/>
       </w:pPr>
       <w:rPr>
-        <w:rFonts w:hint="default" w:ascii="Symbol" w:hAnsi="Symbol"/>
+        <w:rFonts w:ascii="Symbol" w:hAnsi="Symbol" w:hint="default"/>
       </w:rPr>
     </w:lvl>
     <w:lvl w:ilvl="4" w:tplc="04090003" w:tentative="1">
@@ -3348,7 +3108,7 @@
         <w:ind w:left="3600" w:hanging="360"/>
       </w:pPr>
       <w:rPr>
-        <w:rFonts w:hint="default" w:ascii="Courier New" w:hAnsi="Courier New" w:cs="Courier New"/>
+        <w:rFonts w:ascii="Courier New" w:hAnsi="Courier New" w:cs="Courier New" w:hint="default"/>
       </w:rPr>
     </w:lvl>
     <w:lvl w:ilvl="5" w:tplc="04090005" w:tentative="1">
@@ -3360,7 +3120,7 @@
         <w:ind w:left="4320" w:hanging="360"/>
       </w:pPr>
       <w:rPr>
-        <w:rFonts w:hint="default" w:ascii="Wingdings" w:hAnsi="Wingdings"/>
+        <w:rFonts w:ascii="Wingdings" w:hAnsi="Wingdings" w:hint="default"/>
       </w:rPr>
     </w:lvl>
     <w:lvl w:ilvl="6" w:tplc="04090001" w:tentative="1">
@@ -3372,7 +3132,7 @@
         <w:ind w:left="5040" w:hanging="360"/>
       </w:pPr>
       <w:rPr>
-        <w:rFonts w:hint="default" w:ascii="Symbol" w:hAnsi="Symbol"/>
+        <w:rFonts w:ascii="Symbol" w:hAnsi="Symbol" w:hint="default"/>
       </w:rPr>
     </w:lvl>
     <w:lvl w:ilvl="7" w:tplc="04090003" w:tentative="1">
@@ -3384,7 +3144,7 @@
         <w:ind w:left="5760" w:hanging="360"/>
       </w:pPr>
       <w:rPr>
-        <w:rFonts w:hint="default" w:ascii="Courier New" w:hAnsi="Courier New" w:cs="Courier New"/>
+        <w:rFonts w:ascii="Courier New" w:hAnsi="Courier New" w:cs="Courier New" w:hint="default"/>
       </w:rPr>
     </w:lvl>
     <w:lvl w:ilvl="8" w:tplc="04090005" w:tentative="1">
@@ -3396,7 +3156,7 @@
         <w:ind w:left="6480" w:hanging="360"/>
       </w:pPr>
       <w:rPr>
-        <w:rFonts w:hint="default" w:ascii="Wingdings" w:hAnsi="Wingdings"/>
+        <w:rFonts w:ascii="Wingdings" w:hAnsi="Wingdings" w:hint="default"/>
       </w:rPr>
     </w:lvl>
   </w:abstractNum>
@@ -3413,7 +3173,7 @@
         <w:ind w:left="720" w:hanging="360"/>
       </w:pPr>
       <w:rPr>
-        <w:rFonts w:hint="default" w:ascii="Symbol" w:hAnsi="Symbol"/>
+        <w:rFonts w:ascii="Symbol" w:hAnsi="Symbol" w:hint="default"/>
       </w:rPr>
     </w:lvl>
     <w:lvl w:ilvl="1" w:tplc="04090003" w:tentative="1">
@@ -3425,7 +3185,7 @@
         <w:ind w:left="1440" w:hanging="360"/>
       </w:pPr>
       <w:rPr>
-        <w:rFonts w:hint="default" w:ascii="Courier New" w:hAnsi="Courier New" w:cs="Courier New"/>
+        <w:rFonts w:ascii="Courier New" w:hAnsi="Courier New" w:cs="Courier New" w:hint="default"/>
       </w:rPr>
     </w:lvl>
     <w:lvl w:ilvl="2" w:tplc="04090005" w:tentative="1">
@@ -3437,7 +3197,7 @@
         <w:ind w:left="2160" w:hanging="360"/>
       </w:pPr>
       <w:rPr>
-        <w:rFonts w:hint="default" w:ascii="Wingdings" w:hAnsi="Wingdings"/>
+        <w:rFonts w:ascii="Wingdings" w:hAnsi="Wingdings" w:hint="default"/>
       </w:rPr>
     </w:lvl>
     <w:lvl w:ilvl="3" w:tplc="04090001" w:tentative="1">
@@ -3449,7 +3209,7 @@
         <w:ind w:left="2880" w:hanging="360"/>
       </w:pPr>
       <w:rPr>
-        <w:rFonts w:hint="default" w:ascii="Symbol" w:hAnsi="Symbol"/>
+        <w:rFonts w:ascii="Symbol" w:hAnsi="Symbol" w:hint="default"/>
       </w:rPr>
     </w:lvl>
     <w:lvl w:ilvl="4" w:tplc="04090003" w:tentative="1">
@@ -3461,7 +3221,7 @@
         <w:ind w:left="3600" w:hanging="360"/>
       </w:pPr>
       <w:rPr>
-        <w:rFonts w:hint="default" w:ascii="Courier New" w:hAnsi="Courier New" w:cs="Courier New"/>
+        <w:rFonts w:ascii="Courier New" w:hAnsi="Courier New" w:cs="Courier New" w:hint="default"/>
       </w:rPr>
     </w:lvl>
     <w:lvl w:ilvl="5" w:tplc="04090005" w:tentative="1">
@@ -3473,7 +3233,7 @@
         <w:ind w:left="4320" w:hanging="360"/>
       </w:pPr>
       <w:rPr>
-        <w:rFonts w:hint="default" w:ascii="Wingdings" w:hAnsi="Wingdings"/>
+        <w:rFonts w:ascii="Wingdings" w:hAnsi="Wingdings" w:hint="default"/>
       </w:rPr>
     </w:lvl>
     <w:lvl w:ilvl="6" w:tplc="04090001" w:tentative="1">
@@ -3485,7 +3245,7 @@
         <w:ind w:left="5040" w:hanging="360"/>
       </w:pPr>
       <w:rPr>
-        <w:rFonts w:hint="default" w:ascii="Symbol" w:hAnsi="Symbol"/>
+        <w:rFonts w:ascii="Symbol" w:hAnsi="Symbol" w:hint="default"/>
       </w:rPr>
     </w:lvl>
     <w:lvl w:ilvl="7" w:tplc="04090003" w:tentative="1">
@@ -3497,7 +3257,7 @@
         <w:ind w:left="5760" w:hanging="360"/>
       </w:pPr>
       <w:rPr>
-        <w:rFonts w:hint="default" w:ascii="Courier New" w:hAnsi="Courier New" w:cs="Courier New"/>
+        <w:rFonts w:ascii="Courier New" w:hAnsi="Courier New" w:cs="Courier New" w:hint="default"/>
       </w:rPr>
     </w:lvl>
     <w:lvl w:ilvl="8" w:tplc="04090005" w:tentative="1">
@@ -3509,7 +3269,7 @@
         <w:ind w:left="6480" w:hanging="360"/>
       </w:pPr>
       <w:rPr>
-        <w:rFonts w:hint="default" w:ascii="Wingdings" w:hAnsi="Wingdings"/>
+        <w:rFonts w:ascii="Wingdings" w:hAnsi="Wingdings" w:hint="default"/>
       </w:rPr>
     </w:lvl>
   </w:abstractNum>
@@ -3523,11 +3283,11 @@
 </file>
 
 <file path=word/styles.xml><?xml version="1.0" encoding="utf-8"?>
-<w:styles xmlns:w14="http://schemas.microsoft.com/office/word/2010/wordml" xmlns:wp14="http://schemas.microsoft.com/office/word/2010/wordprocessingDrawing" xmlns:r="http://schemas.openxmlformats.org/officeDocument/2006/relationships" xmlns:w="http://schemas.openxmlformats.org/wordprocessingml/2006/main" xmlns:mc="http://schemas.openxmlformats.org/markup-compatibility/2006" mc:Ignorable="w14 wp14">
+<w:styles xmlns:r="http://schemas.openxmlformats.org/officeDocument/2006/relationships" xmlns:w="http://schemas.openxmlformats.org/wordprocessingml/2006/main">
   <w:docDefaults>
     <w:rPrDefault>
       <w:rPr>
-        <w:rFonts w:asciiTheme="minorHAnsi" w:hAnsiTheme="minorHAnsi" w:eastAsiaTheme="minorEastAsia" w:cstheme="minorBidi"/>
+        <w:rFonts w:asciiTheme="minorHAnsi" w:eastAsiaTheme="minorEastAsia" w:hAnsiTheme="minorHAnsi" w:cstheme="minorBidi"/>
         <w:sz w:val="22"/>
         <w:szCs w:val="22"/>
         <w:lang w:val="en-US" w:eastAsia="en-US" w:bidi="ar-SA"/>
@@ -3540,8 +3300,8 @@
     </w:pPrDefault>
   </w:docDefaults>
   <w:latentStyles w:defLockedState="0" w:defUIPriority="99" w:defSemiHidden="1" w:defUnhideWhenUsed="1" w:defQFormat="0" w:count="267">
-    <w:lsdException w:name="Normal" w:uiPriority="0" w:semiHidden="0" w:unhideWhenUsed="0" w:qFormat="1"/>
-    <w:lsdException w:name="heading 1" w:uiPriority="9" w:semiHidden="0" w:unhideWhenUsed="0" w:qFormat="1"/>
+    <w:lsdException w:name="Normal" w:semiHidden="0" w:uiPriority="0" w:unhideWhenUsed="0" w:qFormat="1"/>
+    <w:lsdException w:name="heading 1" w:semiHidden="0" w:uiPriority="9" w:unhideWhenUsed="0" w:qFormat="1"/>
     <w:lsdException w:name="heading 2" w:uiPriority="9" w:qFormat="1"/>
     <w:lsdException w:name="heading 3" w:uiPriority="9" w:qFormat="1"/>
     <w:lsdException w:name="heading 4" w:uiPriority="9" w:qFormat="1"/>
@@ -3560,136 +3320,136 @@
     <w:lsdException w:name="toc 8" w:uiPriority="39"/>
     <w:lsdException w:name="toc 9" w:uiPriority="39"/>
     <w:lsdException w:name="caption" w:uiPriority="35" w:qFormat="1"/>
-    <w:lsdException w:name="Title" w:uiPriority="10" w:semiHidden="0" w:unhideWhenUsed="0" w:qFormat="1"/>
+    <w:lsdException w:name="Title" w:semiHidden="0" w:uiPriority="10" w:unhideWhenUsed="0" w:qFormat="1"/>
     <w:lsdException w:name="Default Paragraph Font" w:uiPriority="1"/>
-    <w:lsdException w:name="Subtitle" w:uiPriority="11" w:semiHidden="0" w:unhideWhenUsed="0" w:qFormat="1"/>
-    <w:lsdException w:name="Strong" w:uiPriority="22" w:semiHidden="0" w:unhideWhenUsed="0" w:qFormat="1"/>
-    <w:lsdException w:name="Emphasis" w:uiPriority="20" w:semiHidden="0" w:unhideWhenUsed="0" w:qFormat="1"/>
-    <w:lsdException w:name="Table Grid" w:uiPriority="59" w:semiHidden="0" w:unhideWhenUsed="0"/>
+    <w:lsdException w:name="Subtitle" w:semiHidden="0" w:uiPriority="11" w:unhideWhenUsed="0" w:qFormat="1"/>
+    <w:lsdException w:name="Strong" w:semiHidden="0" w:uiPriority="22" w:unhideWhenUsed="0" w:qFormat="1"/>
+    <w:lsdException w:name="Emphasis" w:semiHidden="0" w:uiPriority="20" w:unhideWhenUsed="0" w:qFormat="1"/>
+    <w:lsdException w:name="Table Grid" w:semiHidden="0" w:uiPriority="59" w:unhideWhenUsed="0"/>
     <w:lsdException w:name="Placeholder Text" w:unhideWhenUsed="0"/>
-    <w:lsdException w:name="No Spacing" w:uiPriority="1" w:semiHidden="0" w:unhideWhenUsed="0" w:qFormat="1"/>
-    <w:lsdException w:name="Light Shading" w:uiPriority="60" w:semiHidden="0" w:unhideWhenUsed="0"/>
-    <w:lsdException w:name="Light List" w:uiPriority="61" w:semiHidden="0" w:unhideWhenUsed="0"/>
-    <w:lsdException w:name="Light Grid" w:uiPriority="62" w:semiHidden="0" w:unhideWhenUsed="0"/>
-    <w:lsdException w:name="Medium Shading 1" w:uiPriority="63" w:semiHidden="0" w:unhideWhenUsed="0"/>
-    <w:lsdException w:name="Medium Shading 2" w:uiPriority="64" w:semiHidden="0" w:unhideWhenUsed="0"/>
-    <w:lsdException w:name="Medium List 1" w:uiPriority="65" w:semiHidden="0" w:unhideWhenUsed="0"/>
-    <w:lsdException w:name="Medium List 2" w:uiPriority="66" w:semiHidden="0" w:unhideWhenUsed="0"/>
-    <w:lsdException w:name="Medium Grid 1" w:uiPriority="67" w:semiHidden="0" w:unhideWhenUsed="0"/>
-    <w:lsdException w:name="Medium Grid 2" w:uiPriority="68" w:semiHidden="0" w:unhideWhenUsed="0"/>
-    <w:lsdException w:name="Medium Grid 3" w:uiPriority="69" w:semiHidden="0" w:unhideWhenUsed="0"/>
-    <w:lsdException w:name="Dark List" w:uiPriority="70" w:semiHidden="0" w:unhideWhenUsed="0"/>
-    <w:lsdException w:name="Colorful Shading" w:uiPriority="71" w:semiHidden="0" w:unhideWhenUsed="0"/>
-    <w:lsdException w:name="Colorful List" w:uiPriority="72" w:semiHidden="0" w:unhideWhenUsed="0"/>
-    <w:lsdException w:name="Colorful Grid" w:uiPriority="73" w:semiHidden="0" w:unhideWhenUsed="0"/>
-    <w:lsdException w:name="Light Shading Accent 1" w:uiPriority="60" w:semiHidden="0" w:unhideWhenUsed="0"/>
-    <w:lsdException w:name="Light List Accent 1" w:uiPriority="61" w:semiHidden="0" w:unhideWhenUsed="0"/>
-    <w:lsdException w:name="Light Grid Accent 1" w:uiPriority="62" w:semiHidden="0" w:unhideWhenUsed="0"/>
-    <w:lsdException w:name="Medium Shading 1 Accent 1" w:uiPriority="63" w:semiHidden="0" w:unhideWhenUsed="0"/>
-    <w:lsdException w:name="Medium Shading 2 Accent 1" w:uiPriority="64" w:semiHidden="0" w:unhideWhenUsed="0"/>
-    <w:lsdException w:name="Medium List 1 Accent 1" w:uiPriority="65" w:semiHidden="0" w:unhideWhenUsed="0"/>
+    <w:lsdException w:name="No Spacing" w:semiHidden="0" w:uiPriority="1" w:unhideWhenUsed="0" w:qFormat="1"/>
+    <w:lsdException w:name="Light Shading" w:semiHidden="0" w:uiPriority="60" w:unhideWhenUsed="0"/>
+    <w:lsdException w:name="Light List" w:semiHidden="0" w:uiPriority="61" w:unhideWhenUsed="0"/>
+    <w:lsdException w:name="Light Grid" w:semiHidden="0" w:uiPriority="62" w:unhideWhenUsed="0"/>
+    <w:lsdException w:name="Medium Shading 1" w:semiHidden="0" w:uiPriority="63" w:unhideWhenUsed="0"/>
+    <w:lsdException w:name="Medium Shading 2" w:semiHidden="0" w:uiPriority="64" w:unhideWhenUsed="0"/>
+    <w:lsdException w:name="Medium List 1" w:semiHidden="0" w:uiPriority="65" w:unhideWhenUsed="0"/>
+    <w:lsdException w:name="Medium List 2" w:semiHidden="0" w:uiPriority="66" w:unhideWhenUsed="0"/>
+    <w:lsdException w:name="Medium Grid 1" w:semiHidden="0" w:uiPriority="67" w:unhideWhenUsed="0"/>
+    <w:lsdException w:name="Medium Grid 2" w:semiHidden="0" w:uiPriority="68" w:unhideWhenUsed="0"/>
+    <w:lsdException w:name="Medium Grid 3" w:semiHidden="0" w:uiPriority="69" w:unhideWhenUsed="0"/>
+    <w:lsdException w:name="Dark List" w:semiHidden="0" w:uiPriority="70" w:unhideWhenUsed="0"/>
+    <w:lsdException w:name="Colorful Shading" w:semiHidden="0" w:uiPriority="71" w:unhideWhenUsed="0"/>
+    <w:lsdException w:name="Colorful List" w:semiHidden="0" w:uiPriority="72" w:unhideWhenUsed="0"/>
+    <w:lsdException w:name="Colorful Grid" w:semiHidden="0" w:uiPriority="73" w:unhideWhenUsed="0"/>
+    <w:lsdException w:name="Light Shading Accent 1" w:semiHidden="0" w:uiPriority="60" w:unhideWhenUsed="0"/>
+    <w:lsdException w:name="Light List Accent 1" w:semiHidden="0" w:uiPriority="61" w:unhideWhenUsed="0"/>
+    <w:lsdException w:name="Light Grid Accent 1" w:semiHidden="0" w:uiPriority="62" w:unhideWhenUsed="0"/>
+    <w:lsdException w:name="Medium Shading 1 Accent 1" w:semiHidden="0" w:uiPriority="63" w:unhideWhenUsed="0"/>
+    <w:lsdException w:name="Medium Shading 2 Accent 1" w:semiHidden="0" w:uiPriority="64" w:unhideWhenUsed="0"/>
+    <w:lsdException w:name="Medium List 1 Accent 1" w:semiHidden="0" w:uiPriority="65" w:unhideWhenUsed="0"/>
     <w:lsdException w:name="Revision" w:unhideWhenUsed="0"/>
-    <w:lsdException w:name="List Paragraph" w:uiPriority="34" w:semiHidden="0" w:unhideWhenUsed="0" w:qFormat="1"/>
-    <w:lsdException w:name="Quote" w:uiPriority="29" w:semiHidden="0" w:unhideWhenUsed="0" w:qFormat="1"/>
-    <w:lsdException w:name="Intense Quote" w:uiPriority="30" w:semiHidden="0" w:unhideWhenUsed="0" w:qFormat="1"/>
-    <w:lsdException w:name="Medium List 2 Accent 1" w:uiPriority="66" w:semiHidden="0" w:unhideWhenUsed="0"/>
-    <w:lsdException w:name="Medium Grid 1 Accent 1" w:uiPriority="67" w:semiHidden="0" w:unhideWhenUsed="0"/>
-    <w:lsdException w:name="Medium Grid 2 Accent 1" w:uiPriority="68" w:semiHidden="0" w:unhideWhenUsed="0"/>
-    <w:lsdException w:name="Medium Grid 3 Accent 1" w:uiPriority="69" w:semiHidden="0" w:unhideWhenUsed="0"/>
-    <w:lsdException w:name="Dark List Accent 1" w:uiPriority="70" w:semiHidden="0" w:unhideWhenUsed="0"/>
-    <w:lsdException w:name="Colorful Shading Accent 1" w:uiPriority="71" w:semiHidden="0" w:unhideWhenUsed="0"/>
-    <w:lsdException w:name="Colorful List Accent 1" w:uiPriority="72" w:semiHidden="0" w:unhideWhenUsed="0"/>
-    <w:lsdException w:name="Colorful Grid Accent 1" w:uiPriority="73" w:semiHidden="0" w:unhideWhenUsed="0"/>
-    <w:lsdException w:name="Light Shading Accent 2" w:uiPriority="60" w:semiHidden="0" w:unhideWhenUsed="0"/>
-    <w:lsdException w:name="Light List Accent 2" w:uiPriority="61" w:semiHidden="0" w:unhideWhenUsed="0"/>
-    <w:lsdException w:name="Light Grid Accent 2" w:uiPriority="62" w:semiHidden="0" w:unhideWhenUsed="0"/>
-    <w:lsdException w:name="Medium Shading 1 Accent 2" w:uiPriority="63" w:semiHidden="0" w:unhideWhenUsed="0"/>
-    <w:lsdException w:name="Medium Shading 2 Accent 2" w:uiPriority="64" w:semiHidden="0" w:unhideWhenUsed="0"/>
-    <w:lsdException w:name="Medium List 1 Accent 2" w:uiPriority="65" w:semiHidden="0" w:unhideWhenUsed="0"/>
-    <w:lsdException w:name="Medium List 2 Accent 2" w:uiPriority="66" w:semiHidden="0" w:unhideWhenUsed="0"/>
-    <w:lsdException w:name="Medium Grid 1 Accent 2" w:uiPriority="67" w:semiHidden="0" w:unhideWhenUsed="0"/>
-    <w:lsdException w:name="Medium Grid 2 Accent 2" w:uiPriority="68" w:semiHidden="0" w:unhideWhenUsed="0"/>
-    <w:lsdException w:name="Medium Grid 3 Accent 2" w:uiPriority="69" w:semiHidden="0" w:unhideWhenUsed="0"/>
-    <w:lsdException w:name="Dark List Accent 2" w:uiPriority="70" w:semiHidden="0" w:unhideWhenUsed="0"/>
-    <w:lsdException w:name="Colorful Shading Accent 2" w:uiPriority="71" w:semiHidden="0" w:unhideWhenUsed="0"/>
-    <w:lsdException w:name="Colorful List Accent 2" w:uiPriority="72" w:semiHidden="0" w:unhideWhenUsed="0"/>
-    <w:lsdException w:name="Colorful Grid Accent 2" w:uiPriority="73" w:semiHidden="0" w:unhideWhenUsed="0"/>
-    <w:lsdException w:name="Light Shading Accent 3" w:uiPriority="60" w:semiHidden="0" w:unhideWhenUsed="0"/>
-    <w:lsdException w:name="Light List Accent 3" w:uiPriority="61" w:semiHidden="0" w:unhideWhenUsed="0"/>
-    <w:lsdException w:name="Light Grid Accent 3" w:uiPriority="62" w:semiHidden="0" w:unhideWhenUsed="0"/>
-    <w:lsdException w:name="Medium Shading 1 Accent 3" w:uiPriority="63" w:semiHidden="0" w:unhideWhenUsed="0"/>
-    <w:lsdException w:name="Medium Shading 2 Accent 3" w:uiPriority="64" w:semiHidden="0" w:unhideWhenUsed="0"/>
-    <w:lsdException w:name="Medium List 1 Accent 3" w:uiPriority="65" w:semiHidden="0" w:unhideWhenUsed="0"/>
-    <w:lsdException w:name="Medium List 2 Accent 3" w:uiPriority="66" w:semiHidden="0" w:unhideWhenUsed="0"/>
-    <w:lsdException w:name="Medium Grid 1 Accent 3" w:uiPriority="67" w:semiHidden="0" w:unhideWhenUsed="0"/>
-    <w:lsdException w:name="Medium Grid 2 Accent 3" w:uiPriority="68" w:semiHidden="0" w:unhideWhenUsed="0"/>
-    <w:lsdException w:name="Medium Grid 3 Accent 3" w:uiPriority="69" w:semiHidden="0" w:unhideWhenUsed="0"/>
-    <w:lsdException w:name="Dark List Accent 3" w:uiPriority="70" w:semiHidden="0" w:unhideWhenUsed="0"/>
-    <w:lsdException w:name="Colorful Shading Accent 3" w:uiPriority="71" w:semiHidden="0" w:unhideWhenUsed="0"/>
-    <w:lsdException w:name="Colorful List Accent 3" w:uiPriority="72" w:semiHidden="0" w:unhideWhenUsed="0"/>
-    <w:lsdException w:name="Colorful Grid Accent 3" w:uiPriority="73" w:semiHidden="0" w:unhideWhenUsed="0"/>
-    <w:lsdException w:name="Light Shading Accent 4" w:uiPriority="60" w:semiHidden="0" w:unhideWhenUsed="0"/>
-    <w:lsdException w:name="Light List Accent 4" w:uiPriority="61" w:semiHidden="0" w:unhideWhenUsed="0"/>
-    <w:lsdException w:name="Light Grid Accent 4" w:uiPriority="62" w:semiHidden="0" w:unhideWhenUsed="0"/>
-    <w:lsdException w:name="Medium Shading 1 Accent 4" w:uiPriority="63" w:semiHidden="0" w:unhideWhenUsed="0"/>
-    <w:lsdException w:name="Medium Shading 2 Accent 4" w:uiPriority="64" w:semiHidden="0" w:unhideWhenUsed="0"/>
-    <w:lsdException w:name="Medium List 1 Accent 4" w:uiPriority="65" w:semiHidden="0" w:unhideWhenUsed="0"/>
-    <w:lsdException w:name="Medium List 2 Accent 4" w:uiPriority="66" w:semiHidden="0" w:unhideWhenUsed="0"/>
-    <w:lsdException w:name="Medium Grid 1 Accent 4" w:uiPriority="67" w:semiHidden="0" w:unhideWhenUsed="0"/>
-    <w:lsdException w:name="Medium Grid 2 Accent 4" w:uiPriority="68" w:semiHidden="0" w:unhideWhenUsed="0"/>
-    <w:lsdException w:name="Medium Grid 3 Accent 4" w:uiPriority="69" w:semiHidden="0" w:unhideWhenUsed="0"/>
-    <w:lsdException w:name="Dark List Accent 4" w:uiPriority="70" w:semiHidden="0" w:unhideWhenUsed="0"/>
-    <w:lsdException w:name="Colorful Shading Accent 4" w:uiPriority="71" w:semiHidden="0" w:unhideWhenUsed="0"/>
-    <w:lsdException w:name="Colorful List Accent 4" w:uiPriority="72" w:semiHidden="0" w:unhideWhenUsed="0"/>
-    <w:lsdException w:name="Colorful Grid Accent 4" w:uiPriority="73" w:semiHidden="0" w:unhideWhenUsed="0"/>
-    <w:lsdException w:name="Light Shading Accent 5" w:uiPriority="60" w:semiHidden="0" w:unhideWhenUsed="0"/>
-    <w:lsdException w:name="Light List Accent 5" w:uiPriority="61" w:semiHidden="0" w:unhideWhenUsed="0"/>
-    <w:lsdException w:name="Light Grid Accent 5" w:uiPriority="62" w:semiHidden="0" w:unhideWhenUsed="0"/>
-    <w:lsdException w:name="Medium Shading 1 Accent 5" w:uiPriority="63" w:semiHidden="0" w:unhideWhenUsed="0"/>
-    <w:lsdException w:name="Medium Shading 2 Accent 5" w:uiPriority="64" w:semiHidden="0" w:unhideWhenUsed="0"/>
-    <w:lsdException w:name="Medium List 1 Accent 5" w:uiPriority="65" w:semiHidden="0" w:unhideWhenUsed="0"/>
-    <w:lsdException w:name="Medium List 2 Accent 5" w:uiPriority="66" w:semiHidden="0" w:unhideWhenUsed="0"/>
-    <w:lsdException w:name="Medium Grid 1 Accent 5" w:uiPriority="67" w:semiHidden="0" w:unhideWhenUsed="0"/>
-    <w:lsdException w:name="Medium Grid 2 Accent 5" w:uiPriority="68" w:semiHidden="0" w:unhideWhenUsed="0"/>
-    <w:lsdException w:name="Medium Grid 3 Accent 5" w:uiPriority="69" w:semiHidden="0" w:unhideWhenUsed="0"/>
-    <w:lsdException w:name="Dark List Accent 5" w:uiPriority="70" w:semiHidden="0" w:unhideWhenUsed="0"/>
-    <w:lsdException w:name="Colorful Shading Accent 5" w:uiPriority="71" w:semiHidden="0" w:unhideWhenUsed="0"/>
-    <w:lsdException w:name="Colorful List Accent 5" w:uiPriority="72" w:semiHidden="0" w:unhideWhenUsed="0"/>
-    <w:lsdException w:name="Colorful Grid Accent 5" w:uiPriority="73" w:semiHidden="0" w:unhideWhenUsed="0"/>
-    <w:lsdException w:name="Light Shading Accent 6" w:uiPriority="60" w:semiHidden="0" w:unhideWhenUsed="0"/>
-    <w:lsdException w:name="Light List Accent 6" w:uiPriority="61" w:semiHidden="0" w:unhideWhenUsed="0"/>
-    <w:lsdException w:name="Light Grid Accent 6" w:uiPriority="62" w:semiHidden="0" w:unhideWhenUsed="0"/>
-    <w:lsdException w:name="Medium Shading 1 Accent 6" w:uiPriority="63" w:semiHidden="0" w:unhideWhenUsed="0"/>
-    <w:lsdException w:name="Medium Shading 2 Accent 6" w:uiPriority="64" w:semiHidden="0" w:unhideWhenUsed="0"/>
-    <w:lsdException w:name="Medium List 1 Accent 6" w:uiPriority="65" w:semiHidden="0" w:unhideWhenUsed="0"/>
-    <w:lsdException w:name="Medium List 2 Accent 6" w:uiPriority="66" w:semiHidden="0" w:unhideWhenUsed="0"/>
-    <w:lsdException w:name="Medium Grid 1 Accent 6" w:uiPriority="67" w:semiHidden="0" w:unhideWhenUsed="0"/>
-    <w:lsdException w:name="Medium Grid 2 Accent 6" w:uiPriority="68" w:semiHidden="0" w:unhideWhenUsed="0"/>
-    <w:lsdException w:name="Medium Grid 3 Accent 6" w:uiPriority="69" w:semiHidden="0" w:unhideWhenUsed="0"/>
-    <w:lsdException w:name="Dark List Accent 6" w:uiPriority="70" w:semiHidden="0" w:unhideWhenUsed="0"/>
-    <w:lsdException w:name="Colorful Shading Accent 6" w:uiPriority="71" w:semiHidden="0" w:unhideWhenUsed="0"/>
-    <w:lsdException w:name="Colorful List Accent 6" w:uiPriority="72" w:semiHidden="0" w:unhideWhenUsed="0"/>
-    <w:lsdException w:name="Colorful Grid Accent 6" w:uiPriority="73" w:semiHidden="0" w:unhideWhenUsed="0"/>
-    <w:lsdException w:name="Subtle Emphasis" w:uiPriority="19" w:semiHidden="0" w:unhideWhenUsed="0" w:qFormat="1"/>
-    <w:lsdException w:name="Intense Emphasis" w:uiPriority="21" w:semiHidden="0" w:unhideWhenUsed="0" w:qFormat="1"/>
-    <w:lsdException w:name="Subtle Reference" w:uiPriority="31" w:semiHidden="0" w:unhideWhenUsed="0" w:qFormat="1"/>
-    <w:lsdException w:name="Intense Reference" w:uiPriority="32" w:semiHidden="0" w:unhideWhenUsed="0" w:qFormat="1"/>
-    <w:lsdException w:name="Book Title" w:uiPriority="33" w:semiHidden="0" w:unhideWhenUsed="0" w:qFormat="1"/>
+    <w:lsdException w:name="List Paragraph" w:semiHidden="0" w:uiPriority="34" w:unhideWhenUsed="0" w:qFormat="1"/>
+    <w:lsdException w:name="Quote" w:semiHidden="0" w:uiPriority="29" w:unhideWhenUsed="0" w:qFormat="1"/>
+    <w:lsdException w:name="Intense Quote" w:semiHidden="0" w:uiPriority="30" w:unhideWhenUsed="0" w:qFormat="1"/>
+    <w:lsdException w:name="Medium List 2 Accent 1" w:semiHidden="0" w:uiPriority="66" w:unhideWhenUsed="0"/>
+    <w:lsdException w:name="Medium Grid 1 Accent 1" w:semiHidden="0" w:uiPriority="67" w:unhideWhenUsed="0"/>
+    <w:lsdException w:name="Medium Grid 2 Accent 1" w:semiHidden="0" w:uiPriority="68" w:unhideWhenUsed="0"/>
+    <w:lsdException w:name="Medium Grid 3 Accent 1" w:semiHidden="0" w:uiPriority="69" w:unhideWhenUsed="0"/>
+    <w:lsdException w:name="Dark List Accent 1" w:semiHidden="0" w:uiPriority="70" w:unhideWhenUsed="0"/>
+    <w:lsdException w:name="Colorful Shading Accent 1" w:semiHidden="0" w:uiPriority="71" w:unhideWhenUsed="0"/>
+    <w:lsdException w:name="Colorful List Accent 1" w:semiHidden="0" w:uiPriority="72" w:unhideWhenUsed="0"/>
+    <w:lsdException w:name="Colorful Grid Accent 1" w:semiHidden="0" w:uiPriority="73" w:unhideWhenUsed="0"/>
+    <w:lsdException w:name="Light Shading Accent 2" w:semiHidden="0" w:uiPriority="60" w:unhideWhenUsed="0"/>
+    <w:lsdException w:name="Light List Accent 2" w:semiHidden="0" w:uiPriority="61" w:unhideWhenUsed="0"/>
+    <w:lsdException w:name="Light Grid Accent 2" w:semiHidden="0" w:uiPriority="62" w:unhideWhenUsed="0"/>
+    <w:lsdException w:name="Medium Shading 1 Accent 2" w:semiHidden="0" w:uiPriority="63" w:unhideWhenUsed="0"/>
+    <w:lsdException w:name="Medium Shading 2 Accent 2" w:semiHidden="0" w:uiPriority="64" w:unhideWhenUsed="0"/>
+    <w:lsdException w:name="Medium List 1 Accent 2" w:semiHidden="0" w:uiPriority="65" w:unhideWhenUsed="0"/>
+    <w:lsdException w:name="Medium List 2 Accent 2" w:semiHidden="0" w:uiPriority="66" w:unhideWhenUsed="0"/>
+    <w:lsdException w:name="Medium Grid 1 Accent 2" w:semiHidden="0" w:uiPriority="67" w:unhideWhenUsed="0"/>
+    <w:lsdException w:name="Medium Grid 2 Accent 2" w:semiHidden="0" w:uiPriority="68" w:unhideWhenUsed="0"/>
+    <w:lsdException w:name="Medium Grid 3 Accent 2" w:semiHidden="0" w:uiPriority="69" w:unhideWhenUsed="0"/>
+    <w:lsdException w:name="Dark List Accent 2" w:semiHidden="0" w:uiPriority="70" w:unhideWhenUsed="0"/>
+    <w:lsdException w:name="Colorful Shading Accent 2" w:semiHidden="0" w:uiPriority="71" w:unhideWhenUsed="0"/>
+    <w:lsdException w:name="Colorful List Accent 2" w:semiHidden="0" w:uiPriority="72" w:unhideWhenUsed="0"/>
+    <w:lsdException w:name="Colorful Grid Accent 2" w:semiHidden="0" w:uiPriority="73" w:unhideWhenUsed="0"/>
+    <w:lsdException w:name="Light Shading Accent 3" w:semiHidden="0" w:uiPriority="60" w:unhideWhenUsed="0"/>
+    <w:lsdException w:name="Light List Accent 3" w:semiHidden="0" w:uiPriority="61" w:unhideWhenUsed="0"/>
+    <w:lsdException w:name="Light Grid Accent 3" w:semiHidden="0" w:uiPriority="62" w:unhideWhenUsed="0"/>
+    <w:lsdException w:name="Medium Shading 1 Accent 3" w:semiHidden="0" w:uiPriority="63" w:unhideWhenUsed="0"/>
+    <w:lsdException w:name="Medium Shading 2 Accent 3" w:semiHidden="0" w:uiPriority="64" w:unhideWhenUsed="0"/>
+    <w:lsdException w:name="Medium List 1 Accent 3" w:semiHidden="0" w:uiPriority="65" w:unhideWhenUsed="0"/>
+    <w:lsdException w:name="Medium List 2 Accent 3" w:semiHidden="0" w:uiPriority="66" w:unhideWhenUsed="0"/>
+    <w:lsdException w:name="Medium Grid 1 Accent 3" w:semiHidden="0" w:uiPriority="67" w:unhideWhenUsed="0"/>
+    <w:lsdException w:name="Medium Grid 2 Accent 3" w:semiHidden="0" w:uiPriority="68" w:unhideWhenUsed="0"/>
+    <w:lsdException w:name="Medium Grid 3 Accent 3" w:semiHidden="0" w:uiPriority="69" w:unhideWhenUsed="0"/>
+    <w:lsdException w:name="Dark List Accent 3" w:semiHidden="0" w:uiPriority="70" w:unhideWhenUsed="0"/>
+    <w:lsdException w:name="Colorful Shading Accent 3" w:semiHidden="0" w:uiPriority="71" w:unhideWhenUsed="0"/>
+    <w:lsdException w:name="Colorful List Accent 3" w:semiHidden="0" w:uiPriority="72" w:unhideWhenUsed="0"/>
+    <w:lsdException w:name="Colorful Grid Accent 3" w:semiHidden="0" w:uiPriority="73" w:unhideWhenUsed="0"/>
+    <w:lsdException w:name="Light Shading Accent 4" w:semiHidden="0" w:uiPriority="60" w:unhideWhenUsed="0"/>
+    <w:lsdException w:name="Light List Accent 4" w:semiHidden="0" w:uiPriority="61" w:unhideWhenUsed="0"/>
+    <w:lsdException w:name="Light Grid Accent 4" w:semiHidden="0" w:uiPriority="62" w:unhideWhenUsed="0"/>
+    <w:lsdException w:name="Medium Shading 1 Accent 4" w:semiHidden="0" w:uiPriority="63" w:unhideWhenUsed="0"/>
+    <w:lsdException w:name="Medium Shading 2 Accent 4" w:semiHidden="0" w:uiPriority="64" w:unhideWhenUsed="0"/>
+    <w:lsdException w:name="Medium List 1 Accent 4" w:semiHidden="0" w:uiPriority="65" w:unhideWhenUsed="0"/>
+    <w:lsdException w:name="Medium List 2 Accent 4" w:semiHidden="0" w:uiPriority="66" w:unhideWhenUsed="0"/>
+    <w:lsdException w:name="Medium Grid 1 Accent 4" w:semiHidden="0" w:uiPriority="67" w:unhideWhenUsed="0"/>
+    <w:lsdException w:name="Medium Grid 2 Accent 4" w:semiHidden="0" w:uiPriority="68" w:unhideWhenUsed="0"/>
+    <w:lsdException w:name="Medium Grid 3 Accent 4" w:semiHidden="0" w:uiPriority="69" w:unhideWhenUsed="0"/>
+    <w:lsdException w:name="Dark List Accent 4" w:semiHidden="0" w:uiPriority="70" w:unhideWhenUsed="0"/>
+    <w:lsdException w:name="Colorful Shading Accent 4" w:semiHidden="0" w:uiPriority="71" w:unhideWhenUsed="0"/>
+    <w:lsdException w:name="Colorful List Accent 4" w:semiHidden="0" w:uiPriority="72" w:unhideWhenUsed="0"/>
+    <w:lsdException w:name="Colorful Grid Accent 4" w:semiHidden="0" w:uiPriority="73" w:unhideWhenUsed="0"/>
+    <w:lsdException w:name="Light Shading Accent 5" w:semiHidden="0" w:uiPriority="60" w:unhideWhenUsed="0"/>
+    <w:lsdException w:name="Light List Accent 5" w:semiHidden="0" w:uiPriority="61" w:unhideWhenUsed="0"/>
+    <w:lsdException w:name="Light Grid Accent 5" w:semiHidden="0" w:uiPriority="62" w:unhideWhenUsed="0"/>
+    <w:lsdException w:name="Medium Shading 1 Accent 5" w:semiHidden="0" w:uiPriority="63" w:unhideWhenUsed="0"/>
+    <w:lsdException w:name="Medium Shading 2 Accent 5" w:semiHidden="0" w:uiPriority="64" w:unhideWhenUsed="0"/>
+    <w:lsdException w:name="Medium List 1 Accent 5" w:semiHidden="0" w:uiPriority="65" w:unhideWhenUsed="0"/>
+    <w:lsdException w:name="Medium List 2 Accent 5" w:semiHidden="0" w:uiPriority="66" w:unhideWhenUsed="0"/>
+    <w:lsdException w:name="Medium Grid 1 Accent 5" w:semiHidden="0" w:uiPriority="67" w:unhideWhenUsed="0"/>
+    <w:lsdException w:name="Medium Grid 2 Accent 5" w:semiHidden="0" w:uiPriority="68" w:unhideWhenUsed="0"/>
+    <w:lsdException w:name="Medium Grid 3 Accent 5" w:semiHidden="0" w:uiPriority="69" w:unhideWhenUsed="0"/>
+    <w:lsdException w:name="Dark List Accent 5" w:semiHidden="0" w:uiPriority="70" w:unhideWhenUsed="0"/>
+    <w:lsdException w:name="Colorful Shading Accent 5" w:semiHidden="0" w:uiPriority="71" w:unhideWhenUsed="0"/>
+    <w:lsdException w:name="Colorful List Accent 5" w:semiHidden="0" w:uiPriority="72" w:unhideWhenUsed="0"/>
+    <w:lsdException w:name="Colorful Grid Accent 5" w:semiHidden="0" w:uiPriority="73" w:unhideWhenUsed="0"/>
+    <w:lsdException w:name="Light Shading Accent 6" w:semiHidden="0" w:uiPriority="60" w:unhideWhenUsed="0"/>
+    <w:lsdException w:name="Light List Accent 6" w:semiHidden="0" w:uiPriority="61" w:unhideWhenUsed="0"/>
+    <w:lsdException w:name="Light Grid Accent 6" w:semiHidden="0" w:uiPriority="62" w:unhideWhenUsed="0"/>
+    <w:lsdException w:name="Medium Shading 1 Accent 6" w:semiHidden="0" w:uiPriority="63" w:unhideWhenUsed="0"/>
+    <w:lsdException w:name="Medium Shading 2 Accent 6" w:semiHidden="0" w:uiPriority="64" w:unhideWhenUsed="0"/>
+    <w:lsdException w:name="Medium List 1 Accent 6" w:semiHidden="0" w:uiPriority="65" w:unhideWhenUsed="0"/>
+    <w:lsdException w:name="Medium List 2 Accent 6" w:semiHidden="0" w:uiPriority="66" w:unhideWhenUsed="0"/>
+    <w:lsdException w:name="Medium Grid 1 Accent 6" w:semiHidden="0" w:uiPriority="67" w:unhideWhenUsed="0"/>
+    <w:lsdException w:name="Medium Grid 2 Accent 6" w:semiHidden="0" w:uiPriority="68" w:unhideWhenUsed="0"/>
+    <w:lsdException w:name="Medium Grid 3 Accent 6" w:semiHidden="0" w:uiPriority="69" w:unhideWhenUsed="0"/>
+    <w:lsdException w:name="Dark List Accent 6" w:semiHidden="0" w:uiPriority="70" w:unhideWhenUsed="0"/>
+    <w:lsdException w:name="Colorful Shading Accent 6" w:semiHidden="0" w:uiPriority="71" w:unhideWhenUsed="0"/>
+    <w:lsdException w:name="Colorful List Accent 6" w:semiHidden="0" w:uiPriority="72" w:unhideWhenUsed="0"/>
+    <w:lsdException w:name="Colorful Grid Accent 6" w:semiHidden="0" w:uiPriority="73" w:unhideWhenUsed="0"/>
+    <w:lsdException w:name="Subtle Emphasis" w:semiHidden="0" w:uiPriority="19" w:unhideWhenUsed="0" w:qFormat="1"/>
+    <w:lsdException w:name="Intense Emphasis" w:semiHidden="0" w:uiPriority="21" w:unhideWhenUsed="0" w:qFormat="1"/>
+    <w:lsdException w:name="Subtle Reference" w:semiHidden="0" w:uiPriority="31" w:unhideWhenUsed="0" w:qFormat="1"/>
+    <w:lsdException w:name="Intense Reference" w:semiHidden="0" w:uiPriority="32" w:unhideWhenUsed="0" w:qFormat="1"/>
+    <w:lsdException w:name="Book Title" w:semiHidden="0" w:uiPriority="33" w:unhideWhenUsed="0" w:qFormat="1"/>
     <w:lsdException w:name="Bibliography" w:uiPriority="37"/>
     <w:lsdException w:name="TOC Heading" w:uiPriority="39" w:qFormat="1"/>
   </w:latentStyles>
-  <w:style w:type="paragraph" w:styleId="Normal" w:default="1">
+  <w:style w:type="paragraph" w:default="1" w:styleId="Normal">
     <w:name w:val="Normal"/>
     <w:qFormat/>
     <w:rsid w:val="00441023"/>
   </w:style>
-  <w:style w:type="character" w:styleId="DefaultParagraphFont" w:default="1">
+  <w:style w:type="character" w:default="1" w:styleId="DefaultParagraphFont">
     <w:name w:val="Default Paragraph Font"/>
     <w:uiPriority w:val="1"/>
     <w:semiHidden/>
     <w:unhideWhenUsed/>
   </w:style>
-  <w:style w:type="table" w:styleId="TableNormal" w:default="1">
+  <w:style w:type="table" w:default="1" w:styleId="TableNormal">
     <w:name w:val="Normal Table"/>
     <w:uiPriority w:val="99"/>
     <w:semiHidden/>
@@ -3705,7 +3465,7 @@
       </w:tblCellMar>
     </w:tblPr>
   </w:style>
-  <w:style w:type="numbering" w:styleId="NoList" w:default="1">
+  <w:style w:type="numbering" w:default="1" w:styleId="NoList">
     <w:name w:val="No List"/>
     <w:uiPriority w:val="99"/>
     <w:semiHidden/>
@@ -3728,7 +3488,7 @@
       <w:szCs w:val="16"/>
     </w:rPr>
   </w:style>
-  <w:style w:type="character" w:styleId="BalloonTextChar" w:customStyle="1">
+  <w:style w:type="character" w:customStyle="1" w:styleId="BalloonTextChar">
     <w:name w:val="Balloon Text Char"/>
     <w:basedOn w:val="DefaultParagraphFont"/>
     <w:link w:val="BalloonText"/>
@@ -3752,12 +3512,12 @@
     <w:tblPr>
       <w:tblInd w:w="0" w:type="dxa"/>
       <w:tblBorders>
-        <w:top w:val="single" w:color="000000" w:themeColor="text1" w:sz="4" w:space="0"/>
-        <w:left w:val="single" w:color="000000" w:themeColor="text1" w:sz="4" w:space="0"/>
-        <w:bottom w:val="single" w:color="000000" w:themeColor="text1" w:sz="4" w:space="0"/>
-        <w:right w:val="single" w:color="000000" w:themeColor="text1" w:sz="4" w:space="0"/>
-        <w:insideH w:val="single" w:color="000000" w:themeColor="text1" w:sz="4" w:space="0"/>
-        <w:insideV w:val="single" w:color="000000" w:themeColor="text1" w:sz="4" w:space="0"/>
+        <w:top w:val="single" w:sz="4" w:space="0" w:color="000000" w:themeColor="text1"/>
+        <w:left w:val="single" w:sz="4" w:space="0" w:color="000000" w:themeColor="text1"/>
+        <w:bottom w:val="single" w:sz="4" w:space="0" w:color="000000" w:themeColor="text1"/>
+        <w:right w:val="single" w:sz="4" w:space="0" w:color="000000" w:themeColor="text1"/>
+        <w:insideH w:val="single" w:sz="4" w:space="0" w:color="000000" w:themeColor="text1"/>
+        <w:insideV w:val="single" w:sz="4" w:space="0" w:color="000000" w:themeColor="text1"/>
       </w:tblBorders>
       <w:tblCellMar>
         <w:top w:w="0" w:type="dxa"/>

</xml_diff>